<commit_message>
feat: demo polish — loading spinners, toast notifications, MyAccount persistence (v0.5.3)
- Loading spinners: Animated CSS spinner on all pages during API fetches
- Empty states: Friendly messages when no data exists
- Toast notifications: Global success/error/info toasts (ToastProvider + useToast hook)
- MyAccount persistence: PUT /api/auth/me for profile edits + notification prefs
- MyAccount edit mode: Inline form with cancel/save
- notification_prefs column added to users table with migration
- Cache bumped to v=0.5.3
- Updated TASKS.md, ROADMAP.md, CLAUDE.md

Co-Authored-By: Claude Opus 4.6 <noreply@anthropic.com>
</commit_message>
<xml_diff>
--- a/InPlace_App_Roadmap.docx
+++ b/InPlace_App_Roadmap.docx
@@ -93,12 +93,10 @@
       </w:pPr>
       <w:r>
         <w:rPr>
-          <w:rFonts w:ascii="DM Sans" w:cs="DM Sans" w:eastAsia="DM Sans" w:hAnsi="DM Sans"/>
-          <w:color w:val="999999"/>
+          <w:color w:val="888888"/>
           <w:sz w:val="22"/>
-          <w:szCs w:val="22"/>
         </w:rPr>
-        <w:t xml:space="preserve">February 2026</w:t>
+        <w:t>Updated February 17, 2026</w:t>
       </w:r>
     </w:p>
     <w:p>
@@ -136,12 +134,9 @@
       </w:pPr>
       <w:r>
         <w:rPr>
-          <w:rFonts w:ascii="DM Sans" w:cs="DM Sans" w:eastAsia="DM Sans" w:hAnsi="DM Sans"/>
-          <w:color w:val="333333"/>
           <w:sz w:val="22"/>
-          <w:szCs w:val="22"/>
         </w:rPr>
-        <w:t xml:space="preserve">The inPlace prototype is a working React + Node.js application deployed at yourinplace.com with three role-based views (family, caregiver, care recipient). Current features include:</w:t>
+        <w:t>The inPlace prototype is a working React + Node.js application deployed at yourinplace.com with three role-based views (family, caregiver, care recipient), persistent PostgreSQL database on Railway, working user registration, password reset via email, and a mobile-responsive bottom navigation bar. Key capabilities include:</w:t>
       </w:r>
     </w:p>
     <w:p>
@@ -155,12 +150,9 @@
       </w:pPr>
       <w:r>
         <w:rPr>
-          <w:rFonts w:ascii="DM Sans" w:cs="DM Sans" w:eastAsia="DM Sans" w:hAnsi="DM Sans"/>
-          <w:color w:val="333333"/>
-          <w:sz w:val="21"/>
-          <w:szCs w:val="21"/>
+          <w:sz w:val="22"/>
         </w:rPr>
-        <w:t xml:space="preserve">Role-based login with demo accounts</w:t>
+        <w:t>Role-based login with demo accounts and working registration (family + caregiver tracks)</w:t>
       </w:r>
     </w:p>
     <w:p>
@@ -174,12 +166,9 @@
       </w:pPr>
       <w:r>
         <w:rPr>
-          <w:rFonts w:ascii="DM Sans" w:cs="DM Sans" w:eastAsia="DM Sans" w:hAnsi="DM Sans"/>
-          <w:color w:val="333333"/>
-          <w:sz w:val="21"/>
-          <w:szCs w:val="21"/>
+          <w:sz w:val="22"/>
         </w:rPr>
-        <w:t xml:space="preserve">Family dashboard with care scheduling and calendar heat map</w:t>
+        <w:t>Family dashboard with care scheduling, calendar heat map, and caregiver matching</w:t>
       </w:r>
     </w:p>
     <w:p>
@@ -193,12 +182,9 @@
       </w:pPr>
       <w:r>
         <w:rPr>
-          <w:rFonts w:ascii="DM Sans" w:cs="DM Sans" w:eastAsia="DM Sans" w:hAnsi="DM Sans"/>
-          <w:color w:val="333333"/>
-          <w:sz w:val="21"/>
-          <w:szCs w:val="21"/>
+          <w:sz w:val="22"/>
         </w:rPr>
-        <w:t xml:space="preserve">Caregiver matching, assignment, and favorites</w:t>
+        <w:t>In-app messaging between all users (database-backed conversations)</w:t>
       </w:r>
     </w:p>
     <w:p>
@@ -212,12 +198,9 @@
       </w:pPr>
       <w:r>
         <w:rPr>
-          <w:rFonts w:ascii="DM Sans" w:cs="DM Sans" w:eastAsia="DM Sans" w:hAnsi="DM Sans"/>
-          <w:color w:val="333333"/>
-          <w:sz w:val="21"/>
-          <w:szCs w:val="21"/>
+          <w:sz w:val="22"/>
         </w:rPr>
-        <w:t xml:space="preserve">In-app messaging between all users</w:t>
+        <w:t>Care recipient view with calendar and personal notes</w:t>
       </w:r>
     </w:p>
     <w:p>
@@ -231,12 +214,9 @@
       </w:pPr>
       <w:r>
         <w:rPr>
-          <w:rFonts w:ascii="DM Sans" w:cs="DM Sans" w:eastAsia="DM Sans" w:hAnsi="DM Sans"/>
-          <w:color w:val="333333"/>
-          <w:sz w:val="21"/>
-          <w:szCs w:val="21"/>
+          <w:sz w:val="22"/>
         </w:rPr>
-        <w:t xml:space="preserve">Care recipient view with calendar and personal notes</w:t>
+        <w:t>Password reset flow (forgot password → email via Resend → reset page)</w:t>
       </w:r>
     </w:p>
     <w:p>
@@ -250,12 +230,9 @@
       </w:pPr>
       <w:r>
         <w:rPr>
-          <w:rFonts w:ascii="DM Sans" w:cs="DM Sans" w:eastAsia="DM Sans" w:hAnsi="DM Sans"/>
-          <w:color w:val="333333"/>
-          <w:sz w:val="21"/>
-          <w:szCs w:val="21"/>
+          <w:sz w:val="22"/>
         </w:rPr>
-        <w:t xml:space="preserve">Waitlist / email capture with automatic email notifications</w:t>
+        <w:t>Mobile bottom navigation bar on phones (replaces sidebar hamburger menu)</w:t>
       </w:r>
     </w:p>
     <w:p>
@@ -269,12 +246,9 @@
       </w:pPr>
       <w:r>
         <w:rPr>
-          <w:rFonts w:ascii="DM Sans" w:cs="DM Sans" w:eastAsia="DM Sans" w:hAnsi="DM Sans"/>
-          <w:color w:val="333333"/>
-          <w:sz w:val="21"/>
-          <w:szCs w:val="21"/>
+          <w:sz w:val="22"/>
         </w:rPr>
-        <w:t xml:space="preserve">Caregiver recruitment landing section with earnings stats</w:t>
+        <w:t>Waitlist / email capture with automatic notifications via Resend</w:t>
       </w:r>
     </w:p>
     <w:p>
@@ -288,12 +262,9 @@
       </w:pPr>
       <w:r>
         <w:rPr>
-          <w:rFonts w:ascii="DM Sans" w:cs="DM Sans" w:eastAsia="DM Sans" w:hAnsi="DM Sans"/>
-          <w:color w:val="333333"/>
-          <w:sz w:val="21"/>
-          <w:szCs w:val="21"/>
+          <w:sz w:val="22"/>
         </w:rPr>
-        <w:t xml:space="preserve">Mobile-responsive sidebar with hamburger menu</w:t>
+        <w:t>PostgreSQL database on Railway with persistent data across deploys</w:t>
       </w:r>
     </w:p>
     <w:p>
@@ -307,31 +278,9 @@
       </w:pPr>
       <w:r>
         <w:rPr>
-          <w:rFonts w:ascii="DM Sans" w:cs="DM Sans" w:eastAsia="DM Sans" w:hAnsi="DM Sans"/>
-          <w:color w:val="333333"/>
-          <w:sz w:val="21"/>
-          <w:szCs w:val="21"/>
+          <w:sz w:val="22"/>
         </w:rPr>
-        <w:t xml:space="preserve">Multi-step registration wizard with form validation</w:t>
-      </w:r>
-    </w:p>
-    <w:p>
-      <w:pPr>
-        <w:pStyle w:val="ListParagraph"/>
-        <w:numPr>
-          <w:ilvl w:val="0"/>
-          <w:numId w:val="2"/>
-        </w:numPr>
-        <w:spacing w:after="80"/>
-      </w:pPr>
-      <w:r>
-        <w:rPr>
-          <w:rFonts w:ascii="DM Sans" w:cs="DM Sans" w:eastAsia="DM Sans" w:hAnsi="DM Sans"/>
-          <w:color w:val="333333"/>
-          <w:sz w:val="21"/>
-          <w:szCs w:val="21"/>
-        </w:rPr>
-        <w:t xml:space="preserve">Branded identity (iP monogram, DM Sans, inPlace wordmark)</w:t>
+        <w:t>Branded identity (iP monogram, DM Sans, inPlace wordmark) at yourinplace.com</w:t>
       </w:r>
     </w:p>
     <w:p>
@@ -369,23 +318,9 @@
       </w:pPr>
       <w:r>
         <w:rPr>
-          <w:rFonts w:ascii="DM Sans" w:cs="DM Sans" w:eastAsia="DM Sans" w:hAnsi="DM Sans"/>
-          <w:b/>
-          <w:bCs/>
-          <w:color w:val="1B6B5A"/>
-          <w:sz w:val="21"/>
-          <w:szCs w:val="21"/>
+          <w:sz w:val="22"/>
         </w:rPr>
-        <w:t xml:space="preserve">Mobile-responsive sidebar: </w:t>
-      </w:r>
-      <w:r>
-        <w:rPr>
-          <w:rFonts w:ascii="DM Sans" w:cs="DM Sans" w:eastAsia="DM Sans" w:hAnsi="DM Sans"/>
-          <w:color w:val="333333"/>
-          <w:sz w:val="21"/>
-          <w:szCs w:val="21"/>
-        </w:rPr>
-        <w:t xml:space="preserve">Collapsible hamburger menu on small screens. Sidebar slides in as overlay with backdrop. (v0.4.2)</w:t>
+        <w:t>Mobile bottom navigation: Fixed bottom nav bar replaces hamburger sidebar on mobile (≤768px). Role-aware icons per user role. Safe-area padding for notched phones. (v0.5.2)</w:t>
       </w:r>
     </w:p>
     <w:p>
@@ -399,23 +334,9 @@
       </w:pPr>
       <w:r>
         <w:rPr>
-          <w:rFonts w:ascii="DM Sans" w:cs="DM Sans" w:eastAsia="DM Sans" w:hAnsi="DM Sans"/>
-          <w:b/>
-          <w:bCs/>
-          <w:color w:val="1B6B5A"/>
-          <w:sz w:val="21"/>
-          <w:szCs w:val="21"/>
+          <w:sz w:val="22"/>
         </w:rPr>
-        <w:t xml:space="preserve">Waitlist email notifications: </w:t>
-      </w:r>
-      <w:r>
-        <w:rPr>
-          <w:rFonts w:ascii="DM Sans" w:cs="DM Sans" w:eastAsia="DM Sans" w:hAnsi="DM Sans"/>
-          <w:color w:val="333333"/>
-          <w:sz w:val="21"/>
-          <w:szCs w:val="21"/>
-        </w:rPr>
-        <w:t xml:space="preserve">Automatic email to peterjslee@gmail.com on every waitlist signup via Resend HTTP API. Bypasses Railway’s SMTP port restrictions. (v0.4.2)</w:t>
+        <w:t>Password reset flow: ForgotPasswordPage → email via Resend → ResetPasswordPage. New password_reset_tokens table with 1-hour expiry. "Forgot password?" link on login page. (v0.5.1)</w:t>
       </w:r>
     </w:p>
     <w:p>
@@ -429,23 +350,9 @@
       </w:pPr>
       <w:r>
         <w:rPr>
-          <w:rFonts w:ascii="DM Sans" w:cs="DM Sans" w:eastAsia="DM Sans" w:hAnsi="DM Sans"/>
-          <w:b/>
-          <w:bCs/>
-          <w:color w:val="1B6B5A"/>
-          <w:sz w:val="21"/>
-          <w:szCs w:val="21"/>
+          <w:sz w:val="22"/>
         </w:rPr>
-        <w:t xml:space="preserve">Dynamic My Account page: </w:t>
-      </w:r>
-      <w:r>
-        <w:rPr>
-          <w:rFonts w:ascii="DM Sans" w:cs="DM Sans" w:eastAsia="DM Sans" w:hAnsi="DM Sans"/>
-          <w:color w:val="333333"/>
-          <w:sz w:val="21"/>
-          <w:szCs w:val="21"/>
-        </w:rPr>
-        <w:t xml:space="preserve">Each user now sees their own name, email, phone, and role instead of hardcoded data. (v0.4.3)</w:t>
+        <w:t>Registration wired to API: Multi-step registration wizard now calls POST /api/auth/register. Auto-login on success, inline error display on failure. Both family and caregiver tracks. (v0.5.1)</w:t>
       </w:r>
     </w:p>
     <w:p>
@@ -459,23 +366,9 @@
       </w:pPr>
       <w:r>
         <w:rPr>
-          <w:rFonts w:ascii="DM Sans" w:cs="DM Sans" w:eastAsia="DM Sans" w:hAnsi="DM Sans"/>
-          <w:b/>
-          <w:bCs/>
-          <w:color w:val="1B6B5A"/>
-          <w:sz w:val="21"/>
-          <w:szCs w:val="21"/>
+          <w:sz w:val="22"/>
         </w:rPr>
-        <w:t xml:space="preserve">Registration form validation: </w:t>
-      </w:r>
-      <w:r>
-        <w:rPr>
-          <w:rFonts w:ascii="DM Sans" w:cs="DM Sans" w:eastAsia="DM Sans" w:hAnsi="DM Sans"/>
-          <w:color w:val="333333"/>
-          <w:sz w:val="21"/>
-          <w:szCs w:val="21"/>
-        </w:rPr>
-        <w:t xml:space="preserve">Next button disabled until fields are valid (email format, 10-digit phone, 6+ char password). Inline error hints. Back arrow returns to splash. (v0.4.4)</w:t>
+        <w:t>PostgreSQL migration: Replaced SQLite with PostgreSQL on Railway. Custom query wrapper auto-converts placeholders. All routes updated with async/await. Data persists across deploys. (v0.5.0)</w:t>
       </w:r>
     </w:p>
     <w:p>
@@ -489,23 +382,9 @@
       </w:pPr>
       <w:r>
         <w:rPr>
-          <w:rFonts w:ascii="DM Sans" w:cs="DM Sans" w:eastAsia="DM Sans" w:hAnsi="DM Sans"/>
-          <w:b/>
-          <w:bCs/>
-          <w:color w:val="1B6B5A"/>
-          <w:sz w:val="21"/>
-          <w:szCs w:val="21"/>
+          <w:sz w:val="22"/>
         </w:rPr>
-        <w:t xml:space="preserve">Caregiver recruitment landing section: </w:t>
-      </w:r>
-      <w:r>
-        <w:rPr>
-          <w:rFonts w:ascii="DM Sans" w:cs="DM Sans" w:eastAsia="DM Sans" w:hAnsi="DM Sans"/>
-          <w:color w:val="333333"/>
-          <w:sz w:val="21"/>
-          <w:szCs w:val="21"/>
-        </w:rPr>
-        <w:t xml:space="preserve">Full “For Caregivers” section on splash page with earnings stats, benefits, how-it-works steps, and CTA. (v0.4.2)</w:t>
+        <w:t>Waitlist email notifications: Automatic email on every waitlist signup via Resend HTTP API. (v0.4.3)</w:t>
       </w:r>
     </w:p>
     <w:p>
@@ -519,23 +398,9 @@
       </w:pPr>
       <w:r>
         <w:rPr>
-          <w:rFonts w:ascii="DM Sans" w:cs="DM Sans" w:eastAsia="DM Sans" w:hAnsi="DM Sans"/>
-          <w:b/>
-          <w:bCs/>
-          <w:color w:val="1B6B5A"/>
-          <w:sz w:val="21"/>
-          <w:szCs w:val="21"/>
+          <w:sz w:val="22"/>
         </w:rPr>
-        <w:t xml:space="preserve">SPF / email DNS fix: </w:t>
-      </w:r>
-      <w:r>
-        <w:rPr>
-          <w:rFonts w:ascii="DM Sans" w:cs="DM Sans" w:eastAsia="DM Sans" w:hAnsi="DM Sans"/>
-          <w:color w:val="333333"/>
-          <w:sz w:val="21"/>
-          <w:szCs w:val="21"/>
-        </w:rPr>
-        <w:t xml:space="preserve">Added Proofpoint SPF include for yourinplace.com email deliverability via Cloudflare DNS.</w:t>
+        <w:t>Dynamic My Account page: Each user now sees their own name, email, phone, and role instead of hardcoded data. (v0.4.3)</w:t>
       </w:r>
     </w:p>
     <w:p>
@@ -605,14 +470,10 @@
             </w:pPr>
             <w:r>
               <w:rPr>
-                <w:rFonts w:ascii="DM Sans" w:cs="DM Sans" w:eastAsia="DM Sans" w:hAnsi="DM Sans"/>
                 <w:b/>
-                <w:bCs/>
-                <w:color w:val="FFFFFF"/>
-                <w:sz w:val="20"/>
-                <w:szCs w:val="20"/>
-              </w:rPr>
-              <w:t xml:space="preserve">Phase</w:t>
+                <w:sz w:val="18"/>
+              </w:rPr>
+              <w:t>Phase</w:t>
             </w:r>
           </w:p>
         </w:tc>
@@ -640,14 +501,10 @@
             </w:pPr>
             <w:r>
               <w:rPr>
-                <w:rFonts w:ascii="DM Sans" w:cs="DM Sans" w:eastAsia="DM Sans" w:hAnsi="DM Sans"/>
                 <w:b/>
-                <w:bCs/>
-                <w:color w:val="FFFFFF"/>
-                <w:sz w:val="20"/>
-                <w:szCs w:val="20"/>
-              </w:rPr>
-              <w:t xml:space="preserve">Tasks</w:t>
+                <w:sz w:val="18"/>
+              </w:rPr>
+              <w:t>Tasks</w:t>
             </w:r>
           </w:p>
         </w:tc>
@@ -675,14 +532,10 @@
             </w:pPr>
             <w:r>
               <w:rPr>
-                <w:rFonts w:ascii="DM Sans" w:cs="DM Sans" w:eastAsia="DM Sans" w:hAnsi="DM Sans"/>
                 <w:b/>
-                <w:bCs/>
-                <w:color w:val="FFFFFF"/>
-                <w:sz w:val="20"/>
-                <w:szCs w:val="20"/>
-              </w:rPr>
-              <w:t xml:space="preserve">Status</w:t>
+                <w:sz w:val="18"/>
+              </w:rPr>
+              <w:t>Status</w:t>
             </w:r>
           </w:p>
         </w:tc>
@@ -710,14 +563,10 @@
             </w:pPr>
             <w:r>
               <w:rPr>
-                <w:rFonts w:ascii="DM Sans" w:cs="DM Sans" w:eastAsia="DM Sans" w:hAnsi="DM Sans"/>
                 <w:b/>
-                <w:bCs/>
-                <w:color w:val="FFFFFF"/>
-                <w:sz w:val="20"/>
-                <w:szCs w:val="20"/>
-              </w:rPr>
-              <w:t xml:space="preserve">Timeline</w:t>
+                <w:sz w:val="18"/>
+              </w:rPr>
+              <w:t>Timeline</w:t>
             </w:r>
           </w:p>
         </w:tc>
@@ -748,88 +597,67 @@
             </w:pPr>
             <w:r>
               <w:rPr>
-                <w:rFonts w:ascii="DM Sans" w:cs="DM Sans" w:eastAsia="DM Sans" w:hAnsi="DM Sans"/>
+                <w:sz w:val="18"/>
+              </w:rPr>
+              <w:t>Phase 1</w:t>
+              <w:br/>
+              <w:t>MVP Polish</w:t>
+            </w:r>
+          </w:p>
+        </w:tc>
+        <w:tc>
+          <w:tcPr>
+            <w:tcW w:type="dxa" w:w="4360"/>
+            <w:tcBorders>
+              <w:top w:val="single" w:color="CCCCCC" w:sz="1"/>
+              <w:left w:val="single" w:color="CCCCCC" w:sz="1"/>
+              <w:bottom w:val="single" w:color="CCCCCC" w:sz="1"/>
+              <w:right w:val="single" w:color="CCCCCC" w:sz="1"/>
+            </w:tcBorders>
+            <w:tcMar>
+              <w:top w:type="dxa" w:w="60"/>
+              <w:left w:type="dxa" w:w="120"/>
+              <w:bottom w:type="dxa" w:w="60"/>
+              <w:right w:type="dxa" w:w="120"/>
+            </w:tcMar>
+          </w:tcPr>
+          <w:p>
+            <w:r>
+              <w:rPr>
+                <w:sz w:val="18"/>
+              </w:rPr>
+              <w:t>Mobile-responsive sidebar &amp; hamburger menu</w:t>
+            </w:r>
+          </w:p>
+        </w:tc>
+        <w:tc>
+          <w:tcPr>
+            <w:tcW w:type="dxa" w:w="1500"/>
+            <w:tcBorders>
+              <w:top w:val="single" w:color="CCCCCC" w:sz="1"/>
+              <w:left w:val="single" w:color="CCCCCC" w:sz="1"/>
+              <w:bottom w:val="single" w:color="CCCCCC" w:sz="1"/>
+              <w:right w:val="single" w:color="CCCCCC" w:sz="1"/>
+            </w:tcBorders>
+            <w:tcMar>
+              <w:top w:type="dxa" w:w="60"/>
+              <w:left w:type="dxa" w:w="120"/>
+              <w:bottom w:type="dxa" w:w="60"/>
+              <w:right w:type="dxa" w:w="120"/>
+            </w:tcMar>
+            <w:vAlign w:val="center"/>
+          </w:tcPr>
+          <w:p>
+            <w:pPr>
+              <w:jc w:val="center"/>
+            </w:pPr>
+            <w:r>
+              <w:rPr>
                 <w:b/>
-                <w:bCs/>
-                <w:color w:val="0F4238"/>
-                <w:sz w:val="20"/>
-                <w:szCs w:val="20"/>
-              </w:rPr>
-              <w:t xml:space="preserve">Phase 1</w:t>
-            </w:r>
-            <w:r>
-              <w:rPr>
-                <w:rFonts w:ascii="DM Sans" w:cs="DM Sans" w:eastAsia="DM Sans" w:hAnsi="DM Sans"/>
-                <w:b/>
-                <w:bCs/>
-                <w:color w:val="0F4238"/>
-                <w:sz w:val="20"/>
-                <w:szCs w:val="20"/>
-              </w:rPr>
-              <w:br/>
-              <w:t xml:space="preserve">MVP Polish</w:t>
-            </w:r>
-          </w:p>
-        </w:tc>
-        <w:tc>
-          <w:tcPr>
-            <w:tcW w:type="dxa" w:w="4360"/>
-            <w:tcBorders>
-              <w:top w:val="single" w:color="CCCCCC" w:sz="1"/>
-              <w:left w:val="single" w:color="CCCCCC" w:sz="1"/>
-              <w:bottom w:val="single" w:color="CCCCCC" w:sz="1"/>
-              <w:right w:val="single" w:color="CCCCCC" w:sz="1"/>
-            </w:tcBorders>
-            <w:tcMar>
-              <w:top w:type="dxa" w:w="60"/>
-              <w:left w:type="dxa" w:w="120"/>
-              <w:bottom w:type="dxa" w:w="60"/>
-              <w:right w:type="dxa" w:w="120"/>
-            </w:tcMar>
-          </w:tcPr>
-          <w:p>
-            <w:r>
-              <w:rPr>
-                <w:rFonts w:ascii="DM Sans" w:cs="DM Sans" w:eastAsia="DM Sans" w:hAnsi="DM Sans"/>
-                <w:color w:val="333333"/>
-                <w:sz w:val="19"/>
-                <w:szCs w:val="19"/>
-              </w:rPr>
-              <w:t xml:space="preserve">Mobile-responsive sidebar &amp; hamburger menu</w:t>
-            </w:r>
-          </w:p>
-        </w:tc>
-        <w:tc>
-          <w:tcPr>
-            <w:tcW w:type="dxa" w:w="1500"/>
-            <w:tcBorders>
-              <w:top w:val="single" w:color="CCCCCC" w:sz="1"/>
-              <w:left w:val="single" w:color="CCCCCC" w:sz="1"/>
-              <w:bottom w:val="single" w:color="CCCCCC" w:sz="1"/>
-              <w:right w:val="single" w:color="CCCCCC" w:sz="1"/>
-            </w:tcBorders>
-            <w:tcMar>
-              <w:top w:type="dxa" w:w="60"/>
-              <w:left w:type="dxa" w:w="120"/>
-              <w:bottom w:type="dxa" w:w="60"/>
-              <w:right w:type="dxa" w:w="120"/>
-            </w:tcMar>
-            <w:vAlign w:val="center"/>
-          </w:tcPr>
-          <w:p>
-            <w:pPr>
-              <w:jc w:val="center"/>
-            </w:pPr>
-            <w:r>
-              <w:rPr>
-                <w:rFonts w:ascii="DM Sans" w:cs="DM Sans" w:eastAsia="DM Sans" w:hAnsi="DM Sans"/>
-                <w:b/>
-                <w:bCs/>
                 <w:color w:val="1B6B5A"/>
                 <w:sz w:val="18"/>
-                <w:szCs w:val="18"/>
-              </w:rPr>
-              <w:t xml:space="preserve">Done</w:t>
+              </w:rPr>
+              <w:t>Done</w:t>
             </w:r>
           </w:p>
         </w:tc>
@@ -856,12 +684,9 @@
             </w:pPr>
             <w:r>
               <w:rPr>
-                <w:rFonts w:ascii="DM Sans" w:cs="DM Sans" w:eastAsia="DM Sans" w:hAnsi="DM Sans"/>
-                <w:color w:val="666666"/>
-                <w:sz w:val="19"/>
-                <w:szCs w:val="19"/>
-              </w:rPr>
-              <w:t xml:space="preserve">Done</w:t>
+                <w:sz w:val="18"/>
+              </w:rPr>
+              <w:t>Done</w:t>
             </w:r>
           </w:p>
         </w:tc>
@@ -899,12 +724,9 @@
           <w:p>
             <w:r>
               <w:rPr>
-                <w:rFonts w:ascii="DM Sans" w:cs="DM Sans" w:eastAsia="DM Sans" w:hAnsi="DM Sans"/>
-                <w:color w:val="333333"/>
-                <w:sz w:val="19"/>
-                <w:szCs w:val="19"/>
-              </w:rPr>
-              <w:t xml:space="preserve">Waitlist email notifications (Resend API)</w:t>
+                <w:sz w:val="18"/>
+              </w:rPr>
+              <w:t>Waitlist email notifications (Resend API)</w:t>
             </w:r>
           </w:p>
         </w:tc>
@@ -932,14 +754,11 @@
             </w:pPr>
             <w:r>
               <w:rPr>
-                <w:rFonts w:ascii="DM Sans" w:cs="DM Sans" w:eastAsia="DM Sans" w:hAnsi="DM Sans"/>
                 <w:b/>
-                <w:bCs/>
                 <w:color w:val="1B6B5A"/>
                 <w:sz w:val="18"/>
-                <w:szCs w:val="18"/>
-              </w:rPr>
-              <w:t xml:space="preserve">Done</w:t>
+              </w:rPr>
+              <w:t>Done</w:t>
             </w:r>
           </w:p>
         </w:tc>
@@ -967,12 +786,9 @@
             </w:pPr>
             <w:r>
               <w:rPr>
-                <w:rFonts w:ascii="DM Sans" w:cs="DM Sans" w:eastAsia="DM Sans" w:hAnsi="DM Sans"/>
-                <w:color w:val="666666"/>
-                <w:sz w:val="19"/>
-                <w:szCs w:val="19"/>
-              </w:rPr>
-              <w:t xml:space="preserve">Done</w:t>
+                <w:sz w:val="18"/>
+              </w:rPr>
+              <w:t>Done</w:t>
             </w:r>
           </w:p>
         </w:tc>
@@ -1009,12 +825,9 @@
           <w:p>
             <w:r>
               <w:rPr>
-                <w:rFonts w:ascii="DM Sans" w:cs="DM Sans" w:eastAsia="DM Sans" w:hAnsi="DM Sans"/>
-                <w:color w:val="333333"/>
-                <w:sz w:val="19"/>
-                <w:szCs w:val="19"/>
-              </w:rPr>
-              <w:t xml:space="preserve">Dynamic My Account page (per-user data)</w:t>
+                <w:sz w:val="18"/>
+              </w:rPr>
+              <w:t>Dynamic My Account page (per-user data)</w:t>
             </w:r>
           </w:p>
         </w:tc>
@@ -1041,14 +854,11 @@
             </w:pPr>
             <w:r>
               <w:rPr>
-                <w:rFonts w:ascii="DM Sans" w:cs="DM Sans" w:eastAsia="DM Sans" w:hAnsi="DM Sans"/>
                 <w:b/>
-                <w:bCs/>
                 <w:color w:val="1B6B5A"/>
                 <w:sz w:val="18"/>
-                <w:szCs w:val="18"/>
-              </w:rPr>
-              <w:t xml:space="preserve">Done</w:t>
+              </w:rPr>
+              <w:t>Done</w:t>
             </w:r>
           </w:p>
         </w:tc>
@@ -1075,12 +885,9 @@
             </w:pPr>
             <w:r>
               <w:rPr>
-                <w:rFonts w:ascii="DM Sans" w:cs="DM Sans" w:eastAsia="DM Sans" w:hAnsi="DM Sans"/>
-                <w:color w:val="666666"/>
-                <w:sz w:val="19"/>
-                <w:szCs w:val="19"/>
-              </w:rPr>
-              <w:t xml:space="preserve">Done</w:t>
+                <w:sz w:val="18"/>
+              </w:rPr>
+              <w:t>Done</w:t>
             </w:r>
           </w:p>
         </w:tc>
@@ -1118,12 +925,9 @@
           <w:p>
             <w:r>
               <w:rPr>
-                <w:rFonts w:ascii="DM Sans" w:cs="DM Sans" w:eastAsia="DM Sans" w:hAnsi="DM Sans"/>
-                <w:color w:val="333333"/>
-                <w:sz w:val="19"/>
-                <w:szCs w:val="19"/>
-              </w:rPr>
-              <w:t xml:space="preserve">Registration form validation &amp; back navigation</w:t>
+                <w:sz w:val="18"/>
+              </w:rPr>
+              <w:t>Registration form validation &amp; back navigation</w:t>
             </w:r>
           </w:p>
         </w:tc>
@@ -1151,14 +955,11 @@
             </w:pPr>
             <w:r>
               <w:rPr>
-                <w:rFonts w:ascii="DM Sans" w:cs="DM Sans" w:eastAsia="DM Sans" w:hAnsi="DM Sans"/>
                 <w:b/>
-                <w:bCs/>
                 <w:color w:val="1B6B5A"/>
                 <w:sz w:val="18"/>
-                <w:szCs w:val="18"/>
-              </w:rPr>
-              <w:t xml:space="preserve">Done</w:t>
+              </w:rPr>
+              <w:t>Done</w:t>
             </w:r>
           </w:p>
         </w:tc>
@@ -1186,12 +987,9 @@
             </w:pPr>
             <w:r>
               <w:rPr>
-                <w:rFonts w:ascii="DM Sans" w:cs="DM Sans" w:eastAsia="DM Sans" w:hAnsi="DM Sans"/>
-                <w:color w:val="666666"/>
-                <w:sz w:val="19"/>
-                <w:szCs w:val="19"/>
-              </w:rPr>
-              <w:t xml:space="preserve">Done</w:t>
+                <w:sz w:val="18"/>
+              </w:rPr>
+              <w:t>Done</w:t>
             </w:r>
           </w:p>
         </w:tc>
@@ -1228,12 +1026,9 @@
           <w:p>
             <w:r>
               <w:rPr>
-                <w:rFonts w:ascii="DM Sans" w:cs="DM Sans" w:eastAsia="DM Sans" w:hAnsi="DM Sans"/>
-                <w:color w:val="333333"/>
-                <w:sz w:val="19"/>
-                <w:szCs w:val="19"/>
-              </w:rPr>
-              <w:t xml:space="preserve">Caregiver recruitment section on splash page</w:t>
+                <w:sz w:val="18"/>
+              </w:rPr>
+              <w:t>Caregiver recruitment section on splash page</w:t>
             </w:r>
           </w:p>
         </w:tc>
@@ -1260,14 +1055,11 @@
             </w:pPr>
             <w:r>
               <w:rPr>
-                <w:rFonts w:ascii="DM Sans" w:cs="DM Sans" w:eastAsia="DM Sans" w:hAnsi="DM Sans"/>
                 <w:b/>
-                <w:bCs/>
                 <w:color w:val="1B6B5A"/>
                 <w:sz w:val="18"/>
-                <w:szCs w:val="18"/>
-              </w:rPr>
-              <w:t xml:space="preserve">Done</w:t>
+              </w:rPr>
+              <w:t>Done</w:t>
             </w:r>
           </w:p>
         </w:tc>
@@ -1294,12 +1086,9 @@
             </w:pPr>
             <w:r>
               <w:rPr>
-                <w:rFonts w:ascii="DM Sans" w:cs="DM Sans" w:eastAsia="DM Sans" w:hAnsi="DM Sans"/>
-                <w:color w:val="666666"/>
-                <w:sz w:val="19"/>
-                <w:szCs w:val="19"/>
-              </w:rPr>
-              <w:t xml:space="preserve">Done</w:t>
+                <w:sz w:val="18"/>
+              </w:rPr>
+              <w:t>Done</w:t>
             </w:r>
           </w:p>
         </w:tc>
@@ -1337,12 +1126,9 @@
           <w:p>
             <w:r>
               <w:rPr>
-                <w:rFonts w:ascii="DM Sans" w:cs="DM Sans" w:eastAsia="DM Sans" w:hAnsi="DM Sans"/>
-                <w:color w:val="333333"/>
-                <w:sz w:val="19"/>
-                <w:szCs w:val="19"/>
-              </w:rPr>
-              <w:t xml:space="preserve">Password reset / forgot password flow</w:t>
+                <w:sz w:val="18"/>
+              </w:rPr>
+              <w:t>PostgreSQL migration: Replaced SQLite with persistent PostgreSQL on Railway. Data survives deploys.</w:t>
             </w:r>
           </w:p>
         </w:tc>
@@ -1370,14 +1156,11 @@
             </w:pPr>
             <w:r>
               <w:rPr>
-                <w:rFonts w:ascii="DM Sans" w:cs="DM Sans" w:eastAsia="DM Sans" w:hAnsi="DM Sans"/>
                 <w:b/>
-                <w:bCs/>
-                <w:color w:val="888888"/>
-                <w:sz w:val="18"/>
-                <w:szCs w:val="18"/>
-              </w:rPr>
-              <w:t xml:space="preserve">Not Started</w:t>
+                <w:color w:val="1B6B5A"/>
+                <w:sz w:val="18"/>
+              </w:rPr>
+              <w:t>Done</w:t>
             </w:r>
           </w:p>
         </w:tc>
@@ -1405,12 +1188,9 @@
             </w:pPr>
             <w:r>
               <w:rPr>
-                <w:rFonts w:ascii="DM Sans" w:cs="DM Sans" w:eastAsia="DM Sans" w:hAnsi="DM Sans"/>
-                <w:color w:val="666666"/>
-                <w:sz w:val="19"/>
-                <w:szCs w:val="19"/>
-              </w:rPr>
-              <w:t xml:space="preserve">Week 1</w:t>
+                <w:sz w:val="18"/>
+              </w:rPr>
+              <w:t>Done</w:t>
             </w:r>
           </w:p>
         </w:tc>
@@ -1447,12 +1227,9 @@
           <w:p>
             <w:r>
               <w:rPr>
-                <w:rFonts w:ascii="DM Sans" w:cs="DM Sans" w:eastAsia="DM Sans" w:hAnsi="DM Sans"/>
-                <w:color w:val="333333"/>
-                <w:sz w:val="19"/>
-                <w:szCs w:val="19"/>
-              </w:rPr>
-              <w:t xml:space="preserve">Real-time caregiver availability system</w:t>
+                <w:sz w:val="18"/>
+              </w:rPr>
+              <w:t>Wire registration to API: Multi-step wizard calls POST /api/auth/register, auto-login on success.</w:t>
             </w:r>
           </w:p>
         </w:tc>
@@ -1479,14 +1256,11 @@
             </w:pPr>
             <w:r>
               <w:rPr>
-                <w:rFonts w:ascii="DM Sans" w:cs="DM Sans" w:eastAsia="DM Sans" w:hAnsi="DM Sans"/>
                 <w:b/>
-                <w:bCs/>
-                <w:color w:val="888888"/>
-                <w:sz w:val="18"/>
-                <w:szCs w:val="18"/>
-              </w:rPr>
-              <w:t xml:space="preserve">Not Started</w:t>
+                <w:color w:val="1B6B5A"/>
+                <w:sz w:val="18"/>
+              </w:rPr>
+              <w:t>Done</w:t>
             </w:r>
           </w:p>
         </w:tc>
@@ -1513,12 +1287,9 @@
             </w:pPr>
             <w:r>
               <w:rPr>
-                <w:rFonts w:ascii="DM Sans" w:cs="DM Sans" w:eastAsia="DM Sans" w:hAnsi="DM Sans"/>
-                <w:color w:val="666666"/>
-                <w:sz w:val="19"/>
-                <w:szCs w:val="19"/>
-              </w:rPr>
-              <w:t xml:space="preserve">Week 1–3</w:t>
+                <w:sz w:val="18"/>
+              </w:rPr>
+              <w:t>Done</w:t>
             </w:r>
           </w:p>
         </w:tc>
@@ -1556,12 +1327,9 @@
           <w:p>
             <w:r>
               <w:rPr>
-                <w:rFonts w:ascii="DM Sans" w:cs="DM Sans" w:eastAsia="DM Sans" w:hAnsi="DM Sans"/>
-                <w:color w:val="333333"/>
-                <w:sz w:val="19"/>
-                <w:szCs w:val="19"/>
-              </w:rPr>
-              <w:t xml:space="preserve">Caregiver application / onboarding flow</w:t>
+                <w:sz w:val="18"/>
+              </w:rPr>
+              <w:t>Mobile bottom navigation: Fixed bottom nav replaces hamburger on mobile. Role-aware, safe-area padding.</w:t>
             </w:r>
           </w:p>
         </w:tc>
@@ -1589,14 +1357,11 @@
             </w:pPr>
             <w:r>
               <w:rPr>
-                <w:rFonts w:ascii="DM Sans" w:cs="DM Sans" w:eastAsia="DM Sans" w:hAnsi="DM Sans"/>
                 <w:b/>
-                <w:bCs/>
-                <w:color w:val="888888"/>
-                <w:sz w:val="18"/>
-                <w:szCs w:val="18"/>
-              </w:rPr>
-              <w:t xml:space="preserve">Not Started</w:t>
+                <w:color w:val="1B6B5A"/>
+                <w:sz w:val="18"/>
+              </w:rPr>
+              <w:t>Done</w:t>
             </w:r>
           </w:p>
         </w:tc>
@@ -1624,12 +1389,9 @@
             </w:pPr>
             <w:r>
               <w:rPr>
-                <w:rFonts w:ascii="DM Sans" w:cs="DM Sans" w:eastAsia="DM Sans" w:hAnsi="DM Sans"/>
-                <w:color w:val="666666"/>
-                <w:sz w:val="19"/>
-                <w:szCs w:val="19"/>
-              </w:rPr>
-              <w:t xml:space="preserve">Week 1–2</w:t>
+                <w:sz w:val="18"/>
+              </w:rPr>
+              <w:t>Done</w:t>
             </w:r>
           </w:p>
         </w:tc>
@@ -1666,12 +1428,9 @@
           <w:p>
             <w:r>
               <w:rPr>
-                <w:rFonts w:ascii="DM Sans" w:cs="DM Sans" w:eastAsia="DM Sans" w:hAnsi="DM Sans"/>
-                <w:color w:val="333333"/>
-                <w:sz w:val="19"/>
-                <w:szCs w:val="19"/>
-              </w:rPr>
-              <w:t xml:space="preserve">Background check API integration (Checkr)</w:t>
+                <w:sz w:val="18"/>
+              </w:rPr>
+              <w:t>Password reset / forgot password flow</w:t>
             </w:r>
           </w:p>
         </w:tc>
@@ -1698,14 +1457,11 @@
             </w:pPr>
             <w:r>
               <w:rPr>
-                <w:rFonts w:ascii="DM Sans" w:cs="DM Sans" w:eastAsia="DM Sans" w:hAnsi="DM Sans"/>
                 <w:b/>
-                <w:bCs/>
-                <w:color w:val="888888"/>
-                <w:sz w:val="18"/>
-                <w:szCs w:val="18"/>
-              </w:rPr>
-              <w:t xml:space="preserve">Not Started</w:t>
+                <w:color w:val="1B6B5A"/>
+                <w:sz w:val="18"/>
+              </w:rPr>
+              <w:t>Done</w:t>
             </w:r>
           </w:p>
         </w:tc>
@@ -1732,12 +1488,9 @@
             </w:pPr>
             <w:r>
               <w:rPr>
-                <w:rFonts w:ascii="DM Sans" w:cs="DM Sans" w:eastAsia="DM Sans" w:hAnsi="DM Sans"/>
-                <w:color w:val="666666"/>
-                <w:sz w:val="19"/>
-                <w:szCs w:val="19"/>
-              </w:rPr>
-              <w:t xml:space="preserve">Week 2–4</w:t>
+                <w:sz w:val="18"/>
+              </w:rPr>
+              <w:t>Done</w:t>
             </w:r>
           </w:p>
         </w:tc>
@@ -1775,12 +1528,9 @@
           <w:p>
             <w:r>
               <w:rPr>
-                <w:rFonts w:ascii="DM Sans" w:cs="DM Sans" w:eastAsia="DM Sans" w:hAnsi="DM Sans"/>
-                <w:color w:val="333333"/>
-                <w:sz w:val="19"/>
-                <w:szCs w:val="19"/>
-              </w:rPr>
-              <w:t xml:space="preserve">Payment processing (Stripe Connect)</w:t>
+                <w:sz w:val="18"/>
+              </w:rPr>
+              <w:t>Real-time caregiver availability system</w:t>
             </w:r>
           </w:p>
         </w:tc>
@@ -1808,14 +1558,9 @@
             </w:pPr>
             <w:r>
               <w:rPr>
-                <w:rFonts w:ascii="DM Sans" w:cs="DM Sans" w:eastAsia="DM Sans" w:hAnsi="DM Sans"/>
-                <w:b/>
-                <w:bCs/>
-                <w:color w:val="888888"/>
-                <w:sz w:val="18"/>
-                <w:szCs w:val="18"/>
-              </w:rPr>
-              <w:t xml:space="preserve">Not Started</w:t>
+                <w:sz w:val="18"/>
+              </w:rPr>
+              <w:t>Not Started</w:t>
             </w:r>
           </w:p>
         </w:tc>
@@ -1843,12 +1588,9 @@
             </w:pPr>
             <w:r>
               <w:rPr>
-                <w:rFonts w:ascii="DM Sans" w:cs="DM Sans" w:eastAsia="DM Sans" w:hAnsi="DM Sans"/>
-                <w:color w:val="666666"/>
-                <w:sz w:val="19"/>
-                <w:szCs w:val="19"/>
-              </w:rPr>
-              <w:t xml:space="preserve">Week 2–4</w:t>
+                <w:sz w:val="18"/>
+              </w:rPr>
+              <w:t>Week 1–3</w:t>
             </w:r>
           </w:p>
         </w:tc>
@@ -1885,12 +1627,9 @@
           <w:p>
             <w:r>
               <w:rPr>
-                <w:rFonts w:ascii="DM Sans" w:cs="DM Sans" w:eastAsia="DM Sans" w:hAnsi="DM Sans"/>
-                <w:color w:val="333333"/>
-                <w:sz w:val="19"/>
-                <w:szCs w:val="19"/>
-              </w:rPr>
-              <w:t xml:space="preserve">Visit logging with timestamps + notes</w:t>
+                <w:sz w:val="18"/>
+              </w:rPr>
+              <w:t>Caregiver application / onboarding flow</w:t>
             </w:r>
           </w:p>
         </w:tc>
@@ -1917,14 +1656,9 @@
             </w:pPr>
             <w:r>
               <w:rPr>
-                <w:rFonts w:ascii="DM Sans" w:cs="DM Sans" w:eastAsia="DM Sans" w:hAnsi="DM Sans"/>
-                <w:b/>
-                <w:bCs/>
-                <w:color w:val="888888"/>
-                <w:sz w:val="18"/>
-                <w:szCs w:val="18"/>
-              </w:rPr>
-              <w:t xml:space="preserve">Not Started</w:t>
+                <w:sz w:val="18"/>
+              </w:rPr>
+              <w:t>Not Started</w:t>
             </w:r>
           </w:p>
         </w:tc>
@@ -1951,12 +1685,9 @@
             </w:pPr>
             <w:r>
               <w:rPr>
-                <w:rFonts w:ascii="DM Sans" w:cs="DM Sans" w:eastAsia="DM Sans" w:hAnsi="DM Sans"/>
-                <w:color w:val="666666"/>
-                <w:sz w:val="19"/>
-                <w:szCs w:val="19"/>
-              </w:rPr>
-              <w:t xml:space="preserve">Week 3–4</w:t>
+                <w:sz w:val="18"/>
+              </w:rPr>
+              <w:t>Week 1–2</w:t>
             </w:r>
           </w:p>
         </w:tc>
@@ -1994,12 +1725,9 @@
           <w:p>
             <w:r>
               <w:rPr>
-                <w:rFonts w:ascii="DM Sans" w:cs="DM Sans" w:eastAsia="DM Sans" w:hAnsi="DM Sans"/>
-                <w:color w:val="333333"/>
-                <w:sz w:val="19"/>
-                <w:szCs w:val="19"/>
-              </w:rPr>
-              <w:t xml:space="preserve">Push notifications (email + in-app)</w:t>
+                <w:sz w:val="18"/>
+              </w:rPr>
+              <w:t>Background check API integration (Checkr)</w:t>
             </w:r>
           </w:p>
         </w:tc>
@@ -2027,14 +1755,9 @@
             </w:pPr>
             <w:r>
               <w:rPr>
-                <w:rFonts w:ascii="DM Sans" w:cs="DM Sans" w:eastAsia="DM Sans" w:hAnsi="DM Sans"/>
-                <w:b/>
-                <w:bCs/>
-                <w:color w:val="888888"/>
-                <w:sz w:val="18"/>
-                <w:szCs w:val="18"/>
-              </w:rPr>
-              <w:t xml:space="preserve">Not Started</w:t>
+                <w:sz w:val="18"/>
+              </w:rPr>
+              <w:t>Not Started</w:t>
             </w:r>
           </w:p>
         </w:tc>
@@ -2062,12 +1785,9 @@
             </w:pPr>
             <w:r>
               <w:rPr>
-                <w:rFonts w:ascii="DM Sans" w:cs="DM Sans" w:eastAsia="DM Sans" w:hAnsi="DM Sans"/>
-                <w:color w:val="666666"/>
-                <w:sz w:val="19"/>
-                <w:szCs w:val="19"/>
-              </w:rPr>
-              <w:t xml:space="preserve">Week 3–5</w:t>
+                <w:sz w:val="18"/>
+              </w:rPr>
+              <w:t>Week 2–4</w:t>
             </w:r>
           </w:p>
         </w:tc>
@@ -2098,26 +1818,11 @@
             </w:pPr>
             <w:r>
               <w:rPr>
-                <w:rFonts w:ascii="DM Sans" w:cs="DM Sans" w:eastAsia="DM Sans" w:hAnsi="DM Sans"/>
-                <w:b/>
-                <w:bCs/>
-                <w:color w:val="0F4238"/>
-                <w:sz w:val="20"/>
-                <w:szCs w:val="20"/>
-              </w:rPr>
-              <w:t xml:space="preserve">Phase 2</w:t>
-            </w:r>
-            <w:r>
-              <w:rPr>
-                <w:rFonts w:ascii="DM Sans" w:cs="DM Sans" w:eastAsia="DM Sans" w:hAnsi="DM Sans"/>
-                <w:b/>
-                <w:bCs/>
-                <w:color w:val="0F4238"/>
-                <w:sz w:val="20"/>
-                <w:szCs w:val="20"/>
-              </w:rPr>
+                <w:sz w:val="18"/>
+              </w:rPr>
+              <w:t>Phase 2</w:t>
               <w:br/>
-              <w:t xml:space="preserve">Core Features</w:t>
+              <w:t>Core Features</w:t>
             </w:r>
           </w:p>
         </w:tc>
@@ -2140,12 +1845,9 @@
           <w:p>
             <w:r>
               <w:rPr>
-                <w:rFonts w:ascii="DM Sans" w:cs="DM Sans" w:eastAsia="DM Sans" w:hAnsi="DM Sans"/>
-                <w:color w:val="333333"/>
-                <w:sz w:val="19"/>
-                <w:szCs w:val="19"/>
-              </w:rPr>
-              <w:t xml:space="preserve">Caregiver rating &amp; review system</w:t>
+                <w:sz w:val="18"/>
+              </w:rPr>
+              <w:t>Payment processing (Stripe Connect)</w:t>
             </w:r>
           </w:p>
         </w:tc>
@@ -2172,14 +1874,9 @@
             </w:pPr>
             <w:r>
               <w:rPr>
-                <w:rFonts w:ascii="DM Sans" w:cs="DM Sans" w:eastAsia="DM Sans" w:hAnsi="DM Sans"/>
-                <w:b/>
-                <w:bCs/>
-                <w:color w:val="888888"/>
-                <w:sz w:val="18"/>
-                <w:szCs w:val="18"/>
-              </w:rPr>
-              <w:t xml:space="preserve">Not Started</w:t>
+                <w:sz w:val="18"/>
+              </w:rPr>
+              <w:t>Not Started</w:t>
             </w:r>
           </w:p>
         </w:tc>
@@ -2206,12 +1903,9 @@
             </w:pPr>
             <w:r>
               <w:rPr>
-                <w:rFonts w:ascii="DM Sans" w:cs="DM Sans" w:eastAsia="DM Sans" w:hAnsi="DM Sans"/>
-                <w:color w:val="666666"/>
-                <w:sz w:val="19"/>
-                <w:szCs w:val="19"/>
-              </w:rPr>
-              <w:t xml:space="preserve">Week 4–6</w:t>
+                <w:sz w:val="18"/>
+              </w:rPr>
+              <w:t>Week 2–4</w:t>
             </w:r>
           </w:p>
         </w:tc>
@@ -2249,12 +1943,9 @@
           <w:p>
             <w:r>
               <w:rPr>
-                <w:rFonts w:ascii="DM Sans" w:cs="DM Sans" w:eastAsia="DM Sans" w:hAnsi="DM Sans"/>
-                <w:color w:val="333333"/>
-                <w:sz w:val="19"/>
-                <w:szCs w:val="19"/>
-              </w:rPr>
-              <w:t xml:space="preserve">Recurring care schedule management</w:t>
+                <w:sz w:val="18"/>
+              </w:rPr>
+              <w:t>Visit logging with timestamps + notes</w:t>
             </w:r>
           </w:p>
         </w:tc>
@@ -2282,14 +1973,9 @@
             </w:pPr>
             <w:r>
               <w:rPr>
-                <w:rFonts w:ascii="DM Sans" w:cs="DM Sans" w:eastAsia="DM Sans" w:hAnsi="DM Sans"/>
-                <w:b/>
-                <w:bCs/>
-                <w:color w:val="888888"/>
-                <w:sz w:val="18"/>
-                <w:szCs w:val="18"/>
-              </w:rPr>
-              <w:t xml:space="preserve">Not Started</w:t>
+                <w:sz w:val="18"/>
+              </w:rPr>
+              <w:t>Not Started</w:t>
             </w:r>
           </w:p>
         </w:tc>
@@ -2317,12 +2003,9 @@
             </w:pPr>
             <w:r>
               <w:rPr>
-                <w:rFonts w:ascii="DM Sans" w:cs="DM Sans" w:eastAsia="DM Sans" w:hAnsi="DM Sans"/>
-                <w:color w:val="666666"/>
-                <w:sz w:val="19"/>
-                <w:szCs w:val="19"/>
-              </w:rPr>
-              <w:t xml:space="preserve">Week 4–5</w:t>
+                <w:sz w:val="18"/>
+              </w:rPr>
+              <w:t>Week 3–4</w:t>
             </w:r>
           </w:p>
         </w:tc>
@@ -2359,12 +2042,9 @@
           <w:p>
             <w:r>
               <w:rPr>
-                <w:rFonts w:ascii="DM Sans" w:cs="DM Sans" w:eastAsia="DM Sans" w:hAnsi="DM Sans"/>
-                <w:color w:val="333333"/>
-                <w:sz w:val="19"/>
-                <w:szCs w:val="19"/>
-              </w:rPr>
-              <w:t xml:space="preserve">Family-to-caregiver direct booking</w:t>
+                <w:sz w:val="18"/>
+              </w:rPr>
+              <w:t>Push notifications (email + in-app)</w:t>
             </w:r>
           </w:p>
         </w:tc>
@@ -2391,14 +2071,9 @@
             </w:pPr>
             <w:r>
               <w:rPr>
-                <w:rFonts w:ascii="DM Sans" w:cs="DM Sans" w:eastAsia="DM Sans" w:hAnsi="DM Sans"/>
-                <w:b/>
-                <w:bCs/>
-                <w:color w:val="888888"/>
-                <w:sz w:val="18"/>
-                <w:szCs w:val="18"/>
-              </w:rPr>
-              <w:t xml:space="preserve">Not Started</w:t>
+                <w:sz w:val="18"/>
+              </w:rPr>
+              <w:t>Not Started</w:t>
             </w:r>
           </w:p>
         </w:tc>
@@ -2425,12 +2100,9 @@
             </w:pPr>
             <w:r>
               <w:rPr>
-                <w:rFonts w:ascii="DM Sans" w:cs="DM Sans" w:eastAsia="DM Sans" w:hAnsi="DM Sans"/>
-                <w:color w:val="666666"/>
-                <w:sz w:val="19"/>
-                <w:szCs w:val="19"/>
-              </w:rPr>
-              <w:t xml:space="preserve">Week 5–7</w:t>
+                <w:sz w:val="18"/>
+              </w:rPr>
+              <w:t>Week 3–5</w:t>
             </w:r>
           </w:p>
         </w:tc>
@@ -2468,12 +2140,9 @@
           <w:p>
             <w:r>
               <w:rPr>
-                <w:rFonts w:ascii="DM Sans" w:cs="DM Sans" w:eastAsia="DM Sans" w:hAnsi="DM Sans"/>
-                <w:color w:val="333333"/>
-                <w:sz w:val="19"/>
-                <w:szCs w:val="19"/>
-              </w:rPr>
-              <w:t xml:space="preserve">Earnings dashboard for caregivers</w:t>
+                <w:sz w:val="18"/>
+              </w:rPr>
+              <w:t>Caregiver rating &amp; review system</w:t>
             </w:r>
           </w:p>
         </w:tc>
@@ -2501,14 +2170,9 @@
             </w:pPr>
             <w:r>
               <w:rPr>
-                <w:rFonts w:ascii="DM Sans" w:cs="DM Sans" w:eastAsia="DM Sans" w:hAnsi="DM Sans"/>
-                <w:b/>
-                <w:bCs/>
-                <w:color w:val="888888"/>
-                <w:sz w:val="18"/>
-                <w:szCs w:val="18"/>
-              </w:rPr>
-              <w:t xml:space="preserve">Not Started</w:t>
+                <w:sz w:val="18"/>
+              </w:rPr>
+              <w:t>Not Started</w:t>
             </w:r>
           </w:p>
         </w:tc>
@@ -2536,12 +2200,9 @@
             </w:pPr>
             <w:r>
               <w:rPr>
-                <w:rFonts w:ascii="DM Sans" w:cs="DM Sans" w:eastAsia="DM Sans" w:hAnsi="DM Sans"/>
-                <w:color w:val="666666"/>
-                <w:sz w:val="19"/>
-                <w:szCs w:val="19"/>
-              </w:rPr>
-              <w:t xml:space="preserve">Week 5–6</w:t>
+                <w:sz w:val="18"/>
+              </w:rPr>
+              <w:t>Week 4–6</w:t>
             </w:r>
           </w:p>
         </w:tc>
@@ -2578,12 +2239,9 @@
           <w:p>
             <w:r>
               <w:rPr>
-                <w:rFonts w:ascii="DM Sans" w:cs="DM Sans" w:eastAsia="DM Sans" w:hAnsi="DM Sans"/>
-                <w:color w:val="333333"/>
-                <w:sz w:val="19"/>
-                <w:szCs w:val="19"/>
-              </w:rPr>
-              <w:t xml:space="preserve">Invoice generation / payment history</w:t>
+                <w:sz w:val="18"/>
+              </w:rPr>
+              <w:t>Recurring care schedule management</w:t>
             </w:r>
           </w:p>
         </w:tc>
@@ -2610,14 +2268,9 @@
             </w:pPr>
             <w:r>
               <w:rPr>
-                <w:rFonts w:ascii="DM Sans" w:cs="DM Sans" w:eastAsia="DM Sans" w:hAnsi="DM Sans"/>
-                <w:b/>
-                <w:bCs/>
-                <w:color w:val="888888"/>
-                <w:sz w:val="18"/>
-                <w:szCs w:val="18"/>
-              </w:rPr>
-              <w:t xml:space="preserve">Not Started</w:t>
+                <w:sz w:val="18"/>
+              </w:rPr>
+              <w:t>Not Started</w:t>
             </w:r>
           </w:p>
         </w:tc>
@@ -2644,12 +2297,9 @@
             </w:pPr>
             <w:r>
               <w:rPr>
-                <w:rFonts w:ascii="DM Sans" w:cs="DM Sans" w:eastAsia="DM Sans" w:hAnsi="DM Sans"/>
-                <w:color w:val="666666"/>
-                <w:sz w:val="19"/>
-                <w:szCs w:val="19"/>
-              </w:rPr>
-              <w:t xml:space="preserve">Week 6–7</w:t>
+                <w:sz w:val="18"/>
+              </w:rPr>
+              <w:t>Week 4–5</w:t>
             </w:r>
           </w:p>
         </w:tc>
@@ -2687,12 +2337,9 @@
           <w:p>
             <w:r>
               <w:rPr>
-                <w:rFonts w:ascii="DM Sans" w:cs="DM Sans" w:eastAsia="DM Sans" w:hAnsi="DM Sans"/>
-                <w:color w:val="333333"/>
-                <w:sz w:val="19"/>
-                <w:szCs w:val="19"/>
-              </w:rPr>
-              <w:t xml:space="preserve">Care plan templates (custom per recipient)</w:t>
+                <w:sz w:val="18"/>
+              </w:rPr>
+              <w:t>Family-to-caregiver direct booking</w:t>
             </w:r>
           </w:p>
         </w:tc>
@@ -2720,14 +2367,9 @@
             </w:pPr>
             <w:r>
               <w:rPr>
-                <w:rFonts w:ascii="DM Sans" w:cs="DM Sans" w:eastAsia="DM Sans" w:hAnsi="DM Sans"/>
-                <w:b/>
-                <w:bCs/>
-                <w:color w:val="888888"/>
-                <w:sz w:val="18"/>
-                <w:szCs w:val="18"/>
-              </w:rPr>
-              <w:t xml:space="preserve">Not Started</w:t>
+                <w:sz w:val="18"/>
+              </w:rPr>
+              <w:t>Not Started</w:t>
             </w:r>
           </w:p>
         </w:tc>
@@ -2755,12 +2397,9 @@
             </w:pPr>
             <w:r>
               <w:rPr>
-                <w:rFonts w:ascii="DM Sans" w:cs="DM Sans" w:eastAsia="DM Sans" w:hAnsi="DM Sans"/>
-                <w:color w:val="666666"/>
-                <w:sz w:val="19"/>
-                <w:szCs w:val="19"/>
-              </w:rPr>
-              <w:t xml:space="preserve">Week 6–8</w:t>
+                <w:sz w:val="18"/>
+              </w:rPr>
+              <w:t>Week 5–7</w:t>
             </w:r>
           </w:p>
         </w:tc>
@@ -2797,12 +2436,9 @@
           <w:p>
             <w:r>
               <w:rPr>
-                <w:rFonts w:ascii="DM Sans" w:cs="DM Sans" w:eastAsia="DM Sans" w:hAnsi="DM Sans"/>
-                <w:color w:val="333333"/>
-                <w:sz w:val="19"/>
-                <w:szCs w:val="19"/>
-              </w:rPr>
-              <w:t xml:space="preserve">Photo/media upload for visit reports</w:t>
+                <w:sz w:val="18"/>
+              </w:rPr>
+              <w:t>Earnings dashboard for caregivers</w:t>
             </w:r>
           </w:p>
         </w:tc>
@@ -2829,14 +2465,9 @@
             </w:pPr>
             <w:r>
               <w:rPr>
-                <w:rFonts w:ascii="DM Sans" w:cs="DM Sans" w:eastAsia="DM Sans" w:hAnsi="DM Sans"/>
-                <w:b/>
-                <w:bCs/>
-                <w:color w:val="888888"/>
-                <w:sz w:val="18"/>
-                <w:szCs w:val="18"/>
-              </w:rPr>
-              <w:t xml:space="preserve">Not Started</w:t>
+                <w:sz w:val="18"/>
+              </w:rPr>
+              <w:t>Not Started</w:t>
             </w:r>
           </w:p>
         </w:tc>
@@ -2863,12 +2494,9 @@
             </w:pPr>
             <w:r>
               <w:rPr>
-                <w:rFonts w:ascii="DM Sans" w:cs="DM Sans" w:eastAsia="DM Sans" w:hAnsi="DM Sans"/>
-                <w:color w:val="666666"/>
-                <w:sz w:val="19"/>
-                <w:szCs w:val="19"/>
-              </w:rPr>
-              <w:t xml:space="preserve">Week 7–8</w:t>
+                <w:sz w:val="18"/>
+              </w:rPr>
+              <w:t>Week 5–6</w:t>
             </w:r>
           </w:p>
         </w:tc>
@@ -2899,26 +2527,11 @@
             </w:pPr>
             <w:r>
               <w:rPr>
-                <w:rFonts w:ascii="DM Sans" w:cs="DM Sans" w:eastAsia="DM Sans" w:hAnsi="DM Sans"/>
-                <w:b/>
-                <w:bCs/>
-                <w:color w:val="0F4238"/>
-                <w:sz w:val="20"/>
-                <w:szCs w:val="20"/>
-              </w:rPr>
-              <w:t xml:space="preserve">Phase 3</w:t>
-            </w:r>
-            <w:r>
-              <w:rPr>
-                <w:rFonts w:ascii="DM Sans" w:cs="DM Sans" w:eastAsia="DM Sans" w:hAnsi="DM Sans"/>
-                <w:b/>
-                <w:bCs/>
-                <w:color w:val="0F4238"/>
-                <w:sz w:val="20"/>
-                <w:szCs w:val="20"/>
-              </w:rPr>
+                <w:sz w:val="18"/>
+              </w:rPr>
+              <w:t>Phase 3</w:t>
               <w:br/>
-              <w:t xml:space="preserve">Trust &amp; Safety</w:t>
+              <w:t>Trust &amp; Safety</w:t>
             </w:r>
           </w:p>
         </w:tc>
@@ -2942,12 +2555,9 @@
           <w:p>
             <w:r>
               <w:rPr>
-                <w:rFonts w:ascii="DM Sans" w:cs="DM Sans" w:eastAsia="DM Sans" w:hAnsi="DM Sans"/>
-                <w:color w:val="333333"/>
-                <w:sz w:val="19"/>
-                <w:szCs w:val="19"/>
-              </w:rPr>
-              <w:t xml:space="preserve">Identity verification (ID upload)</w:t>
+                <w:sz w:val="18"/>
+              </w:rPr>
+              <w:t>Invoice generation / payment history</w:t>
             </w:r>
           </w:p>
         </w:tc>
@@ -2975,14 +2585,9 @@
             </w:pPr>
             <w:r>
               <w:rPr>
-                <w:rFonts w:ascii="DM Sans" w:cs="DM Sans" w:eastAsia="DM Sans" w:hAnsi="DM Sans"/>
-                <w:b/>
-                <w:bCs/>
-                <w:color w:val="888888"/>
-                <w:sz w:val="18"/>
-                <w:szCs w:val="18"/>
-              </w:rPr>
-              <w:t xml:space="preserve">Not Started</w:t>
+                <w:sz w:val="18"/>
+              </w:rPr>
+              <w:t>Not Started</w:t>
             </w:r>
           </w:p>
         </w:tc>
@@ -3010,12 +2615,9 @@
             </w:pPr>
             <w:r>
               <w:rPr>
-                <w:rFonts w:ascii="DM Sans" w:cs="DM Sans" w:eastAsia="DM Sans" w:hAnsi="DM Sans"/>
-                <w:color w:val="666666"/>
-                <w:sz w:val="19"/>
-                <w:szCs w:val="19"/>
-              </w:rPr>
-              <w:t xml:space="preserve">Week 8–10</w:t>
+                <w:sz w:val="18"/>
+              </w:rPr>
+              <w:t>Week 6–7</w:t>
             </w:r>
           </w:p>
         </w:tc>
@@ -3052,12 +2654,9 @@
           <w:p>
             <w:r>
               <w:rPr>
-                <w:rFonts w:ascii="DM Sans" w:cs="DM Sans" w:eastAsia="DM Sans" w:hAnsi="DM Sans"/>
-                <w:color w:val="333333"/>
-                <w:sz w:val="19"/>
-                <w:szCs w:val="19"/>
-              </w:rPr>
-              <w:t xml:space="preserve">Incident reporting system</w:t>
+                <w:sz w:val="18"/>
+              </w:rPr>
+              <w:t>Care plan templates (custom per recipient)</w:t>
             </w:r>
           </w:p>
         </w:tc>
@@ -3084,14 +2683,9 @@
             </w:pPr>
             <w:r>
               <w:rPr>
-                <w:rFonts w:ascii="DM Sans" w:cs="DM Sans" w:eastAsia="DM Sans" w:hAnsi="DM Sans"/>
-                <w:b/>
-                <w:bCs/>
-                <w:color w:val="888888"/>
-                <w:sz w:val="18"/>
-                <w:szCs w:val="18"/>
-              </w:rPr>
-              <w:t xml:space="preserve">Not Started</w:t>
+                <w:sz w:val="18"/>
+              </w:rPr>
+              <w:t>Not Started</w:t>
             </w:r>
           </w:p>
         </w:tc>
@@ -3118,12 +2712,9 @@
             </w:pPr>
             <w:r>
               <w:rPr>
-                <w:rFonts w:ascii="DM Sans" w:cs="DM Sans" w:eastAsia="DM Sans" w:hAnsi="DM Sans"/>
-                <w:color w:val="666666"/>
-                <w:sz w:val="19"/>
-                <w:szCs w:val="19"/>
-              </w:rPr>
-              <w:t xml:space="preserve">Week 8–9</w:t>
+                <w:sz w:val="18"/>
+              </w:rPr>
+              <w:t>Week 6–8</w:t>
             </w:r>
           </w:p>
         </w:tc>
@@ -3161,12 +2752,9 @@
           <w:p>
             <w:r>
               <w:rPr>
-                <w:rFonts w:ascii="DM Sans" w:cs="DM Sans" w:eastAsia="DM Sans" w:hAnsi="DM Sans"/>
-                <w:color w:val="333333"/>
-                <w:sz w:val="19"/>
-                <w:szCs w:val="19"/>
-              </w:rPr>
-              <w:t xml:space="preserve">Emergency contact quick-dial</w:t>
+                <w:sz w:val="18"/>
+              </w:rPr>
+              <w:t>Photo/media upload for visit reports</w:t>
             </w:r>
           </w:p>
         </w:tc>
@@ -3194,14 +2782,9 @@
             </w:pPr>
             <w:r>
               <w:rPr>
-                <w:rFonts w:ascii="DM Sans" w:cs="DM Sans" w:eastAsia="DM Sans" w:hAnsi="DM Sans"/>
-                <w:b/>
-                <w:bCs/>
-                <w:color w:val="888888"/>
-                <w:sz w:val="18"/>
-                <w:szCs w:val="18"/>
-              </w:rPr>
-              <w:t xml:space="preserve">Not Started</w:t>
+                <w:sz w:val="18"/>
+              </w:rPr>
+              <w:t>Not Started</w:t>
             </w:r>
           </w:p>
         </w:tc>
@@ -3229,12 +2812,9 @@
             </w:pPr>
             <w:r>
               <w:rPr>
-                <w:rFonts w:ascii="DM Sans" w:cs="DM Sans" w:eastAsia="DM Sans" w:hAnsi="DM Sans"/>
-                <w:color w:val="666666"/>
-                <w:sz w:val="19"/>
-                <w:szCs w:val="19"/>
-              </w:rPr>
-              <w:t xml:space="preserve">Week 9–10</w:t>
+                <w:sz w:val="18"/>
+              </w:rPr>
+              <w:t>Week 7–8</w:t>
             </w:r>
           </w:p>
         </w:tc>
@@ -3271,12 +2851,9 @@
           <w:p>
             <w:r>
               <w:rPr>
-                <w:rFonts w:ascii="DM Sans" w:cs="DM Sans" w:eastAsia="DM Sans" w:hAnsi="DM Sans"/>
-                <w:color w:val="333333"/>
-                <w:sz w:val="19"/>
-                <w:szCs w:val="19"/>
-              </w:rPr>
-              <w:t xml:space="preserve">Caregiver insurance verification</w:t>
+                <w:sz w:val="18"/>
+              </w:rPr>
+              <w:t>Identity verification (ID upload)</w:t>
             </w:r>
           </w:p>
         </w:tc>
@@ -3303,14 +2880,9 @@
             </w:pPr>
             <w:r>
               <w:rPr>
-                <w:rFonts w:ascii="DM Sans" w:cs="DM Sans" w:eastAsia="DM Sans" w:hAnsi="DM Sans"/>
-                <w:b/>
-                <w:bCs/>
-                <w:color w:val="888888"/>
-                <w:sz w:val="18"/>
-                <w:szCs w:val="18"/>
-              </w:rPr>
-              <w:t xml:space="preserve">Not Started</w:t>
+                <w:sz w:val="18"/>
+              </w:rPr>
+              <w:t>Not Started</w:t>
             </w:r>
           </w:p>
         </w:tc>
@@ -3337,12 +2909,9 @@
             </w:pPr>
             <w:r>
               <w:rPr>
-                <w:rFonts w:ascii="DM Sans" w:cs="DM Sans" w:eastAsia="DM Sans" w:hAnsi="DM Sans"/>
-                <w:color w:val="666666"/>
-                <w:sz w:val="19"/>
-                <w:szCs w:val="19"/>
-              </w:rPr>
-              <w:t xml:space="preserve">Week 9–11</w:t>
+                <w:sz w:val="18"/>
+              </w:rPr>
+              <w:t>Week 8–10</w:t>
             </w:r>
           </w:p>
         </w:tc>
@@ -3380,12 +2949,9 @@
           <w:p>
             <w:r>
               <w:rPr>
-                <w:rFonts w:ascii="DM Sans" w:cs="DM Sans" w:eastAsia="DM Sans" w:hAnsi="DM Sans"/>
-                <w:color w:val="333333"/>
-                <w:sz w:val="19"/>
-                <w:szCs w:val="19"/>
-              </w:rPr>
-              <w:t xml:space="preserve">Admin dashboard (moderation + analytics)</w:t>
+                <w:sz w:val="18"/>
+              </w:rPr>
+              <w:t>Incident reporting system</w:t>
             </w:r>
           </w:p>
         </w:tc>
@@ -3413,14 +2979,9 @@
             </w:pPr>
             <w:r>
               <w:rPr>
-                <w:rFonts w:ascii="DM Sans" w:cs="DM Sans" w:eastAsia="DM Sans" w:hAnsi="DM Sans"/>
-                <w:b/>
-                <w:bCs/>
-                <w:color w:val="888888"/>
-                <w:sz w:val="18"/>
-                <w:szCs w:val="18"/>
-              </w:rPr>
-              <w:t xml:space="preserve">Not Started</w:t>
+                <w:sz w:val="18"/>
+              </w:rPr>
+              <w:t>Not Started</w:t>
             </w:r>
           </w:p>
         </w:tc>
@@ -3448,12 +3009,9 @@
             </w:pPr>
             <w:r>
               <w:rPr>
-                <w:rFonts w:ascii="DM Sans" w:cs="DM Sans" w:eastAsia="DM Sans" w:hAnsi="DM Sans"/>
-                <w:color w:val="666666"/>
-                <w:sz w:val="19"/>
-                <w:szCs w:val="19"/>
-              </w:rPr>
-              <w:t xml:space="preserve">Week 10–12</w:t>
+                <w:sz w:val="18"/>
+              </w:rPr>
+              <w:t>Week 8–9</w:t>
             </w:r>
           </w:p>
         </w:tc>
@@ -3484,26 +3042,11 @@
             </w:pPr>
             <w:r>
               <w:rPr>
-                <w:rFonts w:ascii="DM Sans" w:cs="DM Sans" w:eastAsia="DM Sans" w:hAnsi="DM Sans"/>
-                <w:b/>
-                <w:bCs/>
-                <w:color w:val="0F4238"/>
-                <w:sz w:val="20"/>
-                <w:szCs w:val="20"/>
-              </w:rPr>
-              <w:t xml:space="preserve">Phase 4</w:t>
-            </w:r>
-            <w:r>
-              <w:rPr>
-                <w:rFonts w:ascii="DM Sans" w:cs="DM Sans" w:eastAsia="DM Sans" w:hAnsi="DM Sans"/>
-                <w:b/>
-                <w:bCs/>
-                <w:color w:val="0F4238"/>
-                <w:sz w:val="20"/>
-                <w:szCs w:val="20"/>
-              </w:rPr>
+                <w:sz w:val="18"/>
+              </w:rPr>
+              <w:t>Phase 4</w:t>
               <w:br/>
-              <w:t xml:space="preserve">Growth</w:t>
+              <w:t>Growth</w:t>
             </w:r>
           </w:p>
         </w:tc>
@@ -3526,12 +3069,9 @@
           <w:p>
             <w:r>
               <w:rPr>
-                <w:rFonts w:ascii="DM Sans" w:cs="DM Sans" w:eastAsia="DM Sans" w:hAnsi="DM Sans"/>
-                <w:color w:val="333333"/>
-                <w:sz w:val="19"/>
-                <w:szCs w:val="19"/>
-              </w:rPr>
-              <w:t xml:space="preserve">Geolocation-based caregiver matching</w:t>
+                <w:sz w:val="18"/>
+              </w:rPr>
+              <w:t>Emergency contact quick-dial</w:t>
             </w:r>
           </w:p>
         </w:tc>
@@ -3558,14 +3098,9 @@
             </w:pPr>
             <w:r>
               <w:rPr>
-                <w:rFonts w:ascii="DM Sans" w:cs="DM Sans" w:eastAsia="DM Sans" w:hAnsi="DM Sans"/>
-                <w:b/>
-                <w:bCs/>
-                <w:color w:val="888888"/>
-                <w:sz w:val="18"/>
-                <w:szCs w:val="18"/>
-              </w:rPr>
-              <w:t xml:space="preserve">Not Started</w:t>
+                <w:sz w:val="18"/>
+              </w:rPr>
+              <w:t>Not Started</w:t>
             </w:r>
           </w:p>
         </w:tc>
@@ -3592,12 +3127,9 @@
             </w:pPr>
             <w:r>
               <w:rPr>
-                <w:rFonts w:ascii="DM Sans" w:cs="DM Sans" w:eastAsia="DM Sans" w:hAnsi="DM Sans"/>
-                <w:color w:val="666666"/>
-                <w:sz w:val="19"/>
-                <w:szCs w:val="19"/>
-              </w:rPr>
-              <w:t xml:space="preserve">Month 4–5</w:t>
+                <w:sz w:val="18"/>
+              </w:rPr>
+              <w:t>Week 9–10</w:t>
             </w:r>
           </w:p>
         </w:tc>
@@ -3635,12 +3167,9 @@
           <w:p>
             <w:r>
               <w:rPr>
-                <w:rFonts w:ascii="DM Sans" w:cs="DM Sans" w:eastAsia="DM Sans" w:hAnsi="DM Sans"/>
-                <w:color w:val="333333"/>
-                <w:sz w:val="19"/>
-                <w:szCs w:val="19"/>
-              </w:rPr>
-              <w:t xml:space="preserve">Medication tracking module</w:t>
+                <w:sz w:val="18"/>
+              </w:rPr>
+              <w:t>Caregiver insurance verification</w:t>
             </w:r>
           </w:p>
         </w:tc>
@@ -3668,14 +3197,9 @@
             </w:pPr>
             <w:r>
               <w:rPr>
-                <w:rFonts w:ascii="DM Sans" w:cs="DM Sans" w:eastAsia="DM Sans" w:hAnsi="DM Sans"/>
-                <w:b/>
-                <w:bCs/>
-                <w:color w:val="888888"/>
-                <w:sz w:val="18"/>
-                <w:szCs w:val="18"/>
-              </w:rPr>
-              <w:t xml:space="preserve">Not Started</w:t>
+                <w:sz w:val="18"/>
+              </w:rPr>
+              <w:t>Not Started</w:t>
             </w:r>
           </w:p>
         </w:tc>
@@ -3703,12 +3227,9 @@
             </w:pPr>
             <w:r>
               <w:rPr>
-                <w:rFonts w:ascii="DM Sans" w:cs="DM Sans" w:eastAsia="DM Sans" w:hAnsi="DM Sans"/>
-                <w:color w:val="666666"/>
-                <w:sz w:val="19"/>
-                <w:szCs w:val="19"/>
-              </w:rPr>
-              <w:t xml:space="preserve">Month 4–6</w:t>
+                <w:sz w:val="18"/>
+              </w:rPr>
+              <w:t>Week 9–11</w:t>
             </w:r>
           </w:p>
         </w:tc>
@@ -3745,12 +3266,9 @@
           <w:p>
             <w:r>
               <w:rPr>
-                <w:rFonts w:ascii="DM Sans" w:cs="DM Sans" w:eastAsia="DM Sans" w:hAnsi="DM Sans"/>
-                <w:color w:val="333333"/>
-                <w:sz w:val="19"/>
-                <w:szCs w:val="19"/>
-              </w:rPr>
-              <w:t xml:space="preserve">Family member invitation + sharing</w:t>
+                <w:sz w:val="18"/>
+              </w:rPr>
+              <w:t>Admin dashboard (moderation + analytics)</w:t>
             </w:r>
           </w:p>
         </w:tc>
@@ -3777,14 +3295,9 @@
             </w:pPr>
             <w:r>
               <w:rPr>
-                <w:rFonts w:ascii="DM Sans" w:cs="DM Sans" w:eastAsia="DM Sans" w:hAnsi="DM Sans"/>
-                <w:b/>
-                <w:bCs/>
-                <w:color w:val="888888"/>
-                <w:sz w:val="18"/>
-                <w:szCs w:val="18"/>
-              </w:rPr>
-              <w:t xml:space="preserve">Not Started</w:t>
+                <w:sz w:val="18"/>
+              </w:rPr>
+              <w:t>Not Started</w:t>
             </w:r>
           </w:p>
         </w:tc>
@@ -3811,12 +3324,9 @@
             </w:pPr>
             <w:r>
               <w:rPr>
-                <w:rFonts w:ascii="DM Sans" w:cs="DM Sans" w:eastAsia="DM Sans" w:hAnsi="DM Sans"/>
-                <w:color w:val="666666"/>
-                <w:sz w:val="19"/>
-                <w:szCs w:val="19"/>
-              </w:rPr>
-              <w:t xml:space="preserve">Month 5–6</w:t>
+                <w:sz w:val="18"/>
+              </w:rPr>
+              <w:t>Week 10–12</w:t>
             </w:r>
           </w:p>
         </w:tc>
@@ -3854,12 +3364,9 @@
           <w:p>
             <w:r>
               <w:rPr>
-                <w:rFonts w:ascii="DM Sans" w:cs="DM Sans" w:eastAsia="DM Sans" w:hAnsi="DM Sans"/>
-                <w:color w:val="333333"/>
-                <w:sz w:val="19"/>
-                <w:szCs w:val="19"/>
-              </w:rPr>
-              <w:t xml:space="preserve">AI health insights / anomaly detection</w:t>
+                <w:sz w:val="18"/>
+              </w:rPr>
+              <w:t>Geolocation-based caregiver matching</w:t>
             </w:r>
           </w:p>
         </w:tc>
@@ -3887,14 +3394,9 @@
             </w:pPr>
             <w:r>
               <w:rPr>
-                <w:rFonts w:ascii="DM Sans" w:cs="DM Sans" w:eastAsia="DM Sans" w:hAnsi="DM Sans"/>
-                <w:b/>
-                <w:bCs/>
-                <w:color w:val="888888"/>
-                <w:sz w:val="18"/>
-                <w:szCs w:val="18"/>
-              </w:rPr>
-              <w:t xml:space="preserve">Not Started</w:t>
+                <w:sz w:val="18"/>
+              </w:rPr>
+              <w:t>Not Started</w:t>
             </w:r>
           </w:p>
         </w:tc>
@@ -3922,12 +3424,9 @@
             </w:pPr>
             <w:r>
               <w:rPr>
-                <w:rFonts w:ascii="DM Sans" w:cs="DM Sans" w:eastAsia="DM Sans" w:hAnsi="DM Sans"/>
-                <w:color w:val="666666"/>
-                <w:sz w:val="19"/>
-                <w:szCs w:val="19"/>
-              </w:rPr>
-              <w:t xml:space="preserve">Month 6+</w:t>
+                <w:sz w:val="18"/>
+              </w:rPr>
+              <w:t>Month 4–5</w:t>
             </w:r>
           </w:p>
         </w:tc>
@@ -3964,12 +3463,9 @@
           <w:p>
             <w:r>
               <w:rPr>
-                <w:rFonts w:ascii="DM Sans" w:cs="DM Sans" w:eastAsia="DM Sans" w:hAnsi="DM Sans"/>
-                <w:color w:val="333333"/>
-                <w:sz w:val="19"/>
-                <w:szCs w:val="19"/>
-              </w:rPr>
-              <w:t xml:space="preserve">Doctor coordination portal</w:t>
+                <w:sz w:val="18"/>
+              </w:rPr>
+              <w:t>Medication tracking module</w:t>
             </w:r>
           </w:p>
         </w:tc>
@@ -3996,14 +3492,9 @@
             </w:pPr>
             <w:r>
               <w:rPr>
-                <w:rFonts w:ascii="DM Sans" w:cs="DM Sans" w:eastAsia="DM Sans" w:hAnsi="DM Sans"/>
-                <w:b/>
-                <w:bCs/>
-                <w:color w:val="888888"/>
-                <w:sz w:val="18"/>
-                <w:szCs w:val="18"/>
-              </w:rPr>
-              <w:t xml:space="preserve">Not Started</w:t>
+                <w:sz w:val="18"/>
+              </w:rPr>
+              <w:t>Not Started</w:t>
             </w:r>
           </w:p>
         </w:tc>
@@ -4030,12 +3521,9 @@
             </w:pPr>
             <w:r>
               <w:rPr>
-                <w:rFonts w:ascii="DM Sans" w:cs="DM Sans" w:eastAsia="DM Sans" w:hAnsi="DM Sans"/>
-                <w:color w:val="666666"/>
-                <w:sz w:val="19"/>
-                <w:szCs w:val="19"/>
-              </w:rPr>
-              <w:t xml:space="preserve">Month 6+</w:t>
+                <w:sz w:val="18"/>
+              </w:rPr>
+              <w:t>Month 4–6</w:t>
             </w:r>
           </w:p>
         </w:tc>
@@ -4066,26 +3554,11 @@
             </w:pPr>
             <w:r>
               <w:rPr>
-                <w:rFonts w:ascii="DM Sans" w:cs="DM Sans" w:eastAsia="DM Sans" w:hAnsi="DM Sans"/>
-                <w:b/>
-                <w:bCs/>
-                <w:color w:val="0F4238"/>
-                <w:sz w:val="20"/>
-                <w:szCs w:val="20"/>
-              </w:rPr>
-              <w:t xml:space="preserve">Phase 5</w:t>
-            </w:r>
-            <w:r>
-              <w:rPr>
-                <w:rFonts w:ascii="DM Sans" w:cs="DM Sans" w:eastAsia="DM Sans" w:hAnsi="DM Sans"/>
-                <w:b/>
-                <w:bCs/>
-                <w:color w:val="0F4238"/>
-                <w:sz w:val="20"/>
-                <w:szCs w:val="20"/>
-              </w:rPr>
+                <w:sz w:val="18"/>
+              </w:rPr>
+              <w:t>Phase 5</w:t>
               <w:br/>
-              <w:t xml:space="preserve">Scale</w:t>
+              <w:t>Scale</w:t>
             </w:r>
           </w:p>
         </w:tc>
@@ -4109,12 +3582,9 @@
           <w:p>
             <w:r>
               <w:rPr>
-                <w:rFonts w:ascii="DM Sans" w:cs="DM Sans" w:eastAsia="DM Sans" w:hAnsi="DM Sans"/>
-                <w:color w:val="333333"/>
-                <w:sz w:val="19"/>
-                <w:szCs w:val="19"/>
-              </w:rPr>
-              <w:t xml:space="preserve">Native mobile app (React Native)</w:t>
+                <w:sz w:val="18"/>
+              </w:rPr>
+              <w:t>Family member invitation + sharing</w:t>
             </w:r>
           </w:p>
         </w:tc>
@@ -4142,14 +3612,9 @@
             </w:pPr>
             <w:r>
               <w:rPr>
-                <w:rFonts w:ascii="DM Sans" w:cs="DM Sans" w:eastAsia="DM Sans" w:hAnsi="DM Sans"/>
-                <w:b/>
-                <w:bCs/>
-                <w:color w:val="888888"/>
-                <w:sz w:val="18"/>
-                <w:szCs w:val="18"/>
-              </w:rPr>
-              <w:t xml:space="preserve">Not Started</w:t>
+                <w:sz w:val="18"/>
+              </w:rPr>
+              <w:t>Not Started</w:t>
             </w:r>
           </w:p>
         </w:tc>
@@ -4177,12 +3642,9 @@
             </w:pPr>
             <w:r>
               <w:rPr>
-                <w:rFonts w:ascii="DM Sans" w:cs="DM Sans" w:eastAsia="DM Sans" w:hAnsi="DM Sans"/>
-                <w:color w:val="666666"/>
-                <w:sz w:val="19"/>
-                <w:szCs w:val="19"/>
-              </w:rPr>
-              <w:t xml:space="preserve">Month 6–9</w:t>
+                <w:sz w:val="18"/>
+              </w:rPr>
+              <w:t>Month 5–6</w:t>
             </w:r>
           </w:p>
         </w:tc>
@@ -4219,12 +3681,9 @@
           <w:p>
             <w:r>
               <w:rPr>
-                <w:rFonts w:ascii="DM Sans" w:cs="DM Sans" w:eastAsia="DM Sans" w:hAnsi="DM Sans"/>
-                <w:color w:val="333333"/>
-                <w:sz w:val="19"/>
-                <w:szCs w:val="19"/>
-              </w:rPr>
-              <w:t xml:space="preserve">Real-time GPS tracking during visits</w:t>
+                <w:sz w:val="18"/>
+              </w:rPr>
+              <w:t>AI health insights / anomaly detection</w:t>
             </w:r>
           </w:p>
         </w:tc>
@@ -4251,14 +3710,9 @@
             </w:pPr>
             <w:r>
               <w:rPr>
-                <w:rFonts w:ascii="DM Sans" w:cs="DM Sans" w:eastAsia="DM Sans" w:hAnsi="DM Sans"/>
-                <w:b/>
-                <w:bCs/>
-                <w:color w:val="888888"/>
-                <w:sz w:val="18"/>
-                <w:szCs w:val="18"/>
-              </w:rPr>
-              <w:t xml:space="preserve">Not Started</w:t>
+                <w:sz w:val="18"/>
+              </w:rPr>
+              <w:t>Not Started</w:t>
             </w:r>
           </w:p>
         </w:tc>
@@ -4285,12 +3739,9 @@
             </w:pPr>
             <w:r>
               <w:rPr>
-                <w:rFonts w:ascii="DM Sans" w:cs="DM Sans" w:eastAsia="DM Sans" w:hAnsi="DM Sans"/>
-                <w:color w:val="666666"/>
-                <w:sz w:val="19"/>
-                <w:szCs w:val="19"/>
-              </w:rPr>
-              <w:t xml:space="preserve">Month 7–8</w:t>
+                <w:sz w:val="18"/>
+              </w:rPr>
+              <w:t>Month 6+</w:t>
             </w:r>
           </w:p>
         </w:tc>
@@ -4328,12 +3779,9 @@
           <w:p>
             <w:r>
               <w:rPr>
-                <w:rFonts w:ascii="DM Sans" w:cs="DM Sans" w:eastAsia="DM Sans" w:hAnsi="DM Sans"/>
-                <w:color w:val="333333"/>
-                <w:sz w:val="19"/>
-                <w:szCs w:val="19"/>
-              </w:rPr>
-              <w:t xml:space="preserve">Multi-language support</w:t>
+                <w:sz w:val="18"/>
+              </w:rPr>
+              <w:t>Doctor coordination portal</w:t>
             </w:r>
           </w:p>
         </w:tc>
@@ -4361,14 +3809,9 @@
             </w:pPr>
             <w:r>
               <w:rPr>
-                <w:rFonts w:ascii="DM Sans" w:cs="DM Sans" w:eastAsia="DM Sans" w:hAnsi="DM Sans"/>
-                <w:b/>
-                <w:bCs/>
-                <w:color w:val="888888"/>
-                <w:sz w:val="18"/>
-                <w:szCs w:val="18"/>
-              </w:rPr>
-              <w:t xml:space="preserve">Not Started</w:t>
+                <w:sz w:val="18"/>
+              </w:rPr>
+              <w:t>Not Started</w:t>
             </w:r>
           </w:p>
         </w:tc>
@@ -4396,12 +3839,9 @@
             </w:pPr>
             <w:r>
               <w:rPr>
-                <w:rFonts w:ascii="DM Sans" w:cs="DM Sans" w:eastAsia="DM Sans" w:hAnsi="DM Sans"/>
-                <w:color w:val="666666"/>
-                <w:sz w:val="19"/>
-                <w:szCs w:val="19"/>
-              </w:rPr>
-              <w:t xml:space="preserve">Month 8+</w:t>
+                <w:sz w:val="18"/>
+              </w:rPr>
+              <w:t>Month 6+</w:t>
             </w:r>
           </w:p>
         </w:tc>
@@ -4438,12 +3878,9 @@
           <w:p>
             <w:r>
               <w:rPr>
-                <w:rFonts w:ascii="DM Sans" w:cs="DM Sans" w:eastAsia="DM Sans" w:hAnsi="DM Sans"/>
-                <w:color w:val="333333"/>
-                <w:sz w:val="19"/>
-                <w:szCs w:val="19"/>
-              </w:rPr>
-              <w:t xml:space="preserve">Insurance / Medicare integration</w:t>
+                <w:sz w:val="18"/>
+              </w:rPr>
+              <w:t>Native mobile app (React Native)</w:t>
             </w:r>
           </w:p>
         </w:tc>
@@ -4470,14 +3907,9 @@
             </w:pPr>
             <w:r>
               <w:rPr>
-                <w:rFonts w:ascii="DM Sans" w:cs="DM Sans" w:eastAsia="DM Sans" w:hAnsi="DM Sans"/>
-                <w:b/>
-                <w:bCs/>
-                <w:color w:val="888888"/>
-                <w:sz w:val="18"/>
-                <w:szCs w:val="18"/>
-              </w:rPr>
-              <w:t xml:space="preserve">Not Started</w:t>
+                <w:sz w:val="18"/>
+              </w:rPr>
+              <w:t>Not Started</w:t>
             </w:r>
           </w:p>
         </w:tc>
@@ -4504,12 +3936,9 @@
             </w:pPr>
             <w:r>
               <w:rPr>
-                <w:rFonts w:ascii="DM Sans" w:cs="DM Sans" w:eastAsia="DM Sans" w:hAnsi="DM Sans"/>
-                <w:color w:val="666666"/>
-                <w:sz w:val="19"/>
-                <w:szCs w:val="19"/>
-              </w:rPr>
-              <w:t xml:space="preserve">Month 9+</w:t>
+                <w:sz w:val="18"/>
+              </w:rPr>
+              <w:t>Month 6–9</w:t>
             </w:r>
           </w:p>
         </w:tc>
@@ -4547,12 +3976,9 @@
           <w:p>
             <w:r>
               <w:rPr>
-                <w:rFonts w:ascii="DM Sans" w:cs="DM Sans" w:eastAsia="DM Sans" w:hAnsi="DM Sans"/>
-                <w:color w:val="333333"/>
-                <w:sz w:val="19"/>
-                <w:szCs w:val="19"/>
-              </w:rPr>
-              <w:t xml:space="preserve">API for third-party integrations</w:t>
+                <w:sz w:val="18"/>
+              </w:rPr>
+              <w:t>Real-time GPS tracking during visits</w:t>
             </w:r>
           </w:p>
         </w:tc>
@@ -4580,14 +4006,9 @@
             </w:pPr>
             <w:r>
               <w:rPr>
-                <w:rFonts w:ascii="DM Sans" w:cs="DM Sans" w:eastAsia="DM Sans" w:hAnsi="DM Sans"/>
-                <w:b/>
-                <w:bCs/>
-                <w:color w:val="888888"/>
-                <w:sz w:val="18"/>
-                <w:szCs w:val="18"/>
-              </w:rPr>
-              <w:t xml:space="preserve">Not Started</w:t>
+                <w:sz w:val="18"/>
+              </w:rPr>
+              <w:t>Not Started</w:t>
             </w:r>
           </w:p>
         </w:tc>
@@ -4615,12 +4036,9 @@
             </w:pPr>
             <w:r>
               <w:rPr>
-                <w:rFonts w:ascii="DM Sans" w:cs="DM Sans" w:eastAsia="DM Sans" w:hAnsi="DM Sans"/>
-                <w:color w:val="666666"/>
-                <w:sz w:val="19"/>
-                <w:szCs w:val="19"/>
-              </w:rPr>
-              <w:t xml:space="preserve">Month 9+</w:t>
+                <w:sz w:val="18"/>
+              </w:rPr>
+              <w:t>Month 7–8</w:t>
             </w:r>
           </w:p>
         </w:tc>
@@ -4902,12 +4320,9 @@
           <w:p>
             <w:r>
               <w:rPr>
-                <w:rFonts w:ascii="DM Sans" w:cs="DM Sans" w:eastAsia="DM Sans" w:hAnsi="DM Sans"/>
-                <w:color w:val="333333"/>
                 <w:sz w:val="20"/>
-                <w:szCs w:val="20"/>
-              </w:rPr>
-              <w:t xml:space="preserve">SQLite (prototype) → PostgreSQL (production)</w:t>
+              </w:rPr>
+              <w:t>PostgreSQL on Railway (persistent)</w:t>
             </w:r>
           </w:p>
         </w:tc>
@@ -5314,23 +4729,9 @@
       </w:pPr>
       <w:r>
         <w:rPr>
-          <w:rFonts w:ascii="DM Sans" w:cs="DM Sans" w:eastAsia="DM Sans" w:hAnsi="DM Sans"/>
-          <w:b/>
-          <w:bCs/>
-          <w:color w:val="0F4238"/>
           <w:sz w:val="22"/>
-          <w:szCs w:val="22"/>
         </w:rPr>
-        <w:t xml:space="preserve">Payment processing is #1: </w:t>
-      </w:r>
-      <w:r>
-        <w:rPr>
-          <w:rFonts w:ascii="DM Sans" w:cs="DM Sans" w:eastAsia="DM Sans" w:hAnsi="DM Sans"/>
-          <w:color w:val="333333"/>
-          <w:sz w:val="22"/>
-          <w:szCs w:val="22"/>
-        </w:rPr>
-        <w:t xml:space="preserve">Without Stripe Connect, there’s no revenue. This enables the 80/20 split and fast caregiver payouts.</w:t>
+        <w:t>Demo polish is #1: Loading spinners, toast notifications, and MyAccount persistence. These small touches make the app feel production-ready for family beta testing.</w:t>
       </w:r>
     </w:p>
     <w:p>
@@ -5344,23 +4745,9 @@
       </w:pPr>
       <w:r>
         <w:rPr>
-          <w:rFonts w:ascii="DM Sans" w:cs="DM Sans" w:eastAsia="DM Sans" w:hAnsi="DM Sans"/>
-          <w:b/>
-          <w:bCs/>
-          <w:color w:val="0F4238"/>
           <w:sz w:val="22"/>
-          <w:szCs w:val="22"/>
         </w:rPr>
-        <w:t xml:space="preserve">Caregiver onboarding flow is #2: </w:t>
-      </w:r>
-      <w:r>
-        <w:rPr>
-          <w:rFonts w:ascii="DM Sans" w:cs="DM Sans" w:eastAsia="DM Sans" w:hAnsi="DM Sans"/>
-          <w:color w:val="333333"/>
-          <w:sz w:val="22"/>
-          <w:szCs w:val="22"/>
-        </w:rPr>
-        <w:t xml:space="preserve">The recruitment page is live — now build the application form, background check integration, and approval workflow.</w:t>
+        <w:t>PWA (add-to-homescreen) is #2: With mobile bottom nav done, adding a web app manifest and service worker lets family members "install" the app on their phone without an app store.</w:t>
       </w:r>
     </w:p>
     <w:p>
@@ -5374,23 +4761,9 @@
       </w:pPr>
       <w:r>
         <w:rPr>
-          <w:rFonts w:ascii="DM Sans" w:cs="DM Sans" w:eastAsia="DM Sans" w:hAnsi="DM Sans"/>
-          <w:b/>
-          <w:bCs/>
-          <w:color w:val="0F4238"/>
           <w:sz w:val="22"/>
-          <w:szCs w:val="22"/>
         </w:rPr>
-        <w:t xml:space="preserve">Visit logging is #3: </w:t>
-      </w:r>
-      <w:r>
-        <w:rPr>
-          <w:rFonts w:ascii="DM Sans" w:cs="DM Sans" w:eastAsia="DM Sans" w:hAnsi="DM Sans"/>
-          <w:color w:val="333333"/>
-          <w:sz w:val="22"/>
-          <w:szCs w:val="22"/>
-        </w:rPr>
-        <w:t xml:space="preserve">Families need proof of care — timestamps, notes, and photos from each visit build trust and justify the price.</w:t>
+        <w:t>Payment processing is #3: Stripe Connect enables the 80/20 split and marketplace payments. This is the revenue unlock, but demo polish comes first.</w:t>
       </w:r>
     </w:p>
     <w:p>
@@ -5404,23 +4777,9 @@
       </w:pPr>
       <w:r>
         <w:rPr>
-          <w:rFonts w:ascii="DM Sans" w:cs="DM Sans" w:eastAsia="DM Sans" w:hAnsi="DM Sans"/>
-          <w:b/>
-          <w:bCs/>
-          <w:color w:val="0F4238"/>
           <w:sz w:val="22"/>
-          <w:szCs w:val="22"/>
         </w:rPr>
-        <w:t xml:space="preserve">Ratings &amp; reviews are #4: </w:t>
-      </w:r>
-      <w:r>
-        <w:rPr>
-          <w:rFonts w:ascii="DM Sans" w:cs="DM Sans" w:eastAsia="DM Sans" w:hAnsi="DM Sans"/>
-          <w:color w:val="333333"/>
-          <w:sz w:val="22"/>
-          <w:szCs w:val="22"/>
-        </w:rPr>
-        <w:t xml:space="preserve">This is the flywheel — great caregivers get more bookings, which attracts more caregivers, which attracts more families.</w:t>
+        <w:t>Input validation &amp; rate limiting is #4: Lock down API routes before any real users beyond family. Validate all inputs, rate-limit auth endpoints, sanitize data.</w:t>
       </w:r>
     </w:p>
     <w:sectPr>

</xml_diff>

<commit_message>
Update roadmap.docx for v0.6.2
Co-Authored-By: Claude Opus 4.6 <noreply@anthropic.com>
</commit_message>
<xml_diff>
--- a/InPlace_App_Roadmap.docx
+++ b/InPlace_App_Roadmap.docx
@@ -60,7 +60,7 @@
           <w:sz w:val="20"/>
           <w:szCs w:val="20"/>
         </w:rPr>
-        <w:t xml:space="preserve">Last updated: February 17, 2026  •  Current version: v0.6.1</w:t>
+        <w:t xml:space="preserve">Last updated: February 17, 2026  •  Current version: v0.6.2</w:t>
       </w:r>
     </w:p>
     <w:p>
@@ -1297,6 +1297,163 @@
     </w:p>
     <w:p>
       <w:pPr>
+        <w:pStyle w:val="Heading2"/>
+        <w:spacing w:before="300" w:after="100"/>
+      </w:pPr>
+      <w:r>
+        <w:rPr>
+          <w:b/>
+          <w:bCs/>
+          <w:color w:val="1b6b5a"/>
+          <w:sz w:val="26"/>
+          <w:szCs w:val="26"/>
+        </w:rPr>
+        <w:t xml:space="preserve">v0.6.2 — Email Verification &amp; Tests</w:t>
+      </w:r>
+      <w:r>
+        <w:rPr>
+          <w:color w:val="888888"/>
+          <w:sz w:val="22"/>
+          <w:szCs w:val="22"/>
+        </w:rPr>
+        <w:t xml:space="preserve"> (2026-02-17)</w:t>
+      </w:r>
+    </w:p>
+    <w:p>
+      <w:pPr>
+        <w:pStyle w:val="ListParagraph"/>
+        <w:numPr>
+          <w:ilvl w:val="0"/>
+          <w:numId w:val="1"/>
+        </w:numPr>
+        <w:spacing w:after="60"/>
+      </w:pPr>
+      <w:r>
+        <w:rPr>
+          <w:b w:val="false"/>
+          <w:bCs w:val="false"/>
+          <w:sz w:val="22"/>
+          <w:szCs w:val="22"/>
+        </w:rPr>
+        <w:t xml:space="preserve">Centralized email utility (src/utils/email.js) — shared sendEmail() + brandedHtml()</w:t>
+      </w:r>
+    </w:p>
+    <w:p>
+      <w:pPr>
+        <w:pStyle w:val="ListParagraph"/>
+        <w:numPr>
+          <w:ilvl w:val="0"/>
+          <w:numId w:val="1"/>
+        </w:numPr>
+        <w:spacing w:after="60"/>
+      </w:pPr>
+      <w:r>
+        <w:rPr>
+          <w:b w:val="false"/>
+          <w:bCs w:val="false"/>
+          <w:sz w:val="22"/>
+          <w:szCs w:val="22"/>
+        </w:rPr>
+        <w:t xml:space="preserve">FROM_EMAIL env var for verified domain senders; sandbox mode detection</w:t>
+      </w:r>
+    </w:p>
+    <w:p>
+      <w:pPr>
+        <w:pStyle w:val="ListParagraph"/>
+        <w:numPr>
+          <w:ilvl w:val="0"/>
+          <w:numId w:val="1"/>
+        </w:numPr>
+        <w:spacing w:after="60"/>
+      </w:pPr>
+      <w:r>
+        <w:rPr>
+          <w:b w:val="false"/>
+          <w:bCs w:val="false"/>
+          <w:sz w:val="22"/>
+          <w:szCs w:val="22"/>
+        </w:rPr>
+        <w:t xml:space="preserve">Email verification on registration: token, branded email, 24h expiry</w:t>
+      </w:r>
+    </w:p>
+    <w:p>
+      <w:pPr>
+        <w:pStyle w:val="ListParagraph"/>
+        <w:numPr>
+          <w:ilvl w:val="0"/>
+          <w:numId w:val="1"/>
+        </w:numPr>
+        <w:spacing w:after="60"/>
+      </w:pPr>
+      <w:r>
+        <w:rPr>
+          <w:b w:val="false"/>
+          <w:bCs w:val="false"/>
+          <w:sz w:val="22"/>
+          <w:szCs w:val="22"/>
+        </w:rPr>
+        <w:t xml:space="preserve">GET /api/auth/verify + POST /api/auth/resend-verification endpoints</w:t>
+      </w:r>
+    </w:p>
+    <w:p>
+      <w:pPr>
+        <w:pStyle w:val="ListParagraph"/>
+        <w:numPr>
+          <w:ilvl w:val="0"/>
+          <w:numId w:val="1"/>
+        </w:numPr>
+        <w:spacing w:after="60"/>
+      </w:pPr>
+      <w:r>
+        <w:rPr>
+          <w:b w:val="false"/>
+          <w:bCs w:val="false"/>
+          <w:sz w:val="22"/>
+          <w:szCs w:val="22"/>
+        </w:rPr>
+        <w:t xml:space="preserve">EmailVerificationBanner component for unverified users</w:t>
+      </w:r>
+    </w:p>
+    <w:p>
+      <w:pPr>
+        <w:pStyle w:val="ListParagraph"/>
+        <w:numPr>
+          <w:ilvl w:val="0"/>
+          <w:numId w:val="1"/>
+        </w:numPr>
+        <w:spacing w:after="60"/>
+      </w:pPr>
+      <w:r>
+        <w:rPr>
+          <w:b w:val="false"/>
+          <w:bCs w:val="false"/>
+          <w:sz w:val="22"/>
+          <w:szCs w:val="22"/>
+        </w:rPr>
+        <w:t xml:space="preserve">Jest + supertest test suite: 45 tests across 4 suites</w:t>
+      </w:r>
+    </w:p>
+    <w:p>
+      <w:pPr>
+        <w:pStyle w:val="ListParagraph"/>
+        <w:numPr>
+          <w:ilvl w:val="0"/>
+          <w:numId w:val="1"/>
+        </w:numPr>
+        <w:spacing w:after="60"/>
+      </w:pPr>
+      <w:r>
+        <w:rPr>
+          <w:b w:val="false"/>
+          <w:bCs w:val="false"/>
+          <w:sz w:val="22"/>
+          <w:szCs w:val="22"/>
+        </w:rPr>
+        <w:t xml:space="preserve">Mock database layer — tests run without PostgreSQL</w:t>
+      </w:r>
+    </w:p>
+    <w:p>
+      <w:pPr>
         <w:pStyle w:val="Heading1"/>
         <w:spacing w:before="400" w:after="120"/>
       </w:pPr>
@@ -1308,7 +1465,7 @@
           <w:sz w:val="32"/>
           <w:szCs w:val="32"/>
         </w:rPr>
-        <w:t xml:space="preserve">Next Up — Beta Readiness</w:t>
+        <w:t xml:space="preserve">Next Up — Marketplace &amp; Growth</w:t>
       </w:r>
     </w:p>
     <w:p>
@@ -1330,97 +1487,7 @@
           <w:sz w:val="22"/>
           <w:szCs w:val="22"/>
         </w:rPr>
-        <w:t xml:space="preserve"> — Final steps before real users.</w:t>
-      </w:r>
-    </w:p>
-    <w:p>
-      <w:pPr>
-        <w:pStyle w:val="ListParagraph"/>
-        <w:numPr>
-          <w:ilvl w:val="0"/>
-          <w:numId w:val="1"/>
-        </w:numPr>
-        <w:spacing w:after="60"/>
-      </w:pPr>
-      <w:r>
-        <w:rPr>
-          <w:sz w:val="22"/>
-          <w:szCs w:val="22"/>
-        </w:rPr>
-        <w:t xml:space="preserve">⬜ </w:t>
-      </w:r>
-      <w:r>
-        <w:rPr>
-          <w:strike w:val="false"/>
-          <w:color w:val="000000"/>
-          <w:sz w:val="22"/>
-          <w:szCs w:val="22"/>
-        </w:rPr>
-        <w:t xml:space="preserve">Email verification on registration</w:t>
-      </w:r>
-    </w:p>
-    <w:p>
-      <w:pPr>
-        <w:pStyle w:val="ListParagraph"/>
-        <w:numPr>
-          <w:ilvl w:val="0"/>
-          <w:numId w:val="1"/>
-        </w:numPr>
-        <w:spacing w:after="60"/>
-      </w:pPr>
-      <w:r>
-        <w:rPr>
-          <w:sz w:val="22"/>
-          <w:szCs w:val="22"/>
-        </w:rPr>
-        <w:t xml:space="preserve">⬜ </w:t>
-      </w:r>
-      <w:r>
-        <w:rPr>
-          <w:strike w:val="false"/>
-          <w:color w:val="000000"/>
-          <w:sz w:val="22"/>
-          <w:szCs w:val="22"/>
-        </w:rPr>
-        <w:t xml:space="preserve">Tests: auth flow, session booking, critical paths</w:t>
-      </w:r>
-    </w:p>
-    <w:p>
-      <w:pPr>
-        <w:pStyle w:val="Heading1"/>
-        <w:spacing w:before="400" w:after="120"/>
-      </w:pPr>
-      <w:r>
-        <w:rPr>
-          <w:b/>
-          <w:bCs/>
-          <w:color w:val="1b6b5a"/>
-          <w:sz w:val="32"/>
-          <w:szCs w:val="32"/>
-        </w:rPr>
-        <w:t xml:space="preserve">Future — Full Platform</w:t>
-      </w:r>
-    </w:p>
-    <w:p>
-      <w:pPr>
-        <w:spacing w:after="120"/>
-      </w:pPr>
-      <w:r>
-        <w:rPr>
-          <w:b/>
-          <w:bCs/>
-          <w:color w:val="666666"/>
-          <w:sz w:val="22"/>
-          <w:szCs w:val="22"/>
-        </w:rPr>
-        <w:t xml:space="preserve">Priority: MEDIUM</w:t>
-      </w:r>
-      <w:r>
-        <w:rPr>
-          <w:sz w:val="22"/>
-          <w:szCs w:val="22"/>
-        </w:rPr>
-        <w:t xml:space="preserve"> — Build out marketplace capabilities.</w:t>
+        <w:t xml:space="preserve"> — Build out core marketplace features.</w:t>
       </w:r>
     </w:p>
     <w:p>

</xml_diff>

<commit_message>
Update roadmap.docx with v0.7.0 recurring sessions
Co-Authored-By: Claude Opus 4.6 <noreply@anthropic.com>
</commit_message>
<xml_diff>
--- a/InPlace_App_Roadmap.docx
+++ b/InPlace_App_Roadmap.docx
@@ -72,7 +72,7 @@
           <w:sz w:val="20"/>
           <w:szCs w:val="20"/>
         </w:rPr>
-        <w:t xml:space="preserve">Last updated: February 17, 2026  •  Current version: v0.6.2  •  17 releases in 3 days</w:t>
+        <w:t xml:space="preserve">Last updated: February 17, 2026  •  Current version: v0.7.0  •  18 releases in 3 days</w:t>
       </w:r>
     </w:p>
     <w:p>
@@ -226,7 +226,7 @@
                 <w:sz w:val="20"/>
                 <w:szCs w:val="20"/>
               </w:rPr>
-              <w:t xml:space="preserve">17 (v0.1.0 – v0.6.2)</w:t>
+              <w:t xml:space="preserve">18 (v0.1.0 – v0.7.0)</w:t>
             </w:r>
           </w:p>
         </w:tc>
@@ -450,7 +450,7 @@
                 <w:sz w:val="20"/>
                 <w:szCs w:val="20"/>
               </w:rPr>
-              <w:t xml:space="preserve">45 tests, 4 suites (Jest + supertest)</w:t>
+              <w:t xml:space="preserve">53 tests, 4 suites (Jest + supertest)</w:t>
             </w:r>
           </w:p>
         </w:tc>
@@ -1907,7 +1907,7 @@
                 <w:sz w:val="20"/>
                 <w:szCs w:val="20"/>
               </w:rPr>
-              <w:t xml:space="preserve">Booked care visits</w:t>
+              <w:t xml:space="preserve">Booked care visits (single + recurring)</w:t>
             </w:r>
           </w:p>
         </w:tc>
@@ -1934,7 +1934,7 @@
                 <w:sz w:val="20"/>
                 <w:szCs w:val="20"/>
               </w:rPr>
-              <w:t xml:space="preserve">id, status, scheduled_date, caregiver_id</w:t>
+              <w:t xml:space="preserve">id, status, scheduled_date, recurrence_rule, recurrence_group_id</w:t>
             </w:r>
           </w:p>
         </w:tc>
@@ -3124,7 +3124,7 @@
                 <w:sz w:val="20"/>
                 <w:szCs w:val="20"/>
               </w:rPr>
-              <w:t xml:space="preserve">GET list, POST create, GET /:id, POST /:id/match, PUT /:id/status</w:t>
+              <w:t xml:space="preserve">GET list, POST create (single+recurring), GET /:id, POST /:id/match, PUT /:id/status, DELETE /recurring/:groupId</w:t>
             </w:r>
           </w:p>
         </w:tc>
@@ -5450,6 +5450,51 @@
       </w:r>
     </w:p>
     <w:p>
+      <w:pPr>
+        <w:pStyle w:val="Heading2"/>
+        <w:pBdr>
+          <w:bottom w:val="single" w:color="DDDDDD" w:sz="1" w:space="4"/>
+        </w:pBdr>
+        <w:spacing w:before="280" w:after="100"/>
+      </w:pPr>
+      <w:r>
+        <w:rPr>
+          <w:rFonts w:ascii="Arial" w:cs="Arial" w:eastAsia="Arial" w:hAnsi="Arial"/>
+          <w:b/>
+          <w:bCs/>
+          <w:color w:val="1b6b5a"/>
+          <w:sz w:val="26"/>
+          <w:szCs w:val="26"/>
+        </w:rPr>
+        <w:t xml:space="preserve">v0.7.0 — Recurring Sessions</w:t>
+      </w:r>
+      <w:r>
+        <w:rPr>
+          <w:rFonts w:ascii="Arial" w:cs="Arial" w:eastAsia="Arial" w:hAnsi="Arial"/>
+          <w:color w:val="888888"/>
+          <w:sz w:val="20"/>
+          <w:szCs w:val="20"/>
+        </w:rPr>
+        <w:t xml:space="preserve">  Feb 17</w:t>
+      </w:r>
+    </w:p>
+    <w:p>
+      <w:pPr>
+        <w:spacing w:after="120"/>
+      </w:pPr>
+      <w:r>
+        <w:rPr>
+          <w:rFonts w:ascii="Arial" w:cs="Arial" w:eastAsia="Arial" w:hAnsi="Arial"/>
+          <w:i w:val="false"/>
+          <w:iCs w:val="false"/>
+          <w:color w:val="333333"/>
+          <w:sz w:val="21"/>
+          <w:szCs w:val="21"/>
+        </w:rPr>
+        <w:t xml:space="preserve">Weekly and biweekly recurring care session booking. New recurrence_rule and recurrence_group_id columns on care_sessions. generateRecurringDates() helper creates session dates at weekly/biweekly intervals. POST /api/sessions creates multiple sessions with shared group ID for recurring bookings. DELETE /api/sessions/recurring/:groupId cancels all future pending/confirmed sessions in a series. RequestCareModal step 2 adds One-time/Weekly/Every 2 weeks toggle with weeks selector (2-12). Schedule calendar shows recurring badge on session cards. Expanded service type validation. Test suite expanded to 53 tests.</w:t>
+      </w:r>
+    </w:p>
+    <w:p>
       <w:r>
         <w:br w:type="page"/>
       </w:r>
@@ -5633,7 +5678,7 @@
           <w:sz w:val="21"/>
           <w:szCs w:val="21"/>
         </w:rPr>
-        <w:t xml:space="preserve">Email verification — verify new accounts (v0.6.2)</w:t>
+        <w:t xml:space="preserve">Email verification — verify new accounts (v0.7.0)</w:t>
       </w:r>
     </w:p>
     <w:p>
@@ -5657,7 +5702,31 @@
           <w:sz w:val="21"/>
           <w:szCs w:val="21"/>
         </w:rPr>
-        <w:t xml:space="preserve">Test suite — 45 tests covering auth, API, middleware (v0.6.2)</w:t>
+        <w:t xml:space="preserve">Test suite — 53 tests covering auth, API, middleware, session validation (v0.6.2–v0.7.0)</w:t>
+      </w:r>
+    </w:p>
+    <w:p>
+      <w:pPr>
+        <w:spacing w:after="60"/>
+        <w:ind w:left="360"/>
+      </w:pPr>
+      <w:r>
+        <w:rPr>
+          <w:rFonts w:ascii="Arial" w:cs="Arial" w:eastAsia="Arial" w:hAnsi="Arial"/>
+          <w:sz w:val="21"/>
+          <w:szCs w:val="21"/>
+        </w:rPr>
+        <w:t xml:space="preserve">✅ </w:t>
+      </w:r>
+      <w:r>
+        <w:rPr>
+          <w:rFonts w:ascii="Arial" w:cs="Arial" w:eastAsia="Arial" w:hAnsi="Arial"/>
+          <w:strike/>
+          <w:color w:val="888888"/>
+          <w:sz w:val="21"/>
+          <w:szCs w:val="21"/>
+        </w:rPr>
+        <w:t xml:space="preserve">Recurring sessions — weekly/biweekly repeating care bookings (v0.7.0)</w:t>
       </w:r>
     </w:p>
     <w:p>
@@ -6437,91 +6506,6 @@
                 <w:szCs w:val="20"/>
               </w:rPr>
               <w:t xml:space="preserve">Effort</w:t>
-            </w:r>
-          </w:p>
-        </w:tc>
-      </w:tr>
-      <w:tr>
-        <w:tc>
-          <w:tcPr>
-            <w:tcW w:type="dxa" w:w="2200"/>
-            <w:tcBorders>
-              <w:top w:val="single" w:color="CCCCCC" w:sz="1"/>
-              <w:left w:val="single" w:color="CCCCCC" w:sz="1"/>
-              <w:bottom w:val="single" w:color="CCCCCC" w:sz="1"/>
-              <w:right w:val="single" w:color="CCCCCC" w:sz="1"/>
-            </w:tcBorders>
-            <w:tcMar>
-              <w:top w:type="dxa" w:w="60"/>
-              <w:left w:type="dxa" w:w="100"/>
-              <w:bottom w:type="dxa" w:w="60"/>
-              <w:right w:type="dxa" w:w="100"/>
-            </w:tcMar>
-          </w:tcPr>
-          <w:p>
-            <w:r>
-              <w:rPr>
-                <w:rFonts w:ascii="Arial" w:cs="Arial" w:eastAsia="Arial" w:hAnsi="Arial"/>
-                <w:b/>
-                <w:bCs/>
-                <w:sz w:val="20"/>
-                <w:szCs w:val="20"/>
-              </w:rPr>
-              <w:t xml:space="preserve">Recurring Sessions</w:t>
-            </w:r>
-          </w:p>
-        </w:tc>
-        <w:tc>
-          <w:tcPr>
-            <w:tcW w:type="dxa" w:w="5760"/>
-            <w:tcBorders>
-              <w:top w:val="single" w:color="CCCCCC" w:sz="1"/>
-              <w:left w:val="single" w:color="CCCCCC" w:sz="1"/>
-              <w:bottom w:val="single" w:color="CCCCCC" w:sz="1"/>
-              <w:right w:val="single" w:color="CCCCCC" w:sz="1"/>
-            </w:tcBorders>
-            <w:tcMar>
-              <w:top w:type="dxa" w:w="60"/>
-              <w:left w:type="dxa" w:w="100"/>
-              <w:bottom w:type="dxa" w:w="60"/>
-              <w:right w:type="dxa" w:w="100"/>
-            </w:tcMar>
-          </w:tcPr>
-          <w:p>
-            <w:r>
-              <w:rPr>
-                <w:rFonts w:ascii="Arial" w:cs="Arial" w:eastAsia="Arial" w:hAnsi="Arial"/>
-                <w:sz w:val="20"/>
-                <w:szCs w:val="20"/>
-              </w:rPr>
-              <w:t xml:space="preserve">Weekly/biweekly repeating care sessions. Auto-generate future sessions from a recurring template.</w:t>
-            </w:r>
-          </w:p>
-        </w:tc>
-        <w:tc>
-          <w:tcPr>
-            <w:tcW w:type="dxa" w:w="1400"/>
-            <w:tcBorders>
-              <w:top w:val="single" w:color="CCCCCC" w:sz="1"/>
-              <w:left w:val="single" w:color="CCCCCC" w:sz="1"/>
-              <w:bottom w:val="single" w:color="CCCCCC" w:sz="1"/>
-              <w:right w:val="single" w:color="CCCCCC" w:sz="1"/>
-            </w:tcBorders>
-            <w:tcMar>
-              <w:top w:type="dxa" w:w="60"/>
-              <w:left w:type="dxa" w:w="100"/>
-              <w:bottom w:type="dxa" w:w="60"/>
-              <w:right w:type="dxa" w:w="100"/>
-            </w:tcMar>
-          </w:tcPr>
-          <w:p>
-            <w:r>
-              <w:rPr>
-                <w:rFonts w:ascii="Arial" w:cs="Arial" w:eastAsia="Arial" w:hAnsi="Arial"/>
-                <w:sz w:val="20"/>
-                <w:szCs w:val="20"/>
-              </w:rPr>
-              <w:t xml:space="preserve">Medium</w:t>
             </w:r>
           </w:p>
         </w:tc>
@@ -7644,7 +7628,7 @@
         <w:sz w:val="18"/>
         <w:szCs w:val="18"/>
       </w:rPr>
-      <w:t xml:space="preserve">Development Roadmap  •  v0.6.2</w:t>
+      <w:t xml:space="preserve">Development Roadmap  •  v0.7.0</w:t>
     </w:r>
   </w:p>
 </w:hdr>

</xml_diff>

<commit_message>
Update roadmap.docx with v0.7.1 messages redesign
Co-Authored-By: Claude Opus 4.6 <noreply@anthropic.com>
</commit_message>
<xml_diff>
--- a/InPlace_App_Roadmap.docx
+++ b/InPlace_App_Roadmap.docx
@@ -72,7 +72,7 @@
           <w:sz w:val="20"/>
           <w:szCs w:val="20"/>
         </w:rPr>
-        <w:t xml:space="preserve">Last updated: February 17, 2026  •  Current version: v0.7.0  •  18 releases in 3 days</w:t>
+        <w:t xml:space="preserve">Last updated: February 17, 2026  •  Current version: v0.7.1  •  19 releases in 3 days</w:t>
       </w:r>
     </w:p>
     <w:p>
@@ -226,7 +226,7 @@
                 <w:sz w:val="20"/>
                 <w:szCs w:val="20"/>
               </w:rPr>
-              <w:t xml:space="preserve">18 (v0.1.0 – v0.7.0)</w:t>
+              <w:t xml:space="preserve">19 (v0.1.0 – v0.7.1)</w:t>
             </w:r>
           </w:p>
         </w:tc>
@@ -5495,6 +5495,51 @@
       </w:r>
     </w:p>
     <w:p>
+      <w:pPr>
+        <w:pStyle w:val="Heading2"/>
+        <w:pBdr>
+          <w:bottom w:val="single" w:color="DDDDDD" w:sz="1" w:space="4"/>
+        </w:pBdr>
+        <w:spacing w:before="280" w:after="100"/>
+      </w:pPr>
+      <w:r>
+        <w:rPr>
+          <w:rFonts w:ascii="Arial" w:cs="Arial" w:eastAsia="Arial" w:hAnsi="Arial"/>
+          <w:b/>
+          <w:bCs/>
+          <w:color w:val="1b6b5a"/>
+          <w:sz w:val="26"/>
+          <w:szCs w:val="26"/>
+        </w:rPr>
+        <w:t xml:space="preserve">v0.7.1 — Messages Redesign &amp; Mobile Polish</w:t>
+      </w:r>
+      <w:r>
+        <w:rPr>
+          <w:rFonts w:ascii="Arial" w:cs="Arial" w:eastAsia="Arial" w:hAnsi="Arial"/>
+          <w:color w:val="888888"/>
+          <w:sz w:val="20"/>
+          <w:szCs w:val="20"/>
+        </w:rPr>
+        <w:t xml:space="preserve">  Feb 17</w:t>
+      </w:r>
+    </w:p>
+    <w:p>
+      <w:pPr>
+        <w:spacing w:after="120"/>
+      </w:pPr>
+      <w:r>
+        <w:rPr>
+          <w:rFonts w:ascii="Arial" w:cs="Arial" w:eastAsia="Arial" w:hAnsi="Arial"/>
+          <w:i w:val="false"/>
+          <w:iCs w:val="false"/>
+          <w:color w:val="333333"/>
+          <w:sz w:val="21"/>
+          <w:szCs w:val="21"/>
+        </w:rPr>
+        <w:t xml:space="preserve">Complete Messages rewrite: iMessage/WhatsApp-style UI with conversation list showing avatars, previews, and unread badges. Tap to open chat with back button. Mobile-first layout shows one panel at a time. New Message button (+) to start conversations with any user via /api/messages/contacts endpoint. Fixed For Caregivers splash section (responsive grid, warmer caregiver photo). Photo strip, personal story, and hero section all responsive on mobile. PWA Install App button in splash nav with iOS-specific Share instructions.</w:t>
+      </w:r>
+    </w:p>
+    <w:p>
       <w:r>
         <w:br w:type="page"/>
       </w:r>
@@ -5678,7 +5723,7 @@
           <w:sz w:val="21"/>
           <w:szCs w:val="21"/>
         </w:rPr>
-        <w:t xml:space="preserve">Email verification — verify new accounts (v0.7.0)</w:t>
+        <w:t xml:space="preserve">Email verification — verify new accounts (v0.7.1)</w:t>
       </w:r>
     </w:p>
     <w:p>
@@ -5702,7 +5747,7 @@
           <w:sz w:val="21"/>
           <w:szCs w:val="21"/>
         </w:rPr>
-        <w:t xml:space="preserve">Test suite — 53 tests covering auth, API, middleware, session validation (v0.6.2–v0.7.0)</w:t>
+        <w:t xml:space="preserve">Test suite — 53 tests covering auth, API, middleware, session validation (v0.6.2–v0.7.1)</w:t>
       </w:r>
     </w:p>
     <w:p>
@@ -7628,7 +7673,7 @@
         <w:sz w:val="18"/>
         <w:szCs w:val="18"/>
       </w:rPr>
-      <w:t xml:space="preserve">Development Roadmap  •  v0.7.0</w:t>
+      <w:t xml:space="preserve">Development Roadmap  •  v0.7.1</w:t>
     </w:r>
   </w:p>
 </w:hdr>

</xml_diff>

<commit_message>
docs: update TASKS.md, ROADMAP.md, and roadmap docx for v0.8.0
Co-Authored-By: Claude Opus 4.6 <noreply@anthropic.com>
</commit_message>
<xml_diff>
--- a/InPlace_App_Roadmap.docx
+++ b/InPlace_App_Roadmap.docx
@@ -72,7 +72,7 @@
           <w:sz w:val="20"/>
           <w:szCs w:val="20"/>
         </w:rPr>
-        <w:t xml:space="preserve">Last updated: February 17, 2026  •  Current version: v0.7.1  •  19 releases in 3 days</w:t>
+        <w:t xml:space="preserve">Last updated: February 17, 2026  •  Current version: v0.8.0  •  21 releases in 3 days</w:t>
       </w:r>
     </w:p>
     <w:p>
@@ -226,7 +226,7 @@
                 <w:sz w:val="20"/>
                 <w:szCs w:val="20"/>
               </w:rPr>
-              <w:t xml:space="preserve">19 (v0.1.0 – v0.7.1)</w:t>
+              <w:t xml:space="preserve">21 (v0.1.0 – v0.8.0)</w:t>
             </w:r>
           </w:p>
         </w:tc>
@@ -282,7 +282,7 @@
                 <w:sz w:val="20"/>
                 <w:szCs w:val="20"/>
               </w:rPr>
-              <w:t xml:space="preserve">11 route files, 30+ endpoints</w:t>
+              <w:t xml:space="preserve">13 route files, 35+ endpoints</w:t>
             </w:r>
           </w:p>
         </w:tc>
@@ -338,7 +338,7 @@
                 <w:sz w:val="20"/>
                 <w:szCs w:val="20"/>
               </w:rPr>
-              <w:t xml:space="preserve">20 React components (modular, zero-build-step)</w:t>
+              <w:t xml:space="preserve">21 React components (modular, zero-build-step)</w:t>
             </w:r>
           </w:p>
         </w:tc>
@@ -394,7 +394,7 @@
                 <w:sz w:val="20"/>
                 <w:szCs w:val="20"/>
               </w:rPr>
-              <w:t xml:space="preserve">16 (PostgreSQL)</w:t>
+              <w:t xml:space="preserve">18 (PostgreSQL)</w:t>
             </w:r>
           </w:p>
         </w:tc>
@@ -2852,6 +2852,172 @@
           </w:p>
         </w:tc>
       </w:tr>
+      <w:tr>
+        <w:tc>
+          <w:tcPr>
+            <w:tcW w:type="dxa" w:w="2800"/>
+            <w:tcBorders>
+              <w:top w:val="single" w:color="CCCCCC" w:sz="1"/>
+              <w:left w:val="single" w:color="CCCCCC" w:sz="1"/>
+              <w:bottom w:val="single" w:color="CCCCCC" w:sz="1"/>
+              <w:right w:val="single" w:color="CCCCCC" w:sz="1"/>
+            </w:tcBorders>
+            <w:tcMar>
+              <w:top w:type="dxa" w:w="60"/>
+              <w:left w:type="dxa" w:w="100"/>
+              <w:bottom w:type="dxa" w:w="60"/>
+              <w:right w:type="dxa" w:w="100"/>
+            </w:tcMar>
+          </w:tcPr>
+          <w:p>
+            <w:r>
+              <w:rPr>
+                <w:rFonts w:ascii="Arial" w:cs="Arial" w:eastAsia="Arial" w:hAnsi="Arial"/>
+                <w:sz w:val="20"/>
+                <w:szCs w:val="20"/>
+              </w:rPr>
+              <w:t xml:space="preserve">push_subscriptions</w:t>
+            </w:r>
+          </w:p>
+        </w:tc>
+        <w:tc>
+          <w:tcPr>
+            <w:tcW w:type="dxa" w:w="3200"/>
+            <w:tcBorders>
+              <w:top w:val="single" w:color="CCCCCC" w:sz="1"/>
+              <w:left w:val="single" w:color="CCCCCC" w:sz="1"/>
+              <w:bottom w:val="single" w:color="CCCCCC" w:sz="1"/>
+              <w:right w:val="single" w:color="CCCCCC" w:sz="1"/>
+            </w:tcBorders>
+            <w:tcMar>
+              <w:top w:type="dxa" w:w="60"/>
+              <w:left w:type="dxa" w:w="100"/>
+              <w:bottom w:type="dxa" w:w="60"/>
+              <w:right w:type="dxa" w:w="100"/>
+            </w:tcMar>
+          </w:tcPr>
+          <w:p>
+            <w:r>
+              <w:rPr>
+                <w:rFonts w:ascii="Arial" w:cs="Arial" w:eastAsia="Arial" w:hAnsi="Arial"/>
+                <w:sz w:val="20"/>
+                <w:szCs w:val="20"/>
+              </w:rPr>
+              <w:t xml:space="preserve">Web push notification endpoints</w:t>
+            </w:r>
+          </w:p>
+        </w:tc>
+        <w:tc>
+          <w:tcPr>
+            <w:tcW w:type="dxa" w:w="3360"/>
+            <w:tcBorders>
+              <w:top w:val="single" w:color="CCCCCC" w:sz="1"/>
+              <w:left w:val="single" w:color="CCCCCC" w:sz="1"/>
+              <w:bottom w:val="single" w:color="CCCCCC" w:sz="1"/>
+              <w:right w:val="single" w:color="CCCCCC" w:sz="1"/>
+            </w:tcBorders>
+            <w:tcMar>
+              <w:top w:type="dxa" w:w="60"/>
+              <w:left w:type="dxa" w:w="100"/>
+              <w:bottom w:type="dxa" w:w="60"/>
+              <w:right w:type="dxa" w:w="100"/>
+            </w:tcMar>
+          </w:tcPr>
+          <w:p>
+            <w:r>
+              <w:rPr>
+                <w:rFonts w:ascii="Arial" w:cs="Arial" w:eastAsia="Arial" w:hAnsi="Arial"/>
+                <w:sz w:val="20"/>
+                <w:szCs w:val="20"/>
+              </w:rPr>
+              <w:t xml:space="preserve">user_id, endpoint, subscription_json</w:t>
+            </w:r>
+          </w:p>
+        </w:tc>
+      </w:tr>
+      <w:tr>
+        <w:tc>
+          <w:tcPr>
+            <w:tcW w:type="dxa" w:w="2800"/>
+            <w:tcBorders>
+              <w:top w:val="single" w:color="CCCCCC" w:sz="1"/>
+              <w:left w:val="single" w:color="CCCCCC" w:sz="1"/>
+              <w:bottom w:val="single" w:color="CCCCCC" w:sz="1"/>
+              <w:right w:val="single" w:color="CCCCCC" w:sz="1"/>
+            </w:tcBorders>
+            <w:tcMar>
+              <w:top w:type="dxa" w:w="60"/>
+              <w:left w:type="dxa" w:w="100"/>
+              <w:bottom w:type="dxa" w:w="60"/>
+              <w:right w:type="dxa" w:w="100"/>
+            </w:tcMar>
+          </w:tcPr>
+          <w:p>
+            <w:r>
+              <w:rPr>
+                <w:rFonts w:ascii="Arial" w:cs="Arial" w:eastAsia="Arial" w:hAnsi="Arial"/>
+                <w:sz w:val="20"/>
+                <w:szCs w:val="20"/>
+              </w:rPr>
+              <w:t xml:space="preserve">care_recipient_shares</w:t>
+            </w:r>
+          </w:p>
+        </w:tc>
+        <w:tc>
+          <w:tcPr>
+            <w:tcW w:type="dxa" w:w="3200"/>
+            <w:tcBorders>
+              <w:top w:val="single" w:color="CCCCCC" w:sz="1"/>
+              <w:left w:val="single" w:color="CCCCCC" w:sz="1"/>
+              <w:bottom w:val="single" w:color="CCCCCC" w:sz="1"/>
+              <w:right w:val="single" w:color="CCCCCC" w:sz="1"/>
+            </w:tcBorders>
+            <w:tcMar>
+              <w:top w:type="dxa" w:w="60"/>
+              <w:left w:type="dxa" w:w="100"/>
+              <w:bottom w:type="dxa" w:w="60"/>
+              <w:right w:type="dxa" w:w="100"/>
+            </w:tcMar>
+          </w:tcPr>
+          <w:p>
+            <w:r>
+              <w:rPr>
+                <w:rFonts w:ascii="Arial" w:cs="Arial" w:eastAsia="Arial" w:hAnsi="Arial"/>
+                <w:sz w:val="20"/>
+                <w:szCs w:val="20"/>
+              </w:rPr>
+              <w:t xml:space="preserve">Shared care recipient access</w:t>
+            </w:r>
+          </w:p>
+        </w:tc>
+        <w:tc>
+          <w:tcPr>
+            <w:tcW w:type="dxa" w:w="3360"/>
+            <w:tcBorders>
+              <w:top w:val="single" w:color="CCCCCC" w:sz="1"/>
+              <w:left w:val="single" w:color="CCCCCC" w:sz="1"/>
+              <w:bottom w:val="single" w:color="CCCCCC" w:sz="1"/>
+              <w:right w:val="single" w:color="CCCCCC" w:sz="1"/>
+            </w:tcBorders>
+            <w:tcMar>
+              <w:top w:type="dxa" w:w="60"/>
+              <w:left w:type="dxa" w:w="100"/>
+              <w:bottom w:type="dxa" w:w="60"/>
+              <w:right w:type="dxa" w:w="100"/>
+            </w:tcMar>
+          </w:tcPr>
+          <w:p>
+            <w:r>
+              <w:rPr>
+                <w:rFonts w:ascii="Arial" w:cs="Arial" w:eastAsia="Arial" w:hAnsi="Arial"/>
+                <w:sz w:val="20"/>
+                <w:szCs w:val="20"/>
+              </w:rPr>
+              <w:t xml:space="preserve">care_recipient_id, shared_with_user_id, permission</w:t>
+            </w:r>
+          </w:p>
+        </w:tc>
+      </w:tr>
     </w:tbl>
     <w:p>
       <w:pPr>
@@ -3844,6 +4010,172 @@
                 <w:sz w:val="20"/>
                 <w:szCs w:val="20"/>
               </w:rPr>
+              <w:t xml:space="preserve">Analytics</w:t>
+            </w:r>
+          </w:p>
+        </w:tc>
+        <w:tc>
+          <w:tcPr>
+            <w:tcW w:type="dxa" w:w="4960"/>
+            <w:tcBorders>
+              <w:top w:val="single" w:color="CCCCCC" w:sz="1"/>
+              <w:left w:val="single" w:color="CCCCCC" w:sz="1"/>
+              <w:bottom w:val="single" w:color="CCCCCC" w:sz="1"/>
+              <w:right w:val="single" w:color="CCCCCC" w:sz="1"/>
+            </w:tcBorders>
+            <w:tcMar>
+              <w:top w:type="dxa" w:w="60"/>
+              <w:left w:type="dxa" w:w="100"/>
+              <w:bottom w:type="dxa" w:w="60"/>
+              <w:right w:type="dxa" w:w="100"/>
+            </w:tcMar>
+          </w:tcPr>
+          <w:p>
+            <w:r>
+              <w:rPr>
+                <w:rFonts w:ascii="Arial" w:cs="Arial" w:eastAsia="Arial" w:hAnsi="Arial"/>
+                <w:sz w:val="20"/>
+                <w:szCs w:val="20"/>
+              </w:rPr>
+              <w:t xml:space="preserve">GET / (monthly trends, service breakdown, caregiver stats)</w:t>
+            </w:r>
+          </w:p>
+        </w:tc>
+        <w:tc>
+          <w:tcPr>
+            <w:tcW w:type="dxa" w:w="1800"/>
+            <w:tcBorders>
+              <w:top w:val="single" w:color="CCCCCC" w:sz="1"/>
+              <w:left w:val="single" w:color="CCCCCC" w:sz="1"/>
+              <w:bottom w:val="single" w:color="CCCCCC" w:sz="1"/>
+              <w:right w:val="single" w:color="CCCCCC" w:sz="1"/>
+            </w:tcBorders>
+            <w:tcMar>
+              <w:top w:type="dxa" w:w="60"/>
+              <w:left w:type="dxa" w:w="100"/>
+              <w:bottom w:type="dxa" w:w="60"/>
+              <w:right w:type="dxa" w:w="100"/>
+            </w:tcMar>
+          </w:tcPr>
+          <w:p>
+            <w:r>
+              <w:rPr>
+                <w:rFonts w:ascii="Arial" w:cs="Arial" w:eastAsia="Arial" w:hAnsi="Arial"/>
+                <w:sz w:val="20"/>
+                <w:szCs w:val="20"/>
+              </w:rPr>
+              <w:t xml:space="preserve">JWT</w:t>
+            </w:r>
+          </w:p>
+        </w:tc>
+      </w:tr>
+      <w:tr>
+        <w:tc>
+          <w:tcPr>
+            <w:tcW w:type="dxa" w:w="2600"/>
+            <w:tcBorders>
+              <w:top w:val="single" w:color="CCCCCC" w:sz="1"/>
+              <w:left w:val="single" w:color="CCCCCC" w:sz="1"/>
+              <w:bottom w:val="single" w:color="CCCCCC" w:sz="1"/>
+              <w:right w:val="single" w:color="CCCCCC" w:sz="1"/>
+            </w:tcBorders>
+            <w:tcMar>
+              <w:top w:type="dxa" w:w="60"/>
+              <w:left w:type="dxa" w:w="100"/>
+              <w:bottom w:type="dxa" w:w="60"/>
+              <w:right w:type="dxa" w:w="100"/>
+            </w:tcMar>
+          </w:tcPr>
+          <w:p>
+            <w:r>
+              <w:rPr>
+                <w:rFonts w:ascii="Arial" w:cs="Arial" w:eastAsia="Arial" w:hAnsi="Arial"/>
+                <w:sz w:val="20"/>
+                <w:szCs w:val="20"/>
+              </w:rPr>
+              <w:t xml:space="preserve">Push</w:t>
+            </w:r>
+          </w:p>
+        </w:tc>
+        <w:tc>
+          <w:tcPr>
+            <w:tcW w:type="dxa" w:w="4960"/>
+            <w:tcBorders>
+              <w:top w:val="single" w:color="CCCCCC" w:sz="1"/>
+              <w:left w:val="single" w:color="CCCCCC" w:sz="1"/>
+              <w:bottom w:val="single" w:color="CCCCCC" w:sz="1"/>
+              <w:right w:val="single" w:color="CCCCCC" w:sz="1"/>
+            </w:tcBorders>
+            <w:tcMar>
+              <w:top w:type="dxa" w:w="60"/>
+              <w:left w:type="dxa" w:w="100"/>
+              <w:bottom w:type="dxa" w:w="60"/>
+              <w:right w:type="dxa" w:w="100"/>
+            </w:tcMar>
+          </w:tcPr>
+          <w:p>
+            <w:r>
+              <w:rPr>
+                <w:rFonts w:ascii="Arial" w:cs="Arial" w:eastAsia="Arial" w:hAnsi="Arial"/>
+                <w:sz w:val="20"/>
+                <w:szCs w:val="20"/>
+              </w:rPr>
+              <w:t xml:space="preserve">GET /vapid-key, POST /subscribe, DELETE /unsubscribe</w:t>
+            </w:r>
+          </w:p>
+        </w:tc>
+        <w:tc>
+          <w:tcPr>
+            <w:tcW w:type="dxa" w:w="1800"/>
+            <w:tcBorders>
+              <w:top w:val="single" w:color="CCCCCC" w:sz="1"/>
+              <w:left w:val="single" w:color="CCCCCC" w:sz="1"/>
+              <w:bottom w:val="single" w:color="CCCCCC" w:sz="1"/>
+              <w:right w:val="single" w:color="CCCCCC" w:sz="1"/>
+            </w:tcBorders>
+            <w:tcMar>
+              <w:top w:type="dxa" w:w="60"/>
+              <w:left w:type="dxa" w:w="100"/>
+              <w:bottom w:type="dxa" w:w="60"/>
+              <w:right w:type="dxa" w:w="100"/>
+            </w:tcMar>
+          </w:tcPr>
+          <w:p>
+            <w:r>
+              <w:rPr>
+                <w:rFonts w:ascii="Arial" w:cs="Arial" w:eastAsia="Arial" w:hAnsi="Arial"/>
+                <w:sz w:val="20"/>
+                <w:szCs w:val="20"/>
+              </w:rPr>
+              <w:t xml:space="preserve">Mixed</w:t>
+            </w:r>
+          </w:p>
+        </w:tc>
+      </w:tr>
+      <w:tr>
+        <w:tc>
+          <w:tcPr>
+            <w:tcW w:type="dxa" w:w="2600"/>
+            <w:tcBorders>
+              <w:top w:val="single" w:color="CCCCCC" w:sz="1"/>
+              <w:left w:val="single" w:color="CCCCCC" w:sz="1"/>
+              <w:bottom w:val="single" w:color="CCCCCC" w:sz="1"/>
+              <w:right w:val="single" w:color="CCCCCC" w:sz="1"/>
+            </w:tcBorders>
+            <w:tcMar>
+              <w:top w:type="dxa" w:w="60"/>
+              <w:left w:type="dxa" w:w="100"/>
+              <w:bottom w:type="dxa" w:w="60"/>
+              <w:right w:type="dxa" w:w="100"/>
+            </w:tcMar>
+          </w:tcPr>
+          <w:p>
+            <w:r>
+              <w:rPr>
+                <w:rFonts w:ascii="Arial" w:cs="Arial" w:eastAsia="Arial" w:hAnsi="Arial"/>
+                <w:sz w:val="20"/>
+                <w:szCs w:val="20"/>
+              </w:rPr>
               <w:t xml:space="preserve">Password Reset</w:t>
             </w:r>
           </w:p>
@@ -4022,7 +4354,7 @@
           <w:sz w:val="21"/>
           <w:szCs w:val="21"/>
         </w:rPr>
-        <w:t xml:space="preserve">The frontend uses Babel standalone for in-browser JSX transpilation with zero build step. All 20 component files are fetched in parallel, concatenated in dependency order, and compiled once on page load. Each component uses the window assignment pattern for scope sharing.</w:t>
+        <w:t xml:space="preserve">The frontend uses Babel standalone for in-browser JSX transpilation with zero build step. All 21 component files are fetched in parallel, concatenated in dependency order, and compiled once on page load. Each component uses the window assignment pattern for scope sharing.</w:t>
       </w:r>
     </w:p>
     <w:p>
@@ -5540,6 +5872,96 @@
       </w:r>
     </w:p>
     <w:p>
+      <w:pPr>
+        <w:pStyle w:val="Heading2"/>
+        <w:pBdr>
+          <w:bottom w:val="single" w:color="DDDDDD" w:sz="1" w:space="4"/>
+        </w:pBdr>
+        <w:spacing w:before="280" w:after="100"/>
+      </w:pPr>
+      <w:r>
+        <w:rPr>
+          <w:rFonts w:ascii="Arial" w:cs="Arial" w:eastAsia="Arial" w:hAnsi="Arial"/>
+          <w:b/>
+          <w:bCs/>
+          <w:color w:val="1b6b5a"/>
+          <w:sz w:val="26"/>
+          <w:szCs w:val="26"/>
+        </w:rPr>
+        <w:t xml:space="preserve">v0.7.2 — PWA Android Fix &amp; Email Domain</w:t>
+      </w:r>
+      <w:r>
+        <w:rPr>
+          <w:rFonts w:ascii="Arial" w:cs="Arial" w:eastAsia="Arial" w:hAnsi="Arial"/>
+          <w:color w:val="888888"/>
+          <w:sz w:val="20"/>
+          <w:szCs w:val="20"/>
+        </w:rPr>
+        <w:t xml:space="preserve">  Feb 17</w:t>
+      </w:r>
+    </w:p>
+    <w:p>
+      <w:pPr>
+        <w:spacing w:after="120"/>
+      </w:pPr>
+      <w:r>
+        <w:rPr>
+          <w:rFonts w:ascii="Arial" w:cs="Arial" w:eastAsia="Arial" w:hAnsi="Arial"/>
+          <w:i w:val="false"/>
+          <w:iCs w:val="false"/>
+          <w:color w:val="333333"/>
+          <w:sz w:val="21"/>
+          <w:szCs w:val="21"/>
+        </w:rPr>
+        <w:t xml:space="preserve">Fixed PWA not appearing on Android home screen after install. Split manifest icon purpose “any maskable” into separate entries (Chrome requires distinct icons). Created dedicated maskable icons (full-bleed, no rounded corners) for Android’s adaptive icon system. Added id field to manifest for stable PWA identity. Resend domain verification: DKIM + SPF DNS records added in Cloudflare, domain verified. Production email now sends from noreply@yourinplace.com (was sandbox-only onboarding@resend.dev). FROM_EMAIL env var set on Railway.</w:t>
+      </w:r>
+    </w:p>
+    <w:p>
+      <w:pPr>
+        <w:pStyle w:val="Heading2"/>
+        <w:pBdr>
+          <w:bottom w:val="single" w:color="DDDDDD" w:sz="1" w:space="4"/>
+        </w:pBdr>
+        <w:spacing w:before="280" w:after="100"/>
+      </w:pPr>
+      <w:r>
+        <w:rPr>
+          <w:rFonts w:ascii="Arial" w:cs="Arial" w:eastAsia="Arial" w:hAnsi="Arial"/>
+          <w:b/>
+          <w:bCs/>
+          <w:color w:val="1b6b5a"/>
+          <w:sz w:val="26"/>
+          <w:szCs w:val="26"/>
+        </w:rPr>
+        <w:t xml:space="preserve">v0.8.0 — Analytics, Push Notifications &amp; Shared Care Recipients</w:t>
+      </w:r>
+      <w:r>
+        <w:rPr>
+          <w:rFonts w:ascii="Arial" w:cs="Arial" w:eastAsia="Arial" w:hAnsi="Arial"/>
+          <w:color w:val="888888"/>
+          <w:sz w:val="20"/>
+          <w:szCs w:val="20"/>
+        </w:rPr>
+        <w:t xml:space="preserve">  Feb 17</w:t>
+      </w:r>
+    </w:p>
+    <w:p>
+      <w:pPr>
+        <w:spacing w:after="120"/>
+      </w:pPr>
+      <w:r>
+        <w:rPr>
+          <w:rFonts w:ascii="Arial" w:cs="Arial" w:eastAsia="Arial" w:hAnsi="Arial"/>
+          <w:i w:val="false"/>
+          <w:iCs w:val="false"/>
+          <w:color w:val="333333"/>
+          <w:sz w:val="21"/>
+          <w:szCs w:val="21"/>
+        </w:rPr>
+        <w:t xml:space="preserve">Family Dashboard Analytics: new /api/analytics endpoint with 6-month historical data (sessions, hours, spend per month), service type breakdown, and caregiver utilization stats. Frontend Analytics page with SVG bar charts, donut chart, caregiver utilization bars, and summary stat cards. Push Notifications: web-push VAPID keys, push_subscriptions table, subscribe/unsubscribe API. Service worker push + notificationclick handlers. Push triggered on new messages with sender name and preview. Shared Care Recipients: care_recipient_shares table with owner/edit/view permissions. Share/unshare API endpoints. Dashboard includes shared recipients. Betty shared with David &amp; Susan siblings.</w:t>
+      </w:r>
+    </w:p>
+    <w:p>
       <w:r>
         <w:br w:type="page"/>
       </w:r>
@@ -5785,17 +6207,113 @@
           <w:sz w:val="21"/>
           <w:szCs w:val="21"/>
         </w:rPr>
-        <w:t xml:space="preserve">⬜ </w:t>
-      </w:r>
-      <w:r>
-        <w:rPr>
-          <w:rFonts w:ascii="Arial" w:cs="Arial" w:eastAsia="Arial" w:hAnsi="Arial"/>
-          <w:strike w:val="false"/>
-          <w:color w:val="333333"/>
+        <w:t xml:space="preserve">✅ </w:t>
+      </w:r>
+      <w:r>
+        <w:rPr>
+          <w:rFonts w:ascii="Arial" w:cs="Arial" w:eastAsia="Arial" w:hAnsi="Arial"/>
+          <w:strike/>
+          <w:color w:val="888888"/>
           <w:sz w:val="21"/>
           <w:szCs w:val="21"/>
         </w:rPr>
-        <w:t xml:space="preserve">Resend domain verification — verify yourinplace.com so emails deliver to all users (config step)</w:t>
+        <w:t xml:space="preserve">Resend domain verification — verified yourinplace.com, emails deliver to all users (v0.7.2)</w:t>
+      </w:r>
+    </w:p>
+    <w:p>
+      <w:pPr>
+        <w:spacing w:after="60"/>
+        <w:ind w:left="360"/>
+      </w:pPr>
+      <w:r>
+        <w:rPr>
+          <w:rFonts w:ascii="Arial" w:cs="Arial" w:eastAsia="Arial" w:hAnsi="Arial"/>
+          <w:sz w:val="21"/>
+          <w:szCs w:val="21"/>
+        </w:rPr>
+        <w:t xml:space="preserve">✅ </w:t>
+      </w:r>
+      <w:r>
+        <w:rPr>
+          <w:rFonts w:ascii="Arial" w:cs="Arial" w:eastAsia="Arial" w:hAnsi="Arial"/>
+          <w:strike/>
+          <w:color w:val="888888"/>
+          <w:sz w:val="21"/>
+          <w:szCs w:val="21"/>
+        </w:rPr>
+        <w:t xml:space="preserve">PWA Android installability — maskable icons, manifest id, separate icon entries (v0.7.2)</w:t>
+      </w:r>
+    </w:p>
+    <w:p>
+      <w:pPr>
+        <w:spacing w:after="60"/>
+        <w:ind w:left="360"/>
+      </w:pPr>
+      <w:r>
+        <w:rPr>
+          <w:rFonts w:ascii="Arial" w:cs="Arial" w:eastAsia="Arial" w:hAnsi="Arial"/>
+          <w:sz w:val="21"/>
+          <w:szCs w:val="21"/>
+        </w:rPr>
+        <w:t xml:space="preserve">✅ </w:t>
+      </w:r>
+      <w:r>
+        <w:rPr>
+          <w:rFonts w:ascii="Arial" w:cs="Arial" w:eastAsia="Arial" w:hAnsi="Arial"/>
+          <w:strike/>
+          <w:color w:val="888888"/>
+          <w:sz w:val="21"/>
+          <w:szCs w:val="21"/>
+        </w:rPr>
+        <w:t xml:space="preserve">Family Dashboard Analytics — SVG charts for hours, spend, sessions, service breakdown, caregiver utilization (v0.8.0)</w:t>
+      </w:r>
+    </w:p>
+    <w:p>
+      <w:pPr>
+        <w:spacing w:after="60"/>
+        <w:ind w:left="360"/>
+      </w:pPr>
+      <w:r>
+        <w:rPr>
+          <w:rFonts w:ascii="Arial" w:cs="Arial" w:eastAsia="Arial" w:hAnsi="Arial"/>
+          <w:sz w:val="21"/>
+          <w:szCs w:val="21"/>
+        </w:rPr>
+        <w:t xml:space="preserve">✅ </w:t>
+      </w:r>
+      <w:r>
+        <w:rPr>
+          <w:rFonts w:ascii="Arial" w:cs="Arial" w:eastAsia="Arial" w:hAnsi="Arial"/>
+          <w:strike/>
+          <w:color w:val="888888"/>
+          <w:sz w:val="21"/>
+          <w:szCs w:val="21"/>
+        </w:rPr>
+        <w:t xml:space="preserve">Push Notifications — web-push VAPID, service worker push events, triggered on new messages (v0.8.0)</w:t>
+      </w:r>
+    </w:p>
+    <w:p>
+      <w:pPr>
+        <w:spacing w:after="60"/>
+        <w:ind w:left="360"/>
+      </w:pPr>
+      <w:r>
+        <w:rPr>
+          <w:rFonts w:ascii="Arial" w:cs="Arial" w:eastAsia="Arial" w:hAnsi="Arial"/>
+          <w:sz w:val="21"/>
+          <w:szCs w:val="21"/>
+        </w:rPr>
+        <w:t xml:space="preserve">✅ </w:t>
+      </w:r>
+      <w:r>
+        <w:rPr>
+          <w:rFonts w:ascii="Arial" w:cs="Arial" w:eastAsia="Arial" w:hAnsi="Arial"/>
+          <w:strike/>
+          <w:color w:val="888888"/>
+          <w:sz w:val="21"/>
+          <w:szCs w:val="21"/>
+        </w:rPr>
+        <w:t xml:space="preserve">Shared Care Recipients — owner/edit/view permissions, siblings share Betty’s record (v0.8.0)</w:t>
       </w:r>
     </w:p>
     <w:p>
@@ -6125,7 +6643,7 @@
                 <w:sz w:val="20"/>
                 <w:szCs w:val="20"/>
               </w:rPr>
-              <w:t xml:space="preserve">Verify yourinplace.com in Resend dashboard, set FROM_EMAIL env var. Emails currently only deliver to account owner.</w:t>
+              <w:t xml:space="preserve">Verified yourinplace.com in Resend. DKIM + SPF DNS records in Cloudflare. FROM_EMAIL set on Railway. Emails now deliver to all users.</w:t>
             </w:r>
           </w:p>
         </w:tc>
@@ -6178,11 +6696,356 @@
                 <w:rFonts w:ascii="Arial" w:cs="Arial" w:eastAsia="Arial" w:hAnsi="Arial"/>
                 <w:b/>
                 <w:bCs/>
-                <w:color w:val="e8724a"/>
-                <w:sz w:val="20"/>
-                <w:szCs w:val="20"/>
-              </w:rPr>
-              <w:t xml:space="preserve">READY</w:t>
+                <w:color w:val="1b6b5a"/>
+                <w:sz w:val="20"/>
+                <w:szCs w:val="20"/>
+              </w:rPr>
+              <w:t xml:space="preserve">✅ DONE</w:t>
+            </w:r>
+          </w:p>
+        </w:tc>
+      </w:tr>
+      <w:tr>
+        <w:tc>
+          <w:tcPr>
+            <w:tcW w:type="dxa" w:w="2200"/>
+            <w:tcBorders>
+              <w:top w:val="single" w:color="CCCCCC" w:sz="1"/>
+              <w:left w:val="single" w:color="CCCCCC" w:sz="1"/>
+              <w:bottom w:val="single" w:color="CCCCCC" w:sz="1"/>
+              <w:right w:val="single" w:color="CCCCCC" w:sz="1"/>
+            </w:tcBorders>
+            <w:tcMar>
+              <w:top w:type="dxa" w:w="60"/>
+              <w:left w:type="dxa" w:w="100"/>
+              <w:bottom w:type="dxa" w:w="60"/>
+              <w:right w:type="dxa" w:w="100"/>
+            </w:tcMar>
+          </w:tcPr>
+          <w:p>
+            <w:r>
+              <w:rPr>
+                <w:rFonts w:ascii="Arial" w:cs="Arial" w:eastAsia="Arial" w:hAnsi="Arial"/>
+                <w:b/>
+                <w:bCs/>
+                <w:sz w:val="20"/>
+                <w:szCs w:val="20"/>
+              </w:rPr>
+              <w:t xml:space="preserve">Family Dashboard Analytics</w:t>
+            </w:r>
+          </w:p>
+        </w:tc>
+        <w:tc>
+          <w:tcPr>
+            <w:tcW w:type="dxa" w:w="4360"/>
+            <w:tcBorders>
+              <w:top w:val="single" w:color="CCCCCC" w:sz="1"/>
+              <w:left w:val="single" w:color="CCCCCC" w:sz="1"/>
+              <w:bottom w:val="single" w:color="CCCCCC" w:sz="1"/>
+              <w:right w:val="single" w:color="CCCCCC" w:sz="1"/>
+            </w:tcBorders>
+            <w:tcMar>
+              <w:top w:type="dxa" w:w="60"/>
+              <w:left w:type="dxa" w:w="100"/>
+              <w:bottom w:type="dxa" w:w="60"/>
+              <w:right w:type="dxa" w:w="100"/>
+            </w:tcMar>
+          </w:tcPr>
+          <w:p>
+            <w:r>
+              <w:rPr>
+                <w:rFonts w:ascii="Arial" w:cs="Arial" w:eastAsia="Arial" w:hAnsi="Arial"/>
+                <w:sz w:val="20"/>
+                <w:szCs w:val="20"/>
+              </w:rPr>
+              <w:t xml:space="preserve">SVG bar charts (hours/spend/sessions monthly trends), donut chart for service types, caregiver utilization bars. New /api/analytics endpoint.</w:t>
+            </w:r>
+          </w:p>
+        </w:tc>
+        <w:tc>
+          <w:tcPr>
+            <w:tcW w:type="dxa" w:w="1000"/>
+            <w:tcBorders>
+              <w:top w:val="single" w:color="CCCCCC" w:sz="1"/>
+              <w:left w:val="single" w:color="CCCCCC" w:sz="1"/>
+              <w:bottom w:val="single" w:color="CCCCCC" w:sz="1"/>
+              <w:right w:val="single" w:color="CCCCCC" w:sz="1"/>
+            </w:tcBorders>
+            <w:tcMar>
+              <w:top w:type="dxa" w:w="60"/>
+              <w:left w:type="dxa" w:w="100"/>
+              <w:bottom w:type="dxa" w:w="60"/>
+              <w:right w:type="dxa" w:w="100"/>
+            </w:tcMar>
+          </w:tcPr>
+          <w:p>
+            <w:r>
+              <w:rPr>
+                <w:rFonts w:ascii="Arial" w:cs="Arial" w:eastAsia="Arial" w:hAnsi="Arial"/>
+                <w:sz w:val="20"/>
+                <w:szCs w:val="20"/>
+              </w:rPr>
+              <w:t xml:space="preserve">Small</w:t>
+            </w:r>
+          </w:p>
+        </w:tc>
+        <w:tc>
+          <w:tcPr>
+            <w:tcW w:type="dxa" w:w="1800"/>
+            <w:tcBorders>
+              <w:top w:val="single" w:color="CCCCCC" w:sz="1"/>
+              <w:left w:val="single" w:color="CCCCCC" w:sz="1"/>
+              <w:bottom w:val="single" w:color="CCCCCC" w:sz="1"/>
+              <w:right w:val="single" w:color="CCCCCC" w:sz="1"/>
+            </w:tcBorders>
+            <w:tcMar>
+              <w:top w:type="dxa" w:w="60"/>
+              <w:left w:type="dxa" w:w="100"/>
+              <w:bottom w:type="dxa" w:w="60"/>
+              <w:right w:type="dxa" w:w="100"/>
+            </w:tcMar>
+          </w:tcPr>
+          <w:p>
+            <w:r>
+              <w:rPr>
+                <w:rFonts w:ascii="Arial" w:cs="Arial" w:eastAsia="Arial" w:hAnsi="Arial"/>
+                <w:b/>
+                <w:bCs/>
+                <w:color w:val="1b6b5a"/>
+                <w:sz w:val="20"/>
+                <w:szCs w:val="20"/>
+              </w:rPr>
+              <w:t xml:space="preserve">✅ DONE</w:t>
+            </w:r>
+          </w:p>
+        </w:tc>
+      </w:tr>
+      <w:tr>
+        <w:tc>
+          <w:tcPr>
+            <w:tcW w:type="dxa" w:w="2200"/>
+            <w:tcBorders>
+              <w:top w:val="single" w:color="CCCCCC" w:sz="1"/>
+              <w:left w:val="single" w:color="CCCCCC" w:sz="1"/>
+              <w:bottom w:val="single" w:color="CCCCCC" w:sz="1"/>
+              <w:right w:val="single" w:color="CCCCCC" w:sz="1"/>
+            </w:tcBorders>
+            <w:tcMar>
+              <w:top w:type="dxa" w:w="60"/>
+              <w:left w:type="dxa" w:w="100"/>
+              <w:bottom w:type="dxa" w:w="60"/>
+              <w:right w:type="dxa" w:w="100"/>
+            </w:tcMar>
+          </w:tcPr>
+          <w:p>
+            <w:r>
+              <w:rPr>
+                <w:rFonts w:ascii="Arial" w:cs="Arial" w:eastAsia="Arial" w:hAnsi="Arial"/>
+                <w:b/>
+                <w:bCs/>
+                <w:sz w:val="20"/>
+                <w:szCs w:val="20"/>
+              </w:rPr>
+              <w:t xml:space="preserve">Push Notifications</w:t>
+            </w:r>
+          </w:p>
+        </w:tc>
+        <w:tc>
+          <w:tcPr>
+            <w:tcW w:type="dxa" w:w="4360"/>
+            <w:tcBorders>
+              <w:top w:val="single" w:color="CCCCCC" w:sz="1"/>
+              <w:left w:val="single" w:color="CCCCCC" w:sz="1"/>
+              <w:bottom w:val="single" w:color="CCCCCC" w:sz="1"/>
+              <w:right w:val="single" w:color="CCCCCC" w:sz="1"/>
+            </w:tcBorders>
+            <w:tcMar>
+              <w:top w:type="dxa" w:w="60"/>
+              <w:left w:type="dxa" w:w="100"/>
+              <w:bottom w:type="dxa" w:w="60"/>
+              <w:right w:type="dxa" w:w="100"/>
+            </w:tcMar>
+          </w:tcPr>
+          <w:p>
+            <w:r>
+              <w:rPr>
+                <w:rFonts w:ascii="Arial" w:cs="Arial" w:eastAsia="Arial" w:hAnsi="Arial"/>
+                <w:sz w:val="20"/>
+                <w:szCs w:val="20"/>
+              </w:rPr>
+              <w:t xml:space="preserve">Web push via VAPID keys + service worker. Triggered on new messages with sender name and preview. Subscribe on login.</w:t>
+            </w:r>
+          </w:p>
+        </w:tc>
+        <w:tc>
+          <w:tcPr>
+            <w:tcW w:type="dxa" w:w="1000"/>
+            <w:tcBorders>
+              <w:top w:val="single" w:color="CCCCCC" w:sz="1"/>
+              <w:left w:val="single" w:color="CCCCCC" w:sz="1"/>
+              <w:bottom w:val="single" w:color="CCCCCC" w:sz="1"/>
+              <w:right w:val="single" w:color="CCCCCC" w:sz="1"/>
+            </w:tcBorders>
+            <w:tcMar>
+              <w:top w:type="dxa" w:w="60"/>
+              <w:left w:type="dxa" w:w="100"/>
+              <w:bottom w:type="dxa" w:w="60"/>
+              <w:right w:type="dxa" w:w="100"/>
+            </w:tcMar>
+          </w:tcPr>
+          <w:p>
+            <w:r>
+              <w:rPr>
+                <w:rFonts w:ascii="Arial" w:cs="Arial" w:eastAsia="Arial" w:hAnsi="Arial"/>
+                <w:sz w:val="20"/>
+                <w:szCs w:val="20"/>
+              </w:rPr>
+              <w:t xml:space="preserve">Small</w:t>
+            </w:r>
+          </w:p>
+        </w:tc>
+        <w:tc>
+          <w:tcPr>
+            <w:tcW w:type="dxa" w:w="1800"/>
+            <w:tcBorders>
+              <w:top w:val="single" w:color="CCCCCC" w:sz="1"/>
+              <w:left w:val="single" w:color="CCCCCC" w:sz="1"/>
+              <w:bottom w:val="single" w:color="CCCCCC" w:sz="1"/>
+              <w:right w:val="single" w:color="CCCCCC" w:sz="1"/>
+            </w:tcBorders>
+            <w:tcMar>
+              <w:top w:type="dxa" w:w="60"/>
+              <w:left w:type="dxa" w:w="100"/>
+              <w:bottom w:type="dxa" w:w="60"/>
+              <w:right w:type="dxa" w:w="100"/>
+            </w:tcMar>
+          </w:tcPr>
+          <w:p>
+            <w:r>
+              <w:rPr>
+                <w:rFonts w:ascii="Arial" w:cs="Arial" w:eastAsia="Arial" w:hAnsi="Arial"/>
+                <w:b/>
+                <w:bCs/>
+                <w:color w:val="1b6b5a"/>
+                <w:sz w:val="20"/>
+                <w:szCs w:val="20"/>
+              </w:rPr>
+              <w:t xml:space="preserve">✅ DONE</w:t>
+            </w:r>
+          </w:p>
+        </w:tc>
+      </w:tr>
+      <w:tr>
+        <w:tc>
+          <w:tcPr>
+            <w:tcW w:type="dxa" w:w="2200"/>
+            <w:tcBorders>
+              <w:top w:val="single" w:color="CCCCCC" w:sz="1"/>
+              <w:left w:val="single" w:color="CCCCCC" w:sz="1"/>
+              <w:bottom w:val="single" w:color="CCCCCC" w:sz="1"/>
+              <w:right w:val="single" w:color="CCCCCC" w:sz="1"/>
+            </w:tcBorders>
+            <w:tcMar>
+              <w:top w:type="dxa" w:w="60"/>
+              <w:left w:type="dxa" w:w="100"/>
+              <w:bottom w:type="dxa" w:w="60"/>
+              <w:right w:type="dxa" w:w="100"/>
+            </w:tcMar>
+          </w:tcPr>
+          <w:p>
+            <w:r>
+              <w:rPr>
+                <w:rFonts w:ascii="Arial" w:cs="Arial" w:eastAsia="Arial" w:hAnsi="Arial"/>
+                <w:b/>
+                <w:bCs/>
+                <w:sz w:val="20"/>
+                <w:szCs w:val="20"/>
+              </w:rPr>
+              <w:t xml:space="preserve">Shared Care Recipients</w:t>
+            </w:r>
+          </w:p>
+        </w:tc>
+        <w:tc>
+          <w:tcPr>
+            <w:tcW w:type="dxa" w:w="4360"/>
+            <w:tcBorders>
+              <w:top w:val="single" w:color="CCCCCC" w:sz="1"/>
+              <w:left w:val="single" w:color="CCCCCC" w:sz="1"/>
+              <w:bottom w:val="single" w:color="CCCCCC" w:sz="1"/>
+              <w:right w:val="single" w:color="CCCCCC" w:sz="1"/>
+            </w:tcBorders>
+            <w:tcMar>
+              <w:top w:type="dxa" w:w="60"/>
+              <w:left w:type="dxa" w:w="100"/>
+              <w:bottom w:type="dxa" w:w="60"/>
+              <w:right w:type="dxa" w:w="100"/>
+            </w:tcMar>
+          </w:tcPr>
+          <w:p>
+            <w:r>
+              <w:rPr>
+                <w:rFonts w:ascii="Arial" w:cs="Arial" w:eastAsia="Arial" w:hAnsi="Arial"/>
+                <w:sz w:val="20"/>
+                <w:szCs w:val="20"/>
+              </w:rPr>
+              <w:t xml:space="preserve">Siblings share care_recipient records with owner/edit/view permissions. Share/unshare API. Betty shared with David &amp; Susan.</w:t>
+            </w:r>
+          </w:p>
+        </w:tc>
+        <w:tc>
+          <w:tcPr>
+            <w:tcW w:type="dxa" w:w="1000"/>
+            <w:tcBorders>
+              <w:top w:val="single" w:color="CCCCCC" w:sz="1"/>
+              <w:left w:val="single" w:color="CCCCCC" w:sz="1"/>
+              <w:bottom w:val="single" w:color="CCCCCC" w:sz="1"/>
+              <w:right w:val="single" w:color="CCCCCC" w:sz="1"/>
+            </w:tcBorders>
+            <w:tcMar>
+              <w:top w:type="dxa" w:w="60"/>
+              <w:left w:type="dxa" w:w="100"/>
+              <w:bottom w:type="dxa" w:w="60"/>
+              <w:right w:type="dxa" w:w="100"/>
+            </w:tcMar>
+          </w:tcPr>
+          <w:p>
+            <w:r>
+              <w:rPr>
+                <w:rFonts w:ascii="Arial" w:cs="Arial" w:eastAsia="Arial" w:hAnsi="Arial"/>
+                <w:sz w:val="20"/>
+                <w:szCs w:val="20"/>
+              </w:rPr>
+              <w:t xml:space="preserve">Medium</w:t>
+            </w:r>
+          </w:p>
+        </w:tc>
+        <w:tc>
+          <w:tcPr>
+            <w:tcW w:type="dxa" w:w="1800"/>
+            <w:tcBorders>
+              <w:top w:val="single" w:color="CCCCCC" w:sz="1"/>
+              <w:left w:val="single" w:color="CCCCCC" w:sz="1"/>
+              <w:bottom w:val="single" w:color="CCCCCC" w:sz="1"/>
+              <w:right w:val="single" w:color="CCCCCC" w:sz="1"/>
+            </w:tcBorders>
+            <w:tcMar>
+              <w:top w:type="dxa" w:w="60"/>
+              <w:left w:type="dxa" w:w="100"/>
+              <w:bottom w:type="dxa" w:w="60"/>
+              <w:right w:type="dxa" w:w="100"/>
+            </w:tcMar>
+          </w:tcPr>
+          <w:p>
+            <w:r>
+              <w:rPr>
+                <w:rFonts w:ascii="Arial" w:cs="Arial" w:eastAsia="Arial" w:hAnsi="Arial"/>
+                <w:b/>
+                <w:bCs/>
+                <w:color w:val="1b6b5a"/>
+                <w:sz w:val="20"/>
+                <w:szCs w:val="20"/>
+              </w:rPr>
+              <w:t xml:space="preserve">✅ DONE</w:t>
             </w:r>
           </w:p>
         </w:tc>
@@ -6725,176 +7588,6 @@
           </w:p>
         </w:tc>
       </w:tr>
-      <w:tr>
-        <w:tc>
-          <w:tcPr>
-            <w:tcW w:type="dxa" w:w="2200"/>
-            <w:tcBorders>
-              <w:top w:val="single" w:color="CCCCCC" w:sz="1"/>
-              <w:left w:val="single" w:color="CCCCCC" w:sz="1"/>
-              <w:bottom w:val="single" w:color="CCCCCC" w:sz="1"/>
-              <w:right w:val="single" w:color="CCCCCC" w:sz="1"/>
-            </w:tcBorders>
-            <w:tcMar>
-              <w:top w:type="dxa" w:w="60"/>
-              <w:left w:type="dxa" w:w="100"/>
-              <w:bottom w:type="dxa" w:w="60"/>
-              <w:right w:type="dxa" w:w="100"/>
-            </w:tcMar>
-          </w:tcPr>
-          <w:p>
-            <w:r>
-              <w:rPr>
-                <w:rFonts w:ascii="Arial" w:cs="Arial" w:eastAsia="Arial" w:hAnsi="Arial"/>
-                <w:b/>
-                <w:bCs/>
-                <w:sz w:val="20"/>
-                <w:szCs w:val="20"/>
-              </w:rPr>
-              <w:t xml:space="preserve">Shared Care Recipients</w:t>
-            </w:r>
-          </w:p>
-        </w:tc>
-        <w:tc>
-          <w:tcPr>
-            <w:tcW w:type="dxa" w:w="5760"/>
-            <w:tcBorders>
-              <w:top w:val="single" w:color="CCCCCC" w:sz="1"/>
-              <w:left w:val="single" w:color="CCCCCC" w:sz="1"/>
-              <w:bottom w:val="single" w:color="CCCCCC" w:sz="1"/>
-              <w:right w:val="single" w:color="CCCCCC" w:sz="1"/>
-            </w:tcBorders>
-            <w:tcMar>
-              <w:top w:type="dxa" w:w="60"/>
-              <w:left w:type="dxa" w:w="100"/>
-              <w:bottom w:type="dxa" w:w="60"/>
-              <w:right w:type="dxa" w:w="100"/>
-            </w:tcMar>
-          </w:tcPr>
-          <w:p>
-            <w:r>
-              <w:rPr>
-                <w:rFonts w:ascii="Arial" w:cs="Arial" w:eastAsia="Arial" w:hAnsi="Arial"/>
-                <w:sz w:val="20"/>
-                <w:szCs w:val="20"/>
-              </w:rPr>
-              <w:t xml:space="preserve">Siblings share one care_recipient record for Betty instead of each having their own. Access model with permissions.</w:t>
-            </w:r>
-          </w:p>
-        </w:tc>
-        <w:tc>
-          <w:tcPr>
-            <w:tcW w:type="dxa" w:w="1400"/>
-            <w:tcBorders>
-              <w:top w:val="single" w:color="CCCCCC" w:sz="1"/>
-              <w:left w:val="single" w:color="CCCCCC" w:sz="1"/>
-              <w:bottom w:val="single" w:color="CCCCCC" w:sz="1"/>
-              <w:right w:val="single" w:color="CCCCCC" w:sz="1"/>
-            </w:tcBorders>
-            <w:tcMar>
-              <w:top w:type="dxa" w:w="60"/>
-              <w:left w:type="dxa" w:w="100"/>
-              <w:bottom w:type="dxa" w:w="60"/>
-              <w:right w:type="dxa" w:w="100"/>
-            </w:tcMar>
-          </w:tcPr>
-          <w:p>
-            <w:r>
-              <w:rPr>
-                <w:rFonts w:ascii="Arial" w:cs="Arial" w:eastAsia="Arial" w:hAnsi="Arial"/>
-                <w:sz w:val="20"/>
-                <w:szCs w:val="20"/>
-              </w:rPr>
-              <w:t xml:space="preserve">Medium</w:t>
-            </w:r>
-          </w:p>
-        </w:tc>
-      </w:tr>
-      <w:tr>
-        <w:tc>
-          <w:tcPr>
-            <w:tcW w:type="dxa" w:w="2200"/>
-            <w:tcBorders>
-              <w:top w:val="single" w:color="CCCCCC" w:sz="1"/>
-              <w:left w:val="single" w:color="CCCCCC" w:sz="1"/>
-              <w:bottom w:val="single" w:color="CCCCCC" w:sz="1"/>
-              <w:right w:val="single" w:color="CCCCCC" w:sz="1"/>
-            </w:tcBorders>
-            <w:tcMar>
-              <w:top w:type="dxa" w:w="60"/>
-              <w:left w:type="dxa" w:w="100"/>
-              <w:bottom w:type="dxa" w:w="60"/>
-              <w:right w:type="dxa" w:w="100"/>
-            </w:tcMar>
-          </w:tcPr>
-          <w:p>
-            <w:r>
-              <w:rPr>
-                <w:rFonts w:ascii="Arial" w:cs="Arial" w:eastAsia="Arial" w:hAnsi="Arial"/>
-                <w:b/>
-                <w:bCs/>
-                <w:sz w:val="20"/>
-                <w:szCs w:val="20"/>
-              </w:rPr>
-              <w:t xml:space="preserve">Push Notifications</w:t>
-            </w:r>
-          </w:p>
-        </w:tc>
-        <w:tc>
-          <w:tcPr>
-            <w:tcW w:type="dxa" w:w="5760"/>
-            <w:tcBorders>
-              <w:top w:val="single" w:color="CCCCCC" w:sz="1"/>
-              <w:left w:val="single" w:color="CCCCCC" w:sz="1"/>
-              <w:bottom w:val="single" w:color="CCCCCC" w:sz="1"/>
-              <w:right w:val="single" w:color="CCCCCC" w:sz="1"/>
-            </w:tcBorders>
-            <w:tcMar>
-              <w:top w:type="dxa" w:w="60"/>
-              <w:left w:type="dxa" w:w="100"/>
-              <w:bottom w:type="dxa" w:w="60"/>
-              <w:right w:type="dxa" w:w="100"/>
-            </w:tcMar>
-          </w:tcPr>
-          <w:p>
-            <w:r>
-              <w:rPr>
-                <w:rFonts w:ascii="Arial" w:cs="Arial" w:eastAsia="Arial" w:hAnsi="Arial"/>
-                <w:sz w:val="20"/>
-                <w:szCs w:val="20"/>
-              </w:rPr>
-              <w:t xml:space="preserve">Web push via service worker for session reminders, new messages, and caregiver updates.</w:t>
-            </w:r>
-          </w:p>
-        </w:tc>
-        <w:tc>
-          <w:tcPr>
-            <w:tcW w:type="dxa" w:w="1400"/>
-            <w:tcBorders>
-              <w:top w:val="single" w:color="CCCCCC" w:sz="1"/>
-              <w:left w:val="single" w:color="CCCCCC" w:sz="1"/>
-              <w:bottom w:val="single" w:color="CCCCCC" w:sz="1"/>
-              <w:right w:val="single" w:color="CCCCCC" w:sz="1"/>
-            </w:tcBorders>
-            <w:tcMar>
-              <w:top w:type="dxa" w:w="60"/>
-              <w:left w:type="dxa" w:w="100"/>
-              <w:bottom w:type="dxa" w:w="60"/>
-              <w:right w:type="dxa" w:w="100"/>
-            </w:tcMar>
-          </w:tcPr>
-          <w:p>
-            <w:r>
-              <w:rPr>
-                <w:rFonts w:ascii="Arial" w:cs="Arial" w:eastAsia="Arial" w:hAnsi="Arial"/>
-                <w:sz w:val="20"/>
-                <w:szCs w:val="20"/>
-              </w:rPr>
-              <w:t xml:space="preserve">Small</w:t>
-            </w:r>
-          </w:p>
-        </w:tc>
-      </w:tr>
     </w:tbl>
     <w:p>
       <w:pPr>
@@ -7199,91 +7892,6 @@
                 <w:szCs w:val="20"/>
               </w:rPr>
               <w:t xml:space="preserve">Large</w:t>
-            </w:r>
-          </w:p>
-        </w:tc>
-      </w:tr>
-      <w:tr>
-        <w:tc>
-          <w:tcPr>
-            <w:tcW w:type="dxa" w:w="2200"/>
-            <w:tcBorders>
-              <w:top w:val="single" w:color="CCCCCC" w:sz="1"/>
-              <w:left w:val="single" w:color="CCCCCC" w:sz="1"/>
-              <w:bottom w:val="single" w:color="CCCCCC" w:sz="1"/>
-              <w:right w:val="single" w:color="CCCCCC" w:sz="1"/>
-            </w:tcBorders>
-            <w:tcMar>
-              <w:top w:type="dxa" w:w="60"/>
-              <w:left w:type="dxa" w:w="100"/>
-              <w:bottom w:type="dxa" w:w="60"/>
-              <w:right w:type="dxa" w:w="100"/>
-            </w:tcMar>
-          </w:tcPr>
-          <w:p>
-            <w:r>
-              <w:rPr>
-                <w:rFonts w:ascii="Arial" w:cs="Arial" w:eastAsia="Arial" w:hAnsi="Arial"/>
-                <w:b/>
-                <w:bCs/>
-                <w:sz w:val="20"/>
-                <w:szCs w:val="20"/>
-              </w:rPr>
-              <w:t xml:space="preserve">Family Dashboard Analytics</w:t>
-            </w:r>
-          </w:p>
-        </w:tc>
-        <w:tc>
-          <w:tcPr>
-            <w:tcW w:type="dxa" w:w="5760"/>
-            <w:tcBorders>
-              <w:top w:val="single" w:color="CCCCCC" w:sz="1"/>
-              <w:left w:val="single" w:color="CCCCCC" w:sz="1"/>
-              <w:bottom w:val="single" w:color="CCCCCC" w:sz="1"/>
-              <w:right w:val="single" w:color="CCCCCC" w:sz="1"/>
-            </w:tcBorders>
-            <w:tcMar>
-              <w:top w:type="dxa" w:w="60"/>
-              <w:left w:type="dxa" w:w="100"/>
-              <w:bottom w:type="dxa" w:w="60"/>
-              <w:right w:type="dxa" w:w="100"/>
-            </w:tcMar>
-          </w:tcPr>
-          <w:p>
-            <w:r>
-              <w:rPr>
-                <w:rFonts w:ascii="Arial" w:cs="Arial" w:eastAsia="Arial" w:hAnsi="Arial"/>
-                <w:sz w:val="20"/>
-                <w:szCs w:val="20"/>
-              </w:rPr>
-              <w:t xml:space="preserve">Charts showing care hours over time, spending trends, caregiver utilization.</w:t>
-            </w:r>
-          </w:p>
-        </w:tc>
-        <w:tc>
-          <w:tcPr>
-            <w:tcW w:type="dxa" w:w="1400"/>
-            <w:tcBorders>
-              <w:top w:val="single" w:color="CCCCCC" w:sz="1"/>
-              <w:left w:val="single" w:color="CCCCCC" w:sz="1"/>
-              <w:bottom w:val="single" w:color="CCCCCC" w:sz="1"/>
-              <w:right w:val="single" w:color="CCCCCC" w:sz="1"/>
-            </w:tcBorders>
-            <w:tcMar>
-              <w:top w:type="dxa" w:w="60"/>
-              <w:left w:type="dxa" w:w="100"/>
-              <w:bottom w:type="dxa" w:w="60"/>
-              <w:right w:type="dxa" w:w="100"/>
-            </w:tcMar>
-          </w:tcPr>
-          <w:p>
-            <w:r>
-              <w:rPr>
-                <w:rFonts w:ascii="Arial" w:cs="Arial" w:eastAsia="Arial" w:hAnsi="Arial"/>
-                <w:sz w:val="20"/>
-                <w:szCs w:val="20"/>
-              </w:rPr>
-              <w:t xml:space="preserve">Small</w:t>
             </w:r>
           </w:p>
         </w:tc>
@@ -7673,7 +8281,7 @@
         <w:sz w:val="18"/>
         <w:szCs w:val="18"/>
       </w:rPr>
-      <w:t xml:space="preserve">Development Roadmap  •  v0.7.1</w:t>
+      <w:t xml:space="preserve">Development Roadmap  •  v0.8.0</w:t>
     </w:r>
   </w:p>
 </w:hdr>

</xml_diff>

<commit_message>
docs: update roadmap, tasks, and instructions for v0.9.0
Add v0.9.0 entries for real-time WebSocket updates and visit photo
uploads. Update CLAUDE.md with Socket.io architecture, multer uploads,
and new photos route. Regenerate roadmap.docx.

Co-Authored-By: Claude Opus 4.6 <noreply@anthropic.com>
</commit_message>
<xml_diff>
--- a/InPlace_App_Roadmap.docx
+++ b/InPlace_App_Roadmap.docx
@@ -72,7 +72,7 @@
           <w:sz w:val="20"/>
           <w:szCs w:val="20"/>
         </w:rPr>
-        <w:t xml:space="preserve">Last updated: February 17, 2026  •  Current version: v0.8.0  •  21 releases in 3 days</w:t>
+        <w:t xml:space="preserve">Last updated: February 18, 2026  •  Current version: v0.9.0  •  22 releases in 4 days</w:t>
       </w:r>
     </w:p>
     <w:p>
@@ -226,7 +226,7 @@
                 <w:sz w:val="20"/>
                 <w:szCs w:val="20"/>
               </w:rPr>
-              <w:t xml:space="preserve">21 (v0.1.0 – v0.8.0)</w:t>
+              <w:t xml:space="preserve">22 (v0.1.0 – v0.9.0)</w:t>
             </w:r>
           </w:p>
         </w:tc>
@@ -282,7 +282,7 @@
                 <w:sz w:val="20"/>
                 <w:szCs w:val="20"/>
               </w:rPr>
-              <w:t xml:space="preserve">13 route files, 35+ endpoints</w:t>
+              <w:t xml:space="preserve">14 route files, 38+ endpoints</w:t>
             </w:r>
           </w:p>
         </w:tc>
@@ -338,7 +338,7 @@
                 <w:sz w:val="20"/>
                 <w:szCs w:val="20"/>
               </w:rPr>
-              <w:t xml:space="preserve">21 React components (modular, zero-build-step)</w:t>
+              <w:t xml:space="preserve">22 React components (modular, zero-build-step)</w:t>
             </w:r>
           </w:p>
         </w:tc>
@@ -800,7 +800,7 @@
                 <w:sz w:val="20"/>
                 <w:szCs w:val="20"/>
               </w:rPr>
-              <w:t xml:space="preserve">REST API, JWT auth (7-day tokens), bcryptjs</w:t>
+              <w:t xml:space="preserve">REST API, JWT auth (7-day tokens), bcryptjs, multer uploads</w:t>
             </w:r>
           </w:p>
         </w:tc>
@@ -883,7 +883,7 @@
                 <w:sz w:val="20"/>
                 <w:szCs w:val="20"/>
               </w:rPr>
-              <w:t xml:space="preserve">pg library, connection pooling, 16 tables, UUID PKs</w:t>
+              <w:t xml:space="preserve">pg library, connection pooling, 18 tables, UUID PKs</w:t>
             </w:r>
           </w:p>
         </w:tc>
@@ -1299,6 +1299,89 @@
                 <w:szCs w:val="20"/>
               </w:rPr>
               <w:t xml:space="preserve">Cache-first static, network-first API, install banner</w:t>
+            </w:r>
+          </w:p>
+        </w:tc>
+      </w:tr>
+      <w:tr>
+        <w:tc>
+          <w:tcPr>
+            <w:tcW w:type="dxa" w:w="1800"/>
+            <w:tcBorders>
+              <w:top w:val="single" w:color="CCCCCC" w:sz="1"/>
+              <w:left w:val="single" w:color="CCCCCC" w:sz="1"/>
+              <w:bottom w:val="single" w:color="CCCCCC" w:sz="1"/>
+              <w:right w:val="single" w:color="CCCCCC" w:sz="1"/>
+            </w:tcBorders>
+            <w:tcMar>
+              <w:top w:type="dxa" w:w="60"/>
+              <w:left w:type="dxa" w:w="100"/>
+              <w:bottom w:type="dxa" w:w="60"/>
+              <w:right w:type="dxa" w:w="100"/>
+            </w:tcMar>
+          </w:tcPr>
+          <w:p>
+            <w:r>
+              <w:rPr>
+                <w:rFonts w:ascii="Arial" w:cs="Arial" w:eastAsia="Arial" w:hAnsi="Arial"/>
+                <w:sz w:val="20"/>
+                <w:szCs w:val="20"/>
+              </w:rPr>
+              <w:t xml:space="preserve">Real-Time</w:t>
+            </w:r>
+          </w:p>
+        </w:tc>
+        <w:tc>
+          <w:tcPr>
+            <w:tcW w:type="dxa" w:w="2400"/>
+            <w:tcBorders>
+              <w:top w:val="single" w:color="CCCCCC" w:sz="1"/>
+              <w:left w:val="single" w:color="CCCCCC" w:sz="1"/>
+              <w:bottom w:val="single" w:color="CCCCCC" w:sz="1"/>
+              <w:right w:val="single" w:color="CCCCCC" w:sz="1"/>
+            </w:tcBorders>
+            <w:tcMar>
+              <w:top w:type="dxa" w:w="60"/>
+              <w:left w:type="dxa" w:w="100"/>
+              <w:bottom w:type="dxa" w:w="60"/>
+              <w:right w:type="dxa" w:w="100"/>
+            </w:tcMar>
+          </w:tcPr>
+          <w:p>
+            <w:r>
+              <w:rPr>
+                <w:rFonts w:ascii="Arial" w:cs="Arial" w:eastAsia="Arial" w:hAnsi="Arial"/>
+                <w:sz w:val="20"/>
+                <w:szCs w:val="20"/>
+              </w:rPr>
+              <w:t xml:space="preserve">Socket.io</w:t>
+            </w:r>
+          </w:p>
+        </w:tc>
+        <w:tc>
+          <w:tcPr>
+            <w:tcW w:type="dxa" w:w="5160"/>
+            <w:tcBorders>
+              <w:top w:val="single" w:color="CCCCCC" w:sz="1"/>
+              <w:left w:val="single" w:color="CCCCCC" w:sz="1"/>
+              <w:bottom w:val="single" w:color="CCCCCC" w:sz="1"/>
+              <w:right w:val="single" w:color="CCCCCC" w:sz="1"/>
+            </w:tcBorders>
+            <w:tcMar>
+              <w:top w:type="dxa" w:w="60"/>
+              <w:left w:type="dxa" w:w="100"/>
+              <w:bottom w:type="dxa" w:w="60"/>
+              <w:right w:type="dxa" w:w="100"/>
+            </w:tcMar>
+          </w:tcPr>
+          <w:p>
+            <w:r>
+              <w:rPr>
+                <w:rFonts w:ascii="Arial" w:cs="Arial" w:eastAsia="Arial" w:hAnsi="Arial"/>
+                <w:sz w:val="20"/>
+                <w:szCs w:val="20"/>
+              </w:rPr>
+              <w:t xml:space="preserve">JWT-authenticated WebSocket, connected user tracking, event-driven updates</w:t>
             </w:r>
           </w:p>
         </w:tc>
@@ -1406,7 +1489,7 @@
           <w:sz w:val="23"/>
           <w:szCs w:val="23"/>
         </w:rPr>
-        <w:t xml:space="preserve">Database Schema (16 Tables)</w:t>
+        <w:t xml:space="preserve">Database Schema (18 Tables)</w:t>
       </w:r>
     </w:p>
     <w:tbl>
@@ -2156,7 +2239,7 @@
                 <w:sz w:val="20"/>
                 <w:szCs w:val="20"/>
               </w:rPr>
-              <w:t xml:space="preserve">Photos from visits (planned)</w:t>
+              <w:t xml:space="preserve">Base64-encoded photos from visits</w:t>
             </w:r>
           </w:p>
         </w:tc>
@@ -2183,7 +2266,7 @@
                 <w:sz w:val="20"/>
                 <w:szCs w:val="20"/>
               </w:rPr>
-              <w:t xml:space="preserve">visit_log_id, photo_url</w:t>
+              <w:t xml:space="preserve">visit_log_id, photo_url (base64), caption</w:t>
             </w:r>
           </w:p>
         </w:tc>
@@ -4176,6 +4259,89 @@
                 <w:sz w:val="20"/>
                 <w:szCs w:val="20"/>
               </w:rPr>
+              <w:t xml:space="preserve">Photos (/api/photos)</w:t>
+            </w:r>
+          </w:p>
+        </w:tc>
+        <w:tc>
+          <w:tcPr>
+            <w:tcW w:type="dxa" w:w="4960"/>
+            <w:tcBorders>
+              <w:top w:val="single" w:color="CCCCCC" w:sz="1"/>
+              <w:left w:val="single" w:color="CCCCCC" w:sz="1"/>
+              <w:bottom w:val="single" w:color="CCCCCC" w:sz="1"/>
+              <w:right w:val="single" w:color="CCCCCC" w:sz="1"/>
+            </w:tcBorders>
+            <w:tcMar>
+              <w:top w:type="dxa" w:w="60"/>
+              <w:left w:type="dxa" w:w="100"/>
+              <w:bottom w:type="dxa" w:w="60"/>
+              <w:right w:type="dxa" w:w="100"/>
+            </w:tcMar>
+          </w:tcPr>
+          <w:p>
+            <w:r>
+              <w:rPr>
+                <w:rFonts w:ascii="Arial" w:cs="Arial" w:eastAsia="Arial" w:hAnsi="Arial"/>
+                <w:sz w:val="20"/>
+                <w:szCs w:val="20"/>
+              </w:rPr>
+              <w:t xml:space="preserve">POST /visit/:id (upload), GET /visit/:id, GET /session/:id</w:t>
+            </w:r>
+          </w:p>
+        </w:tc>
+        <w:tc>
+          <w:tcPr>
+            <w:tcW w:type="dxa" w:w="1800"/>
+            <w:tcBorders>
+              <w:top w:val="single" w:color="CCCCCC" w:sz="1"/>
+              <w:left w:val="single" w:color="CCCCCC" w:sz="1"/>
+              <w:bottom w:val="single" w:color="CCCCCC" w:sz="1"/>
+              <w:right w:val="single" w:color="CCCCCC" w:sz="1"/>
+            </w:tcBorders>
+            <w:tcMar>
+              <w:top w:type="dxa" w:w="60"/>
+              <w:left w:type="dxa" w:w="100"/>
+              <w:bottom w:type="dxa" w:w="60"/>
+              <w:right w:type="dxa" w:w="100"/>
+            </w:tcMar>
+          </w:tcPr>
+          <w:p>
+            <w:r>
+              <w:rPr>
+                <w:rFonts w:ascii="Arial" w:cs="Arial" w:eastAsia="Arial" w:hAnsi="Arial"/>
+                <w:sz w:val="20"/>
+                <w:szCs w:val="20"/>
+              </w:rPr>
+              <w:t xml:space="preserve">JWT</w:t>
+            </w:r>
+          </w:p>
+        </w:tc>
+      </w:tr>
+      <w:tr>
+        <w:tc>
+          <w:tcPr>
+            <w:tcW w:type="dxa" w:w="2600"/>
+            <w:tcBorders>
+              <w:top w:val="single" w:color="CCCCCC" w:sz="1"/>
+              <w:left w:val="single" w:color="CCCCCC" w:sz="1"/>
+              <w:bottom w:val="single" w:color="CCCCCC" w:sz="1"/>
+              <w:right w:val="single" w:color="CCCCCC" w:sz="1"/>
+            </w:tcBorders>
+            <w:tcMar>
+              <w:top w:type="dxa" w:w="60"/>
+              <w:left w:type="dxa" w:w="100"/>
+              <w:bottom w:type="dxa" w:w="60"/>
+              <w:right w:type="dxa" w:w="100"/>
+            </w:tcMar>
+          </w:tcPr>
+          <w:p>
+            <w:r>
+              <w:rPr>
+                <w:rFonts w:ascii="Arial" w:cs="Arial" w:eastAsia="Arial" w:hAnsi="Arial"/>
+                <w:sz w:val="20"/>
+                <w:szCs w:val="20"/>
+              </w:rPr>
               <w:t xml:space="preserve">Password Reset</w:t>
             </w:r>
           </w:p>
@@ -4354,7 +4520,7 @@
           <w:sz w:val="21"/>
           <w:szCs w:val="21"/>
         </w:rPr>
-        <w:t xml:space="preserve">The frontend uses Babel standalone for in-browser JSX transpilation with zero build step. All 21 component files are fetched in parallel, concatenated in dependency order, and compiled once on page load. Each component uses the window assignment pattern for scope sharing.</w:t>
+        <w:t xml:space="preserve">The frontend uses Babel standalone for in-browser JSX transpilation with zero build step. All 22 component files are fetched in parallel, concatenated in dependency order, and compiled once on page load. Each component uses the window assignment pattern for scope sharing. Socket.io CDN is loaded separately for real-time WebSocket communication.</w:t>
       </w:r>
     </w:p>
     <w:p>
@@ -5962,6 +6128,51 @@
       </w:r>
     </w:p>
     <w:p>
+      <w:pPr>
+        <w:pStyle w:val="Heading2"/>
+        <w:pBdr>
+          <w:bottom w:val="single" w:color="DDDDDD" w:sz="1" w:space="4"/>
+        </w:pBdr>
+        <w:spacing w:before="280" w:after="100"/>
+      </w:pPr>
+      <w:r>
+        <w:rPr>
+          <w:rFonts w:ascii="Arial" w:cs="Arial" w:eastAsia="Arial" w:hAnsi="Arial"/>
+          <w:b/>
+          <w:bCs/>
+          <w:color w:val="1b6b5a"/>
+          <w:sz w:val="26"/>
+          <w:szCs w:val="26"/>
+        </w:rPr>
+        <w:t xml:space="preserve">v0.9.0 — Real-Time WebSocket Updates &amp; Visit Photos</w:t>
+      </w:r>
+      <w:r>
+        <w:rPr>
+          <w:rFonts w:ascii="Arial" w:cs="Arial" w:eastAsia="Arial" w:hAnsi="Arial"/>
+          <w:color w:val="888888"/>
+          <w:sz w:val="20"/>
+          <w:szCs w:val="20"/>
+        </w:rPr>
+        <w:t xml:space="preserve">  Feb 18</w:t>
+      </w:r>
+    </w:p>
+    <w:p>
+      <w:pPr>
+        <w:spacing w:after="120"/>
+      </w:pPr>
+      <w:r>
+        <w:rPr>
+          <w:rFonts w:ascii="Arial" w:cs="Arial" w:eastAsia="Arial" w:hAnsi="Arial"/>
+          <w:i w:val="false"/>
+          <w:iCs w:val="false"/>
+          <w:color w:val="333333"/>
+          <w:sz w:val="21"/>
+          <w:szCs w:val="21"/>
+        </w:rPr>
+        <w:t xml:space="preserve">Socket.io WebSocket server with JWT-authenticated connections. Real-time events: new_message (live message delivery in Messages), session_update (Dashboard refresh on status changes), activity_update (ActivityFeed and Dashboard refresh on visit completions), visit_photos (Dashboard refresh on photo uploads). Connected users tracked in server-side Map with emitToUser() helper accessible from all routes. Frontend WebSocket manager: connectSocket(), disconnectSocket(), onSocketEvent() with listener persistence across reconnects. Visit photo uploads via Multer (memory storage, 5MB limit, image-only, max 5 per visit). Base64 photo storage in PostgreSQL. New /api/photos route with upload, retrieval by visit log and session. Caregiver photo upload UI in CaretakerHub with preview thumbnails. Family photo viewer in ActivityFeed with lightbox. Fixed silent Railway build failure from v0.8.0 (package-lock.json out of sync).</w:t>
+      </w:r>
+    </w:p>
+    <w:p>
       <w:r>
         <w:br w:type="page"/>
       </w:r>
@@ -6314,6 +6525,54 @@
           <w:szCs w:val="21"/>
         </w:rPr>
         <w:t xml:space="preserve">Shared Care Recipients — owner/edit/view permissions, siblings share Betty’s record (v0.8.0)</w:t>
+      </w:r>
+    </w:p>
+    <w:p>
+      <w:pPr>
+        <w:spacing w:after="60"/>
+        <w:ind w:left="360"/>
+      </w:pPr>
+      <w:r>
+        <w:rPr>
+          <w:rFonts w:ascii="Arial" w:cs="Arial" w:eastAsia="Arial" w:hAnsi="Arial"/>
+          <w:sz w:val="21"/>
+          <w:szCs w:val="21"/>
+        </w:rPr>
+        <w:t xml:space="preserve">✅ </w:t>
+      </w:r>
+      <w:r>
+        <w:rPr>
+          <w:rFonts w:ascii="Arial" w:cs="Arial" w:eastAsia="Arial" w:hAnsi="Arial"/>
+          <w:strike/>
+          <w:color w:val="888888"/>
+          <w:sz w:val="21"/>
+          <w:szCs w:val="21"/>
+        </w:rPr>
+        <w:t xml:space="preserve">Real-Time WebSocket Updates — Socket.io with JWT auth, live messages, session updates, activity feed (v0.9.0)</w:t>
+      </w:r>
+    </w:p>
+    <w:p>
+      <w:pPr>
+        <w:spacing w:after="60"/>
+        <w:ind w:left="360"/>
+      </w:pPr>
+      <w:r>
+        <w:rPr>
+          <w:rFonts w:ascii="Arial" w:cs="Arial" w:eastAsia="Arial" w:hAnsi="Arial"/>
+          <w:sz w:val="21"/>
+          <w:szCs w:val="21"/>
+        </w:rPr>
+        <w:t xml:space="preserve">✅ </w:t>
+      </w:r>
+      <w:r>
+        <w:rPr>
+          <w:rFonts w:ascii="Arial" w:cs="Arial" w:eastAsia="Arial" w:hAnsi="Arial"/>
+          <w:strike/>
+          <w:color w:val="888888"/>
+          <w:sz w:val="21"/>
+          <w:szCs w:val="21"/>
+        </w:rPr>
+        <w:t xml:space="preserve">Visit Photo Uploads — Multer upload, base64 storage, caregiver upload UI, family lightbox viewer (v0.9.0)</w:t>
       </w:r>
     </w:p>
     <w:p>
@@ -7076,6 +7335,236 @@
                 <w:sz w:val="20"/>
                 <w:szCs w:val="20"/>
               </w:rPr>
+              <w:t xml:space="preserve">Real-Time WebSocket Updates</w:t>
+            </w:r>
+          </w:p>
+        </w:tc>
+        <w:tc>
+          <w:tcPr>
+            <w:tcW w:type="dxa" w:w="4360"/>
+            <w:tcBorders>
+              <w:top w:val="single" w:color="CCCCCC" w:sz="1"/>
+              <w:left w:val="single" w:color="CCCCCC" w:sz="1"/>
+              <w:bottom w:val="single" w:color="CCCCCC" w:sz="1"/>
+              <w:right w:val="single" w:color="CCCCCC" w:sz="1"/>
+            </w:tcBorders>
+            <w:tcMar>
+              <w:top w:type="dxa" w:w="60"/>
+              <w:left w:type="dxa" w:w="100"/>
+              <w:bottom w:type="dxa" w:w="60"/>
+              <w:right w:type="dxa" w:w="100"/>
+            </w:tcMar>
+          </w:tcPr>
+          <w:p>
+            <w:r>
+              <w:rPr>
+                <w:rFonts w:ascii="Arial" w:cs="Arial" w:eastAsia="Arial" w:hAnsi="Arial"/>
+                <w:sz w:val="20"/>
+                <w:szCs w:val="20"/>
+              </w:rPr>
+              <w:t xml:space="preserve">Socket.io with JWT auth. Live message delivery, session status changes, activity feed updates, photo upload notifications.</w:t>
+            </w:r>
+          </w:p>
+        </w:tc>
+        <w:tc>
+          <w:tcPr>
+            <w:tcW w:type="dxa" w:w="1000"/>
+            <w:tcBorders>
+              <w:top w:val="single" w:color="CCCCCC" w:sz="1"/>
+              <w:left w:val="single" w:color="CCCCCC" w:sz="1"/>
+              <w:bottom w:val="single" w:color="CCCCCC" w:sz="1"/>
+              <w:right w:val="single" w:color="CCCCCC" w:sz="1"/>
+            </w:tcBorders>
+            <w:tcMar>
+              <w:top w:type="dxa" w:w="60"/>
+              <w:left w:type="dxa" w:w="100"/>
+              <w:bottom w:type="dxa" w:w="60"/>
+              <w:right w:type="dxa" w:w="100"/>
+            </w:tcMar>
+          </w:tcPr>
+          <w:p>
+            <w:r>
+              <w:rPr>
+                <w:rFonts w:ascii="Arial" w:cs="Arial" w:eastAsia="Arial" w:hAnsi="Arial"/>
+                <w:sz w:val="20"/>
+                <w:szCs w:val="20"/>
+              </w:rPr>
+              <w:t xml:space="preserve">Medium</w:t>
+            </w:r>
+          </w:p>
+        </w:tc>
+        <w:tc>
+          <w:tcPr>
+            <w:tcW w:type="dxa" w:w="1800"/>
+            <w:tcBorders>
+              <w:top w:val="single" w:color="CCCCCC" w:sz="1"/>
+              <w:left w:val="single" w:color="CCCCCC" w:sz="1"/>
+              <w:bottom w:val="single" w:color="CCCCCC" w:sz="1"/>
+              <w:right w:val="single" w:color="CCCCCC" w:sz="1"/>
+            </w:tcBorders>
+            <w:tcMar>
+              <w:top w:type="dxa" w:w="60"/>
+              <w:left w:type="dxa" w:w="100"/>
+              <w:bottom w:type="dxa" w:w="60"/>
+              <w:right w:type="dxa" w:w="100"/>
+            </w:tcMar>
+          </w:tcPr>
+          <w:p>
+            <w:r>
+              <w:rPr>
+                <w:rFonts w:ascii="Arial" w:cs="Arial" w:eastAsia="Arial" w:hAnsi="Arial"/>
+                <w:b/>
+                <w:bCs/>
+                <w:color w:val="1b6b5a"/>
+                <w:sz w:val="20"/>
+                <w:szCs w:val="20"/>
+              </w:rPr>
+              <w:t xml:space="preserve">✅ DONE</w:t>
+            </w:r>
+          </w:p>
+        </w:tc>
+      </w:tr>
+      <w:tr>
+        <w:tc>
+          <w:tcPr>
+            <w:tcW w:type="dxa" w:w="2200"/>
+            <w:tcBorders>
+              <w:top w:val="single" w:color="CCCCCC" w:sz="1"/>
+              <w:left w:val="single" w:color="CCCCCC" w:sz="1"/>
+              <w:bottom w:val="single" w:color="CCCCCC" w:sz="1"/>
+              <w:right w:val="single" w:color="CCCCCC" w:sz="1"/>
+            </w:tcBorders>
+            <w:tcMar>
+              <w:top w:type="dxa" w:w="60"/>
+              <w:left w:type="dxa" w:w="100"/>
+              <w:bottom w:type="dxa" w:w="60"/>
+              <w:right w:type="dxa" w:w="100"/>
+            </w:tcMar>
+          </w:tcPr>
+          <w:p>
+            <w:r>
+              <w:rPr>
+                <w:rFonts w:ascii="Arial" w:cs="Arial" w:eastAsia="Arial" w:hAnsi="Arial"/>
+                <w:b/>
+                <w:bCs/>
+                <w:sz w:val="20"/>
+                <w:szCs w:val="20"/>
+              </w:rPr>
+              <w:t xml:space="preserve">Visit Photo Uploads</w:t>
+            </w:r>
+          </w:p>
+        </w:tc>
+        <w:tc>
+          <w:tcPr>
+            <w:tcW w:type="dxa" w:w="4360"/>
+            <w:tcBorders>
+              <w:top w:val="single" w:color="CCCCCC" w:sz="1"/>
+              <w:left w:val="single" w:color="CCCCCC" w:sz="1"/>
+              <w:bottom w:val="single" w:color="CCCCCC" w:sz="1"/>
+              <w:right w:val="single" w:color="CCCCCC" w:sz="1"/>
+            </w:tcBorders>
+            <w:tcMar>
+              <w:top w:type="dxa" w:w="60"/>
+              <w:left w:type="dxa" w:w="100"/>
+              <w:bottom w:type="dxa" w:w="60"/>
+              <w:right w:type="dxa" w:w="100"/>
+            </w:tcMar>
+          </w:tcPr>
+          <w:p>
+            <w:r>
+              <w:rPr>
+                <w:rFonts w:ascii="Arial" w:cs="Arial" w:eastAsia="Arial" w:hAnsi="Arial"/>
+                <w:sz w:val="20"/>
+                <w:szCs w:val="20"/>
+              </w:rPr>
+              <w:t xml:space="preserve">Multer upload (5MB, image-only, max 5). Base64 in PostgreSQL. Caregiver upload UI, family lightbox viewer.</w:t>
+            </w:r>
+          </w:p>
+        </w:tc>
+        <w:tc>
+          <w:tcPr>
+            <w:tcW w:type="dxa" w:w="1000"/>
+            <w:tcBorders>
+              <w:top w:val="single" w:color="CCCCCC" w:sz="1"/>
+              <w:left w:val="single" w:color="CCCCCC" w:sz="1"/>
+              <w:bottom w:val="single" w:color="CCCCCC" w:sz="1"/>
+              <w:right w:val="single" w:color="CCCCCC" w:sz="1"/>
+            </w:tcBorders>
+            <w:tcMar>
+              <w:top w:type="dxa" w:w="60"/>
+              <w:left w:type="dxa" w:w="100"/>
+              <w:bottom w:type="dxa" w:w="60"/>
+              <w:right w:type="dxa" w:w="100"/>
+            </w:tcMar>
+          </w:tcPr>
+          <w:p>
+            <w:r>
+              <w:rPr>
+                <w:rFonts w:ascii="Arial" w:cs="Arial" w:eastAsia="Arial" w:hAnsi="Arial"/>
+                <w:sz w:val="20"/>
+                <w:szCs w:val="20"/>
+              </w:rPr>
+              <w:t xml:space="preserve">Medium</w:t>
+            </w:r>
+          </w:p>
+        </w:tc>
+        <w:tc>
+          <w:tcPr>
+            <w:tcW w:type="dxa" w:w="1800"/>
+            <w:tcBorders>
+              <w:top w:val="single" w:color="CCCCCC" w:sz="1"/>
+              <w:left w:val="single" w:color="CCCCCC" w:sz="1"/>
+              <w:bottom w:val="single" w:color="CCCCCC" w:sz="1"/>
+              <w:right w:val="single" w:color="CCCCCC" w:sz="1"/>
+            </w:tcBorders>
+            <w:tcMar>
+              <w:top w:type="dxa" w:w="60"/>
+              <w:left w:type="dxa" w:w="100"/>
+              <w:bottom w:type="dxa" w:w="60"/>
+              <w:right w:type="dxa" w:w="100"/>
+            </w:tcMar>
+          </w:tcPr>
+          <w:p>
+            <w:r>
+              <w:rPr>
+                <w:rFonts w:ascii="Arial" w:cs="Arial" w:eastAsia="Arial" w:hAnsi="Arial"/>
+                <w:b/>
+                <w:bCs/>
+                <w:color w:val="1b6b5a"/>
+                <w:sz w:val="20"/>
+                <w:szCs w:val="20"/>
+              </w:rPr>
+              <w:t xml:space="preserve">✅ DONE</w:t>
+            </w:r>
+          </w:p>
+        </w:tc>
+      </w:tr>
+      <w:tr>
+        <w:tc>
+          <w:tcPr>
+            <w:tcW w:type="dxa" w:w="2200"/>
+            <w:tcBorders>
+              <w:top w:val="single" w:color="CCCCCC" w:sz="1"/>
+              <w:left w:val="single" w:color="CCCCCC" w:sz="1"/>
+              <w:bottom w:val="single" w:color="CCCCCC" w:sz="1"/>
+              <w:right w:val="single" w:color="CCCCCC" w:sz="1"/>
+            </w:tcBorders>
+            <w:tcMar>
+              <w:top w:type="dxa" w:w="60"/>
+              <w:left w:type="dxa" w:w="100"/>
+              <w:bottom w:type="dxa" w:w="60"/>
+              <w:right w:type="dxa" w:w="100"/>
+            </w:tcMar>
+          </w:tcPr>
+          <w:p>
+            <w:r>
+              <w:rPr>
+                <w:rFonts w:ascii="Arial" w:cs="Arial" w:eastAsia="Arial" w:hAnsi="Arial"/>
+                <w:b/>
+                <w:bCs/>
+                <w:sz w:val="20"/>
+                <w:szCs w:val="20"/>
+              </w:rPr>
               <w:t xml:space="preserve">Stripe Connect</w:t>
             </w:r>
           </w:p>
@@ -7444,7 +7933,7 @@
                 <w:sz w:val="20"/>
                 <w:szCs w:val="20"/>
               </w:rPr>
-              <w:t xml:space="preserve">Visit Photos</w:t>
+              <w:t xml:space="preserve">Caregiver Onboarding Flow</w:t>
             </w:r>
           </w:p>
         </w:tc>
@@ -7471,7 +7960,7 @@
                 <w:sz w:val="20"/>
                 <w:szCs w:val="20"/>
               </w:rPr>
-              <w:t xml:space="preserve">File upload endpoint (multipart → S3/local storage). Display photos in visit logs for documentation.</w:t>
+              <w:t xml:space="preserve">Guided onboarding for new caregivers: profile setup, availability, certifications, background check consent.</w:t>
             </w:r>
           </w:p>
         </w:tc>
@@ -7529,7 +8018,7 @@
                 <w:sz w:val="20"/>
                 <w:szCs w:val="20"/>
               </w:rPr>
-              <w:t xml:space="preserve">Real-Time Updates</w:t>
+              <w:t xml:space="preserve">S3/R2 Photo Storage</w:t>
             </w:r>
           </w:p>
         </w:tc>
@@ -7556,7 +8045,7 @@
                 <w:sz w:val="20"/>
                 <w:szCs w:val="20"/>
               </w:rPr>
-              <w:t xml:space="preserve">WebSocket or SSE for live activity feed, messages, and session status changes. Replace polling.</w:t>
+              <w:t xml:space="preserve">Migrate visit photos from base64 PostgreSQL to Cloudflare R2 or S3 for production scalability.</w:t>
             </w:r>
           </w:p>
         </w:tc>
@@ -7583,7 +8072,7 @@
                 <w:sz w:val="20"/>
                 <w:szCs w:val="20"/>
               </w:rPr>
-              <w:t xml:space="preserve">Medium</w:t>
+              <w:t xml:space="preserve">Small</w:t>
             </w:r>
           </w:p>
         </w:tc>
@@ -8281,7 +8770,7 @@
         <w:sz w:val="18"/>
         <w:szCs w:val="18"/>
       </w:rPr>
-      <w:t xml:space="preserve">Development Roadmap  •  v0.8.0</w:t>
+      <w:t xml:space="preserve">Development Roadmap  •  v0.9.0</w:t>
     </w:r>
   </w:p>
 </w:hdr>

</xml_diff>